<commit_message>
TS 2.3 Kramam Sasnskrit corretions
</commit_message>
<xml_diff>
--- a/TS-Kramam/TS-2.3/TS 2.3 Sanskrit Krama Paatam Corrections.docx
+++ b/TS-Kramam/TS-2.3/TS 2.3 Sanskrit Krama Paatam Corrections.docx
@@ -1,7 +1,1997 @@
 
 <file path=word/document.xml><?xml version="1.0" encoding="utf-8"?>
-<w:document xmlns:wpc="http://schemas.microsoft.com/office/word/2010/wordprocessingCanvas" xmlns:cx="http://schemas.microsoft.com/office/drawing/2014/chartex" xmlns:cx1="http://schemas.microsoft.com/office/drawing/2015/9/8/chartex" xmlns:mc="http://schemas.openxmlformats.org/markup-compatibility/2006" xmlns:o="urn:schemas-microsoft-com:office:office" xmlns:r="http://schemas.openxmlformats.org/officeDocument/2006/relationships" xmlns:m="http://schemas.openxmlformats.org/officeDocument/2006/math" xmlns:v="urn:schemas-microsoft-com:vml" xmlns:wp14="http://schemas.microsoft.com/office/word/2010/wordprocessingDrawing" xmlns:wp="http://schemas.openxmlformats.org/drawingml/2006/wordprocessingDrawing" xmlns:w10="urn:schemas-microsoft-com:office:word" xmlns:w="http://schemas.openxmlformats.org/wordprocessingml/2006/main" xmlns:w14="http://schemas.microsoft.com/office/word/2010/wordml" xmlns:w15="http://schemas.microsoft.com/office/word/2012/wordml" xmlns:w16se="http://schemas.microsoft.com/office/word/2015/wordml/symex" xmlns:wpg="http://schemas.microsoft.com/office/word/2010/wordprocessingGroup" xmlns:wpi="http://schemas.microsoft.com/office/word/2010/wordprocessingInk" xmlns:wne="http://schemas.microsoft.com/office/word/2006/wordml" xmlns:wps="http://schemas.microsoft.com/office/word/2010/wordprocessingShape" mc:Ignorable="w14 w15 w16se wp14">
+<w:document xmlns:wpc="http://schemas.microsoft.com/office/word/2010/wordprocessingCanvas" xmlns:cx="http://schemas.microsoft.com/office/drawing/2014/chartex" xmlns:cx1="http://schemas.microsoft.com/office/drawing/2015/9/8/chartex" xmlns:cx2="http://schemas.microsoft.com/office/drawing/2015/10/21/chartex" xmlns:cx3="http://schemas.microsoft.com/office/drawing/2016/5/9/chartex" xmlns:cx4="http://schemas.microsoft.com/office/drawing/2016/5/10/chartex" xmlns:cx5="http://schemas.microsoft.com/office/drawing/2016/5/11/chartex" xmlns:cx6="http://schemas.microsoft.com/office/drawing/2016/5/12/chartex" xmlns:cx7="http://schemas.microsoft.com/office/drawing/2016/5/13/chartex" xmlns:cx8="http://schemas.microsoft.com/office/drawing/2016/5/14/chartex" xmlns:mc="http://schemas.openxmlformats.org/markup-compatibility/2006" xmlns:aink="http://schemas.microsoft.com/office/drawing/2016/ink" xmlns:am3d="http://schemas.microsoft.com/office/drawing/2017/model3d" xmlns:o="urn:schemas-microsoft-com:office:office" xmlns:oel="http://schemas.microsoft.com/office/2019/extlst" xmlns:r="http://schemas.openxmlformats.org/officeDocument/2006/relationships" xmlns:m="http://schemas.openxmlformats.org/officeDocument/2006/math" xmlns:v="urn:schemas-microsoft-com:vml" xmlns:wp14="http://schemas.microsoft.com/office/word/2010/wordprocessingDrawing" xmlns:wp="http://schemas.openxmlformats.org/drawingml/2006/wordprocessingDrawing" xmlns:w10="urn:schemas-microsoft-com:office:word" xmlns:w="http://schemas.openxmlformats.org/wordprocessingml/2006/main" xmlns:w14="http://schemas.microsoft.com/office/word/2010/wordml" xmlns:w15="http://schemas.microsoft.com/office/word/2012/wordml" xmlns:w16cex="http://schemas.microsoft.com/office/word/2018/wordml/cex" xmlns:w16cid="http://schemas.microsoft.com/office/word/2016/wordml/cid" xmlns:w16="http://schemas.microsoft.com/office/word/2018/wordml" xmlns:w16du="http://schemas.microsoft.com/office/word/2023/wordml/word16du" xmlns:w16sdtdh="http://schemas.microsoft.com/office/word/2020/wordml/sdtdatahash" xmlns:w16sdtfl="http://schemas.microsoft.com/office/word/2024/wordml/sdtformatlock" xmlns:w16se="http://schemas.microsoft.com/office/word/2015/wordml/symex" xmlns:wpg="http://schemas.microsoft.com/office/word/2010/wordprocessingGroup" xmlns:wpi="http://schemas.microsoft.com/office/word/2010/wordprocessingInk" xmlns:wne="http://schemas.microsoft.com/office/word/2006/wordml" xmlns:wps="http://schemas.microsoft.com/office/word/2010/wordprocessingShape" mc:Ignorable="w14 w15 w16se w16cid w16 w16cex w16sdtdh w16sdtfl w16du wp14">
   <w:body>
+    <w:p>
+      <w:pPr>
+        <w:jc w:val="center"/>
+        <w:rPr>
+          <w:b/>
+          <w:bCs/>
+          <w:color w:val="EE0000"/>
+          <w:sz w:val="32"/>
+          <w:szCs w:val="32"/>
+          <w:u w:val="single"/>
+        </w:rPr>
+      </w:pPr>
+      <w:r>
+        <w:rPr>
+          <w:b/>
+          <w:bCs/>
+          <w:sz w:val="32"/>
+          <w:szCs w:val="32"/>
+          <w:u w:val="single"/>
+        </w:rPr>
+        <w:t xml:space="preserve">TS </w:t>
+      </w:r>
+      <w:r>
+        <w:rPr>
+          <w:b/>
+          <w:bCs/>
+          <w:sz w:val="32"/>
+          <w:szCs w:val="32"/>
+          <w:u w:val="single"/>
+        </w:rPr>
+        <w:t>Krama</w:t>
+      </w:r>
+      <w:r>
+        <w:rPr>
+          <w:b/>
+          <w:bCs/>
+          <w:sz w:val="32"/>
+          <w:szCs w:val="32"/>
+          <w:u w:val="single"/>
+        </w:rPr>
+        <w:t xml:space="preserve"> Paatam – TS </w:t>
+      </w:r>
+      <w:r>
+        <w:rPr>
+          <w:b/>
+          <w:bCs/>
+          <w:sz w:val="32"/>
+          <w:szCs w:val="32"/>
+          <w:u w:val="single"/>
+        </w:rPr>
+        <w:t>2.3</w:t>
+      </w:r>
+      <w:r>
+        <w:rPr>
+          <w:b/>
+          <w:bCs/>
+          <w:sz w:val="32"/>
+          <w:szCs w:val="32"/>
+          <w:u w:val="single"/>
+        </w:rPr>
+        <w:t xml:space="preserve"> </w:t>
+      </w:r>
+      <w:r>
+        <w:rPr>
+          <w:b/>
+          <w:bCs/>
+          <w:sz w:val="32"/>
+          <w:szCs w:val="32"/>
+          <w:u w:val="single"/>
+        </w:rPr>
+        <w:t>Sanskrit</w:t>
+      </w:r>
+      <w:r>
+        <w:rPr>
+          <w:b/>
+          <w:bCs/>
+          <w:sz w:val="32"/>
+          <w:szCs w:val="32"/>
+          <w:u w:val="single"/>
+        </w:rPr>
+        <w:t xml:space="preserve"> </w:t>
+      </w:r>
+      <w:r>
+        <w:rPr>
+          <w:b/>
+          <w:bCs/>
+          <w:sz w:val="32"/>
+          <w:szCs w:val="32"/>
+          <w:u w:val="single"/>
+        </w:rPr>
+        <w:t xml:space="preserve">Corrections –Observed till </w:t>
+      </w:r>
+      <w:proofErr w:type="spellStart"/>
+      <w:r>
+        <w:rPr>
+          <w:b/>
+          <w:bCs/>
+          <w:color w:val="EE0000"/>
+          <w:sz w:val="32"/>
+          <w:szCs w:val="32"/>
+          <w:highlight w:val="yellow"/>
+          <w:u w:val="single"/>
+        </w:rPr>
+        <w:t>xxxxxxxxx</w:t>
+      </w:r>
+      <w:proofErr w:type="spellEnd"/>
+    </w:p>
+    <w:p>
+      <w:pPr>
+        <w:jc w:val="center"/>
+        <w:rPr>
+          <w:b/>
+          <w:bCs/>
+        </w:rPr>
+      </w:pPr>
+      <w:r>
+        <w:rPr>
+          <w:b/>
+          <w:bCs/>
+        </w:rPr>
+        <w:t>(ignore those which are already incorporated in your book’s version and date)</w:t>
+      </w:r>
+    </w:p>
+    <w:tbl>
+      <w:tblPr>
+        <w:tblW w:w="13835" w:type="dxa"/>
+        <w:tblInd w:w="-792" w:type="dxa"/>
+        <w:tblBorders>
+          <w:top w:val="single" w:sz="4" w:space="0" w:color="000000"/>
+          <w:left w:val="single" w:sz="4" w:space="0" w:color="000000"/>
+          <w:bottom w:val="single" w:sz="4" w:space="0" w:color="000000"/>
+          <w:right w:val="single" w:sz="4" w:space="0" w:color="000000"/>
+          <w:insideH w:val="single" w:sz="4" w:space="0" w:color="000000"/>
+          <w:insideV w:val="single" w:sz="4" w:space="0" w:color="000000"/>
+        </w:tblBorders>
+        <w:tblLook w:val="04A0" w:firstRow="1" w:lastRow="0" w:firstColumn="1" w:lastColumn="0" w:noHBand="0" w:noVBand="1"/>
+      </w:tblPr>
+      <w:tblGrid>
+        <w:gridCol w:w="3877"/>
+        <w:gridCol w:w="4738"/>
+        <w:gridCol w:w="5220"/>
+      </w:tblGrid>
+      <w:tr>
+        <w:tc>
+          <w:tcPr>
+            <w:tcW w:w="3877" w:type="dxa"/>
+          </w:tcPr>
+          <w:p>
+            <w:pPr>
+              <w:spacing w:before="0" w:line="240" w:lineRule="auto"/>
+              <w:jc w:val="center"/>
+              <w:rPr>
+                <w:b/>
+                <w:sz w:val="32"/>
+                <w:szCs w:val="32"/>
+              </w:rPr>
+            </w:pPr>
+            <w:r>
+              <w:rPr>
+                <w:b/>
+                <w:sz w:val="32"/>
+                <w:szCs w:val="32"/>
+              </w:rPr>
+              <w:t>Section, Paragraph</w:t>
+            </w:r>
+          </w:p>
+          <w:p>
+            <w:pPr>
+              <w:spacing w:before="0" w:line="240" w:lineRule="auto"/>
+              <w:jc w:val="center"/>
+              <w:rPr>
+                <w:b/>
+                <w:sz w:val="32"/>
+                <w:szCs w:val="32"/>
+              </w:rPr>
+            </w:pPr>
+            <w:r>
+              <w:rPr>
+                <w:b/>
+                <w:sz w:val="32"/>
+                <w:szCs w:val="32"/>
+              </w:rPr>
+              <w:t>Reference</w:t>
+            </w:r>
+          </w:p>
+        </w:tc>
+        <w:tc>
+          <w:tcPr>
+            <w:tcW w:w="4738" w:type="dxa"/>
+          </w:tcPr>
+          <w:p>
+            <w:pPr>
+              <w:spacing w:before="0" w:line="240" w:lineRule="auto"/>
+              <w:jc w:val="center"/>
+              <w:rPr>
+                <w:b/>
+                <w:sz w:val="32"/>
+                <w:szCs w:val="32"/>
+              </w:rPr>
+            </w:pPr>
+            <w:r>
+              <w:rPr>
+                <w:b/>
+                <w:sz w:val="32"/>
+                <w:szCs w:val="32"/>
+              </w:rPr>
+              <w:t>As Printed</w:t>
+            </w:r>
+          </w:p>
+        </w:tc>
+        <w:tc>
+          <w:tcPr>
+            <w:tcW w:w="5220" w:type="dxa"/>
+          </w:tcPr>
+          <w:p>
+            <w:pPr>
+              <w:spacing w:before="0" w:line="240" w:lineRule="auto"/>
+              <w:ind w:right="-18"/>
+              <w:jc w:val="center"/>
+              <w:rPr>
+                <w:b/>
+                <w:sz w:val="32"/>
+                <w:szCs w:val="32"/>
+              </w:rPr>
+            </w:pPr>
+            <w:r>
+              <w:rPr>
+                <w:b/>
+                <w:sz w:val="32"/>
+                <w:szCs w:val="32"/>
+              </w:rPr>
+              <w:t>To be read as or corrected as</w:t>
+            </w:r>
+          </w:p>
+        </w:tc>
+      </w:tr>
+      <w:tr>
+        <w:trPr>
+          <w:trHeight w:val="680"/>
+        </w:trPr>
+        <w:tc>
+          <w:tcPr>
+            <w:tcW w:w="3877" w:type="dxa"/>
+          </w:tcPr>
+          <w:p>
+            <w:pPr>
+              <w:widowControl w:val="0"/>
+              <w:autoSpaceDE w:val="0"/>
+              <w:autoSpaceDN w:val="0"/>
+              <w:adjustRightInd w:val="0"/>
+              <w:spacing w:before="0" w:line="240" w:lineRule="auto"/>
+              <w:rPr>
+                <w:rFonts w:cs="Arial"/>
+                <w:b/>
+                <w:sz w:val="28"/>
+                <w:szCs w:val="28"/>
+              </w:rPr>
+            </w:pPr>
+            <w:r>
+              <w:rPr>
+                <w:rFonts w:cs="Arial"/>
+                <w:b/>
+                <w:sz w:val="28"/>
+                <w:szCs w:val="28"/>
+              </w:rPr>
+              <w:t>TS 2.3.2.5</w:t>
+            </w:r>
+            <w:r>
+              <w:rPr>
+                <w:rFonts w:cs="Arial"/>
+                <w:b/>
+                <w:sz w:val="28"/>
+                <w:szCs w:val="28"/>
+              </w:rPr>
+              <w:t xml:space="preserve"> </w:t>
+            </w:r>
+            <w:r>
+              <w:rPr>
+                <w:rFonts w:cs="Arial"/>
+                <w:b/>
+                <w:sz w:val="28"/>
+                <w:szCs w:val="28"/>
+              </w:rPr>
+              <w:t>- Kramam</w:t>
+            </w:r>
+          </w:p>
+          <w:p>
+            <w:pPr>
+              <w:widowControl w:val="0"/>
+              <w:tabs>
+                <w:tab w:val="left" w:pos="993"/>
+              </w:tabs>
+              <w:autoSpaceDE w:val="0"/>
+              <w:autoSpaceDN w:val="0"/>
+              <w:adjustRightInd w:val="0"/>
+              <w:spacing w:before="0" w:line="252" w:lineRule="auto"/>
+              <w:ind w:right="297"/>
+              <w:rPr>
+                <w:rFonts w:cs="Arial"/>
+                <w:b/>
+                <w:color w:val="000000"/>
+                <w:sz w:val="28"/>
+                <w:szCs w:val="32"/>
+              </w:rPr>
+            </w:pPr>
+            <w:r>
+              <w:rPr>
+                <w:rFonts w:cs="Arial"/>
+                <w:b/>
+                <w:sz w:val="28"/>
+                <w:szCs w:val="28"/>
+              </w:rPr>
+              <w:t xml:space="preserve">Krama </w:t>
+            </w:r>
+            <w:r>
+              <w:rPr>
+                <w:rFonts w:cs="Arial"/>
+                <w:b/>
+                <w:sz w:val="28"/>
+                <w:szCs w:val="28"/>
+              </w:rPr>
+              <w:t>Vaakyam</w:t>
+            </w:r>
+            <w:r>
+              <w:rPr>
+                <w:rFonts w:cs="Arial"/>
+                <w:b/>
+                <w:sz w:val="28"/>
+                <w:szCs w:val="28"/>
+              </w:rPr>
+              <w:t xml:space="preserve"> No. </w:t>
+            </w:r>
+            <w:r>
+              <w:rPr>
+                <w:rFonts w:cs="Arial"/>
+                <w:b/>
+                <w:sz w:val="28"/>
+                <w:szCs w:val="28"/>
+              </w:rPr>
+              <w:t>- 4,5</w:t>
+            </w:r>
+            <w:r>
+              <w:rPr>
+                <w:rFonts w:cs="Arial"/>
+                <w:b/>
+                <w:sz w:val="28"/>
+                <w:szCs w:val="28"/>
+              </w:rPr>
+              <w:br/>
+              <w:t xml:space="preserve">Panchaati </w:t>
+            </w:r>
+            <w:r>
+              <w:rPr>
+                <w:rFonts w:cs="Arial"/>
+                <w:b/>
+                <w:sz w:val="28"/>
+                <w:szCs w:val="28"/>
+              </w:rPr>
+              <w:t>No. - 10</w:t>
+            </w:r>
+          </w:p>
+        </w:tc>
+        <w:tc>
+          <w:tcPr>
+            <w:tcW w:w="4738" w:type="dxa"/>
+          </w:tcPr>
+          <w:p>
+            <w:pPr>
+              <w:spacing w:before="0" w:line="240" w:lineRule="auto"/>
+              <w:rPr>
+                <w:rFonts w:ascii="BRH Devanagari Extra" w:hAnsi="BRH Devanagari Extra" w:cs="BRH Devanagari Extra"/>
+                <w:color w:val="000000"/>
+                <w:sz w:val="40"/>
+                <w:szCs w:val="40"/>
+              </w:rPr>
+            </w:pPr>
+            <w:proofErr w:type="spellStart"/>
+            <w:r>
+              <w:rPr>
+                <w:rFonts w:ascii="BRH Devanagari Extra" w:hAnsi="BRH Devanagari Extra" w:cs="BRH Devanagari Extra"/>
+                <w:color w:val="000000"/>
+                <w:sz w:val="40"/>
+                <w:szCs w:val="40"/>
+              </w:rPr>
+              <w:t>ÌWûUþhrÉÇ</w:t>
+            </w:r>
+            <w:proofErr w:type="spellEnd"/>
+            <w:r>
+              <w:rPr>
+                <w:rFonts w:ascii="BRH Devanagari Extra" w:hAnsi="BRH Devanagari Extra" w:cs="BRH Devanagari Extra"/>
+                <w:color w:val="000000"/>
+                <w:sz w:val="40"/>
+                <w:szCs w:val="40"/>
+              </w:rPr>
+              <w:t xml:space="preserve"> </w:t>
+            </w:r>
+            <w:proofErr w:type="spellStart"/>
+            <w:r>
+              <w:rPr>
+                <w:rFonts w:ascii="BRH Devanagari Extra" w:hAnsi="BRH Devanagari Extra" w:cs="BRH Devanagari Extra"/>
+                <w:color w:val="000000"/>
+                <w:sz w:val="40"/>
+                <w:szCs w:val="40"/>
+              </w:rPr>
+              <w:t>ÆÌuÉ</w:t>
+            </w:r>
+            <w:proofErr w:type="spellEnd"/>
+            <w:r>
+              <w:rPr>
+                <w:rFonts w:ascii="BRH Malayalam Extra" w:hAnsi="BRH Malayalam Extra" w:cs="BRH Devanagari Extra"/>
+                <w:b/>
+                <w:color w:val="000000"/>
+                <w:sz w:val="32"/>
+                <w:szCs w:val="40"/>
+              </w:rPr>
+              <w:t>–</w:t>
+            </w:r>
+            <w:proofErr w:type="spellStart"/>
+            <w:r>
+              <w:rPr>
+                <w:rFonts w:ascii="BRH Devanagari Extra" w:hAnsi="BRH Devanagari Extra" w:cs="BRH Devanagari Extra"/>
+                <w:color w:val="000000"/>
+                <w:sz w:val="40"/>
+                <w:szCs w:val="40"/>
+                <w:highlight w:val="yellow"/>
+              </w:rPr>
+              <w:t>iu</w:t>
+            </w:r>
+            <w:r>
+              <w:rPr>
+                <w:rFonts w:ascii="BRH Devanagari Extra" w:hAnsi="BRH Devanagari Extra" w:cs="BRH Devanagari Extra"/>
+                <w:color w:val="000000"/>
+                <w:sz w:val="40"/>
+                <w:szCs w:val="40"/>
+              </w:rPr>
+              <w:t>ÉÉ</w:t>
+            </w:r>
+            <w:proofErr w:type="spellEnd"/>
+            <w:r>
+              <w:rPr>
+                <w:rFonts w:ascii="BRH Devanagari Extra" w:hAnsi="BRH Devanagari Extra" w:cs="BRH Devanagari Extra"/>
+                <w:color w:val="000000"/>
+                <w:sz w:val="40"/>
+                <w:szCs w:val="40"/>
+              </w:rPr>
+              <w:t xml:space="preserve"> | </w:t>
+            </w:r>
+            <w:proofErr w:type="spellStart"/>
+            <w:r>
+              <w:rPr>
+                <w:rFonts w:ascii="BRH Devanagari Extra" w:hAnsi="BRH Devanagari Extra" w:cs="BRH Devanagari Extra"/>
+                <w:color w:val="000000"/>
+                <w:sz w:val="40"/>
+                <w:szCs w:val="40"/>
+              </w:rPr>
+              <w:t>ÌuÉ</w:t>
+            </w:r>
+            <w:proofErr w:type="spellEnd"/>
+            <w:r>
+              <w:rPr>
+                <w:rFonts w:ascii="BRH Malayalam Extra" w:hAnsi="BRH Malayalam Extra" w:cs="BRH Devanagari Extra"/>
+                <w:b/>
+                <w:color w:val="000000"/>
+                <w:sz w:val="32"/>
+                <w:szCs w:val="40"/>
+              </w:rPr>
+              <w:t>–</w:t>
+            </w:r>
+            <w:proofErr w:type="spellStart"/>
+            <w:r>
+              <w:rPr>
+                <w:rFonts w:ascii="BRH Devanagari Extra" w:hAnsi="BRH Devanagari Extra" w:cs="BRH Devanagari Extra"/>
+                <w:color w:val="000000"/>
+                <w:sz w:val="40"/>
+                <w:szCs w:val="40"/>
+                <w:highlight w:val="yellow"/>
+              </w:rPr>
+              <w:t>iuÉÉ</w:t>
+            </w:r>
+            <w:proofErr w:type="spellEnd"/>
+            <w:r>
+              <w:rPr>
+                <w:rFonts w:ascii="BRH Devanagari Extra" w:hAnsi="BRH Devanagari Extra" w:cs="BRH Devanagari Extra"/>
+                <w:color w:val="000000"/>
+                <w:sz w:val="40"/>
+                <w:szCs w:val="40"/>
+              </w:rPr>
+              <w:t xml:space="preserve"> lÉ |</w:t>
+            </w:r>
+          </w:p>
+        </w:tc>
+        <w:tc>
+          <w:tcPr>
+            <w:tcW w:w="5220" w:type="dxa"/>
+          </w:tcPr>
+          <w:p>
+            <w:pPr>
+              <w:spacing w:before="0" w:line="240" w:lineRule="auto"/>
+              <w:rPr>
+                <w:rFonts w:ascii="BRH Devanagari Extra" w:hAnsi="BRH Devanagari Extra" w:cs="BRH Devanagari Extra"/>
+                <w:color w:val="000000"/>
+                <w:sz w:val="40"/>
+                <w:szCs w:val="40"/>
+              </w:rPr>
+            </w:pPr>
+            <w:r>
+              <w:rPr>
+                <w:rFonts w:ascii="Latha" w:hAnsi="Latha" w:cs="Latha"/>
+                <w:sz w:val="28"/>
+                <w:szCs w:val="28"/>
+                <w:cs/>
+                <w:lang w:bidi="ta-IN"/>
+              </w:rPr>
+              <w:t>ஹிர</w:t>
+            </w:r>
+            <w:r>
+              <w:rPr>
+                <w:rFonts w:ascii="BRH Tamil Tab Extra" w:hAnsi="BRH Tamil Tab Extra" w:cs="Latha"/>
+                <w:b/>
+                <w:sz w:val="36"/>
+                <w:szCs w:val="28"/>
+                <w:lang w:bidi="ta-IN"/>
+              </w:rPr>
+              <w:t>†</w:t>
+            </w:r>
+            <w:r>
+              <w:rPr>
+                <w:rFonts w:ascii="Latha" w:hAnsi="Latha" w:cs="Latha"/>
+                <w:sz w:val="28"/>
+                <w:szCs w:val="28"/>
+                <w:cs/>
+                <w:lang w:bidi="ta-IN"/>
+              </w:rPr>
+              <w:t xml:space="preserve">ண்யம் </w:t>
+            </w:r>
+            <w:r>
+              <w:rPr>
+                <w:rFonts w:ascii="BRH Devanagari Extra" w:hAnsi="BRH Devanagari Extra" w:cs="Latha"/>
+                <w:b/>
+                <w:sz w:val="36"/>
+                <w:szCs w:val="28"/>
+                <w:lang w:bidi="ta-IN"/>
+              </w:rPr>
+              <w:t>Æ</w:t>
+            </w:r>
+            <w:r>
+              <w:rPr>
+                <w:rFonts w:ascii="Latha" w:hAnsi="Latha" w:cs="Latha"/>
+                <w:sz w:val="28"/>
+                <w:szCs w:val="28"/>
+                <w:cs/>
+                <w:lang w:bidi="ta-IN"/>
+              </w:rPr>
+              <w:t>வி</w:t>
+            </w:r>
+            <w:r>
+              <w:rPr>
+                <w:rFonts w:ascii="BRH Tamil Tab Extra" w:hAnsi="BRH Tamil Tab Extra" w:cs="Latha"/>
+                <w:b/>
+                <w:sz w:val="32"/>
+                <w:szCs w:val="28"/>
+                <w:lang w:bidi="ta-IN"/>
+              </w:rPr>
+              <w:t>…</w:t>
+            </w:r>
+            <w:r>
+              <w:rPr>
+                <w:rFonts w:ascii="Latha" w:hAnsi="Latha" w:cs="Latha"/>
+                <w:sz w:val="28"/>
+                <w:szCs w:val="28"/>
+                <w:highlight w:val="green"/>
+                <w:cs/>
+                <w:lang w:bidi="ta-IN"/>
+              </w:rPr>
+              <w:t>த்த்</w:t>
+            </w:r>
+            <w:r>
+              <w:rPr>
+                <w:rFonts w:ascii="Latha" w:hAnsi="Latha" w:cs="Latha"/>
+                <w:sz w:val="28"/>
+                <w:szCs w:val="28"/>
+                <w:cs/>
+                <w:lang w:bidi="ta-IN"/>
+              </w:rPr>
+              <w:t xml:space="preserve">வா </w:t>
+            </w:r>
+            <w:r>
+              <w:rPr>
+                <w:rFonts w:ascii="Latha" w:hAnsi="Latha" w:cs="Latha"/>
+                <w:sz w:val="28"/>
+                <w:szCs w:val="28"/>
+                <w:lang w:bidi="ta-IN"/>
+              </w:rPr>
+              <w:t xml:space="preserve">| </w:t>
+            </w:r>
+            <w:r>
+              <w:rPr>
+                <w:rFonts w:ascii="Latha" w:hAnsi="Latha" w:cs="Latha"/>
+                <w:sz w:val="28"/>
+                <w:szCs w:val="28"/>
+                <w:cs/>
+                <w:lang w:bidi="ta-IN"/>
+              </w:rPr>
+              <w:t>வி</w:t>
+            </w:r>
+            <w:r>
+              <w:rPr>
+                <w:rFonts w:ascii="BRH Tamil Tab Extra" w:hAnsi="BRH Tamil Tab Extra" w:cs="Latha"/>
+                <w:b/>
+                <w:sz w:val="32"/>
+                <w:szCs w:val="28"/>
+                <w:lang w:bidi="ta-IN"/>
+              </w:rPr>
+              <w:t>…</w:t>
+            </w:r>
+            <w:r>
+              <w:rPr>
+                <w:rFonts w:ascii="Latha" w:hAnsi="Latha" w:cs="Latha"/>
+                <w:sz w:val="28"/>
+                <w:szCs w:val="28"/>
+                <w:highlight w:val="green"/>
+                <w:cs/>
+                <w:lang w:bidi="ta-IN"/>
+              </w:rPr>
+              <w:t>த்த்</w:t>
+            </w:r>
+            <w:r>
+              <w:rPr>
+                <w:rFonts w:ascii="Latha" w:hAnsi="Latha" w:cs="Latha"/>
+                <w:sz w:val="28"/>
+                <w:szCs w:val="28"/>
+                <w:cs/>
+                <w:lang w:bidi="ta-IN"/>
+              </w:rPr>
+              <w:t xml:space="preserve">வா ந </w:t>
+            </w:r>
+            <w:r>
+              <w:rPr>
+                <w:rFonts w:ascii="Latha" w:hAnsi="Latha" w:cs="Latha"/>
+                <w:sz w:val="28"/>
+                <w:szCs w:val="28"/>
+                <w:lang w:bidi="ta-IN"/>
+              </w:rPr>
+              <w:t>|</w:t>
+            </w:r>
+          </w:p>
+        </w:tc>
+      </w:tr>
+      <w:tr>
+        <w:trPr>
+          <w:trHeight w:val="680"/>
+        </w:trPr>
+        <w:tc>
+          <w:tcPr>
+            <w:tcW w:w="3877" w:type="dxa"/>
+          </w:tcPr>
+          <w:p>
+            <w:pPr>
+              <w:widowControl w:val="0"/>
+              <w:autoSpaceDE w:val="0"/>
+              <w:autoSpaceDN w:val="0"/>
+              <w:adjustRightInd w:val="0"/>
+              <w:spacing w:before="0" w:line="240" w:lineRule="auto"/>
+              <w:rPr>
+                <w:rFonts w:cs="Arial"/>
+                <w:b/>
+                <w:sz w:val="28"/>
+                <w:szCs w:val="28"/>
+              </w:rPr>
+            </w:pPr>
+            <w:r>
+              <w:rPr>
+                <w:rFonts w:cs="Arial"/>
+                <w:b/>
+                <w:sz w:val="28"/>
+                <w:szCs w:val="28"/>
+              </w:rPr>
+              <w:t>TS 2.3.3.2.</w:t>
+            </w:r>
+            <w:r>
+              <w:rPr>
+                <w:rFonts w:cs="Arial"/>
+                <w:b/>
+                <w:sz w:val="28"/>
+                <w:szCs w:val="28"/>
+              </w:rPr>
+              <w:t xml:space="preserve"> </w:t>
+            </w:r>
+            <w:r>
+              <w:rPr>
+                <w:rFonts w:cs="Arial"/>
+                <w:b/>
+                <w:sz w:val="28"/>
+                <w:szCs w:val="28"/>
+              </w:rPr>
+              <w:t>- Kramam</w:t>
+            </w:r>
+          </w:p>
+          <w:p>
+            <w:pPr>
+              <w:widowControl w:val="0"/>
+              <w:autoSpaceDE w:val="0"/>
+              <w:autoSpaceDN w:val="0"/>
+              <w:adjustRightInd w:val="0"/>
+              <w:spacing w:before="0" w:line="240" w:lineRule="auto"/>
+              <w:rPr>
+                <w:rFonts w:cs="Arial"/>
+                <w:b/>
+                <w:sz w:val="28"/>
+                <w:szCs w:val="28"/>
+              </w:rPr>
+            </w:pPr>
+            <w:r>
+              <w:rPr>
+                <w:rFonts w:cs="Arial"/>
+                <w:b/>
+                <w:sz w:val="28"/>
+                <w:szCs w:val="28"/>
+              </w:rPr>
+              <w:t xml:space="preserve">Krama </w:t>
+            </w:r>
+            <w:r>
+              <w:rPr>
+                <w:rFonts w:cs="Arial"/>
+                <w:b/>
+                <w:sz w:val="28"/>
+                <w:szCs w:val="28"/>
+              </w:rPr>
+              <w:t>Vaakyam</w:t>
+            </w:r>
+            <w:r>
+              <w:rPr>
+                <w:rFonts w:cs="Arial"/>
+                <w:b/>
+                <w:sz w:val="28"/>
+                <w:szCs w:val="28"/>
+              </w:rPr>
+              <w:t xml:space="preserve"> No. </w:t>
+            </w:r>
+            <w:r>
+              <w:rPr>
+                <w:rFonts w:cs="Arial"/>
+                <w:b/>
+                <w:sz w:val="28"/>
+                <w:szCs w:val="28"/>
+              </w:rPr>
+              <w:t>- 30</w:t>
+            </w:r>
+            <w:r>
+              <w:rPr>
+                <w:rFonts w:cs="Arial"/>
+                <w:b/>
+                <w:sz w:val="28"/>
+                <w:szCs w:val="28"/>
+              </w:rPr>
+              <w:br/>
+              <w:t xml:space="preserve">Panchaati </w:t>
+            </w:r>
+            <w:r>
+              <w:rPr>
+                <w:rFonts w:cs="Arial"/>
+                <w:b/>
+                <w:sz w:val="28"/>
+                <w:szCs w:val="28"/>
+              </w:rPr>
+              <w:t>No. - 16</w:t>
+            </w:r>
+          </w:p>
+        </w:tc>
+        <w:tc>
+          <w:tcPr>
+            <w:tcW w:w="4738" w:type="dxa"/>
+          </w:tcPr>
+          <w:p>
+            <w:pPr>
+              <w:spacing w:before="0" w:line="240" w:lineRule="auto"/>
+              <w:rPr>
+                <w:rFonts w:ascii="Latha" w:hAnsi="Latha" w:cs="Latha"/>
+                <w:sz w:val="28"/>
+                <w:szCs w:val="28"/>
+                <w:cs/>
+                <w:lang w:bidi="ta-IN"/>
+              </w:rPr>
+            </w:pPr>
+            <w:proofErr w:type="spellStart"/>
+            <w:r>
+              <w:rPr>
+                <w:rFonts w:ascii="BRH Devanagari Extra" w:hAnsi="BRH Devanagari Extra" w:cs="BRH Devanagari Extra"/>
+                <w:color w:val="000000"/>
+                <w:sz w:val="40"/>
+                <w:szCs w:val="40"/>
+              </w:rPr>
+              <w:t>r</w:t>
+            </w:r>
+            <w:r>
+              <w:rPr>
+                <w:rFonts w:ascii="BRH Devanagari Extra" w:hAnsi="BRH Devanagari Extra" w:cs="BRH Devanagari Extra"/>
+                <w:color w:val="000000"/>
+                <w:sz w:val="40"/>
+                <w:szCs w:val="40"/>
+                <w:highlight w:val="yellow"/>
+              </w:rPr>
+              <w:t>É</w:t>
+            </w:r>
+            <w:r>
+              <w:rPr>
+                <w:rFonts w:ascii="BRH Devanagari Extra" w:hAnsi="BRH Devanagari Extra" w:cs="BRH Devanagari Extra"/>
+                <w:color w:val="EE0000"/>
+                <w:sz w:val="40"/>
+                <w:szCs w:val="40"/>
+                <w:highlight w:val="yellow"/>
+              </w:rPr>
+              <w:t>Sè</w:t>
+            </w:r>
+            <w:proofErr w:type="spellEnd"/>
+            <w:r>
+              <w:rPr>
+                <w:rFonts w:ascii="BRH Devanagari Extra" w:hAnsi="BRH Devanagari Extra" w:cs="BRH Devanagari Extra"/>
+                <w:color w:val="EE0000"/>
+                <w:sz w:val="40"/>
+                <w:szCs w:val="40"/>
+                <w:highlight w:val="yellow"/>
+              </w:rPr>
+              <w:t xml:space="preserve"> L</w:t>
+            </w:r>
+            <w:r>
+              <w:rPr>
+                <w:rFonts w:ascii="BRH Devanagari Extra" w:hAnsi="BRH Devanagari Extra" w:cs="BRH Devanagari Extra"/>
+                <w:color w:val="000000"/>
+                <w:sz w:val="40"/>
+                <w:szCs w:val="40"/>
+                <w:highlight w:val="yellow"/>
+              </w:rPr>
+              <w:t>å</w:t>
+            </w:r>
+            <w:r>
+              <w:rPr>
+                <w:rFonts w:ascii="BRH Malayalam Extra" w:hAnsi="BRH Malayalam Extra" w:cs="BRH Devanagari Extra"/>
+                <w:b/>
+                <w:color w:val="000000"/>
+                <w:sz w:val="32"/>
+                <w:szCs w:val="40"/>
+                <w:highlight w:val="yellow"/>
+              </w:rPr>
+              <w:t>–</w:t>
+            </w:r>
+            <w:proofErr w:type="spellStart"/>
+            <w:r>
+              <w:rPr>
+                <w:rFonts w:ascii="BRH Devanagari Extra" w:hAnsi="BRH Devanagari Extra" w:cs="BRH Devanagari Extra"/>
+                <w:color w:val="000000"/>
+                <w:sz w:val="40"/>
+                <w:szCs w:val="40"/>
+              </w:rPr>
+              <w:t>lSìÈ</w:t>
+            </w:r>
+            <w:proofErr w:type="spellEnd"/>
+            <w:r>
+              <w:rPr>
+                <w:rFonts w:ascii="BRH Devanagari Extra" w:hAnsi="BRH Devanagari Extra" w:cs="BRH Devanagari Extra"/>
+                <w:color w:val="000000"/>
+                <w:sz w:val="40"/>
+                <w:szCs w:val="40"/>
+              </w:rPr>
+              <w:t xml:space="preserve"> | Lå</w:t>
+            </w:r>
+            <w:r>
+              <w:rPr>
+                <w:rFonts w:ascii="BRH Malayalam Extra" w:hAnsi="BRH Malayalam Extra" w:cs="BRH Devanagari Extra"/>
+                <w:b/>
+                <w:color w:val="000000"/>
+                <w:sz w:val="32"/>
+                <w:szCs w:val="40"/>
+              </w:rPr>
+              <w:t>–</w:t>
+            </w:r>
+            <w:proofErr w:type="spellStart"/>
+            <w:r>
+              <w:rPr>
+                <w:rFonts w:ascii="BRH Devanagari Extra" w:hAnsi="BRH Devanagari Extra" w:cs="BRH Devanagari Extra"/>
+                <w:color w:val="000000"/>
+                <w:sz w:val="40"/>
+                <w:szCs w:val="40"/>
+              </w:rPr>
+              <w:t>lSìÉå</w:t>
+            </w:r>
+            <w:proofErr w:type="spellEnd"/>
+            <w:r>
+              <w:rPr>
+                <w:rFonts w:ascii="BRH Devanagari Extra" w:hAnsi="BRH Devanagari Extra" w:cs="BRH Devanagari Extra"/>
+                <w:color w:val="000000"/>
+                <w:sz w:val="40"/>
+                <w:szCs w:val="40"/>
+              </w:rPr>
+              <w:t xml:space="preserve"> </w:t>
+            </w:r>
+            <w:proofErr w:type="spellStart"/>
+            <w:r>
+              <w:rPr>
+                <w:rFonts w:ascii="BRH Devanagari Extra" w:hAnsi="BRH Devanagari Extra" w:cs="BRH Devanagari Extra"/>
+                <w:color w:val="000000"/>
+                <w:sz w:val="40"/>
+                <w:szCs w:val="40"/>
+              </w:rPr>
+              <w:t>pÉuÉþÌiÉ</w:t>
+            </w:r>
+            <w:proofErr w:type="spellEnd"/>
+            <w:r>
+              <w:rPr>
+                <w:rFonts w:ascii="BRH Devanagari Extra" w:hAnsi="BRH Devanagari Extra" w:cs="BRH Devanagari Extra"/>
+                <w:color w:val="000000"/>
+                <w:sz w:val="40"/>
+                <w:szCs w:val="40"/>
+              </w:rPr>
+              <w:t xml:space="preserve"> |</w:t>
+            </w:r>
+          </w:p>
+        </w:tc>
+        <w:tc>
+          <w:tcPr>
+            <w:tcW w:w="5220" w:type="dxa"/>
+          </w:tcPr>
+          <w:p>
+            <w:pPr>
+              <w:spacing w:before="0" w:line="240" w:lineRule="auto"/>
+              <w:rPr>
+                <w:rFonts w:ascii="Latha" w:hAnsi="Latha" w:cs="Latha"/>
+                <w:sz w:val="28"/>
+                <w:szCs w:val="28"/>
+                <w:cs/>
+                <w:lang w:bidi="ta-IN"/>
+              </w:rPr>
+            </w:pPr>
+            <w:r>
+              <w:rPr>
+                <w:rFonts w:ascii="Latha" w:hAnsi="Latha" w:cs="Latha"/>
+                <w:sz w:val="28"/>
+                <w:szCs w:val="28"/>
+                <w:cs/>
+                <w:lang w:bidi="ta-IN"/>
+              </w:rPr>
+              <w:t>ய</w:t>
+            </w:r>
+            <w:r>
+              <w:rPr>
+                <w:rFonts w:ascii="Latha" w:hAnsi="Latha" w:cs="Latha" w:hint="cs"/>
+                <w:sz w:val="28"/>
+                <w:szCs w:val="28"/>
+                <w:highlight w:val="green"/>
+                <w:cs/>
+                <w:lang w:bidi="ta-IN"/>
+              </w:rPr>
+              <w:t>தை</w:t>
+            </w:r>
+            <w:r>
+              <w:rPr>
+                <w:rFonts w:ascii="BRH Tamil Tab Extra" w:hAnsi="BRH Tamil Tab Extra" w:cs="Latha"/>
+                <w:b/>
+                <w:sz w:val="32"/>
+                <w:szCs w:val="28"/>
+                <w:highlight w:val="green"/>
+                <w:lang w:bidi="ta-IN"/>
+              </w:rPr>
+              <w:t>…</w:t>
+            </w:r>
+            <w:r>
+              <w:rPr>
+                <w:rFonts w:ascii="Latha" w:hAnsi="Latha" w:cs="Latha"/>
+                <w:b/>
+                <w:bCs/>
+                <w:position w:val="-12"/>
+                <w:sz w:val="28"/>
+                <w:szCs w:val="28"/>
+                <w:highlight w:val="green"/>
+                <w:cs/>
+                <w:lang w:bidi="ta-IN"/>
+              </w:rPr>
+              <w:t>3</w:t>
+            </w:r>
+            <w:r>
+              <w:rPr>
+                <w:rFonts w:ascii="Latha" w:hAnsi="Latha" w:cs="Latha"/>
+                <w:sz w:val="28"/>
+                <w:szCs w:val="28"/>
+                <w:highlight w:val="green"/>
+                <w:cs/>
+                <w:lang w:bidi="ta-IN"/>
+              </w:rPr>
+              <w:t>ந்</w:t>
+            </w:r>
+            <w:r>
+              <w:rPr>
+                <w:rFonts w:ascii="Latha" w:hAnsi="Latha" w:cs="Latha"/>
+                <w:sz w:val="28"/>
+                <w:szCs w:val="28"/>
+                <w:cs/>
+                <w:lang w:bidi="ta-IN"/>
+              </w:rPr>
+              <w:t>த்</w:t>
+            </w:r>
+            <w:r>
+              <w:rPr>
+                <w:rFonts w:ascii="Latha" w:hAnsi="Latha" w:cs="Latha"/>
+                <w:b/>
+                <w:bCs/>
+                <w:position w:val="-12"/>
+                <w:sz w:val="28"/>
+                <w:szCs w:val="28"/>
+                <w:cs/>
+                <w:lang w:bidi="ta-IN"/>
+              </w:rPr>
+              <w:t>3</w:t>
+            </w:r>
+            <w:r>
+              <w:rPr>
+                <w:rFonts w:ascii="Latha" w:hAnsi="Latha" w:cs="Latha"/>
+                <w:sz w:val="28"/>
+                <w:szCs w:val="28"/>
+                <w:cs/>
+                <w:lang w:bidi="ta-IN"/>
+              </w:rPr>
+              <w:t>ர</w:t>
+            </w:r>
+            <w:r>
+              <w:rPr>
+                <w:rFonts w:ascii="Latha" w:hAnsi="Latha" w:cs="Latha"/>
+                <w:b/>
+                <w:bCs/>
+                <w:sz w:val="32"/>
+                <w:szCs w:val="32"/>
+                <w:cs/>
+                <w:lang w:bidi="ta-IN"/>
+              </w:rPr>
+              <w:t>:</w:t>
+            </w:r>
+            <w:r>
+              <w:rPr>
+                <w:rFonts w:ascii="Latha" w:hAnsi="Latha" w:cs="Latha"/>
+                <w:sz w:val="28"/>
+                <w:szCs w:val="28"/>
+                <w:cs/>
+                <w:lang w:bidi="ta-IN"/>
+              </w:rPr>
+              <w:t xml:space="preserve"> </w:t>
+            </w:r>
+            <w:r>
+              <w:rPr>
+                <w:rFonts w:ascii="Latha" w:hAnsi="Latha" w:cs="Latha"/>
+                <w:sz w:val="28"/>
+                <w:szCs w:val="28"/>
+                <w:lang w:bidi="ta-IN"/>
+              </w:rPr>
+              <w:t xml:space="preserve">| </w:t>
+            </w:r>
+            <w:r>
+              <w:rPr>
+                <w:rFonts w:ascii="Latha" w:hAnsi="Latha" w:cs="Latha"/>
+                <w:sz w:val="28"/>
+                <w:szCs w:val="28"/>
+                <w:cs/>
+                <w:lang w:bidi="ta-IN"/>
+              </w:rPr>
+              <w:t>ஐ</w:t>
+            </w:r>
+            <w:r>
+              <w:rPr>
+                <w:rFonts w:ascii="BRH Tamil Tab Extra" w:hAnsi="BRH Tamil Tab Extra" w:cs="Latha"/>
+                <w:b/>
+                <w:sz w:val="32"/>
+                <w:szCs w:val="28"/>
+                <w:lang w:bidi="ta-IN"/>
+              </w:rPr>
+              <w:t>…</w:t>
+            </w:r>
+            <w:r>
+              <w:rPr>
+                <w:rFonts w:ascii="Latha" w:hAnsi="Latha" w:cs="Latha"/>
+                <w:sz w:val="28"/>
+                <w:szCs w:val="28"/>
+                <w:cs/>
+                <w:lang w:bidi="ta-IN"/>
+              </w:rPr>
+              <w:t>ந்த்</w:t>
+            </w:r>
+            <w:r>
+              <w:rPr>
+                <w:rFonts w:ascii="Latha" w:hAnsi="Latha" w:cs="Latha"/>
+                <w:b/>
+                <w:bCs/>
+                <w:position w:val="-12"/>
+                <w:sz w:val="28"/>
+                <w:szCs w:val="28"/>
+                <w:cs/>
+                <w:lang w:bidi="ta-IN"/>
+              </w:rPr>
+              <w:t>3</w:t>
+            </w:r>
+            <w:r>
+              <w:rPr>
+                <w:rFonts w:ascii="Latha" w:hAnsi="Latha" w:cs="Latha"/>
+                <w:sz w:val="28"/>
+                <w:szCs w:val="28"/>
+                <w:cs/>
+                <w:lang w:bidi="ta-IN"/>
+              </w:rPr>
+              <w:t>ரோ ப</w:t>
+            </w:r>
+            <w:r>
+              <w:rPr>
+                <w:rFonts w:ascii="Latha" w:hAnsi="Latha" w:cs="Latha"/>
+                <w:b/>
+                <w:bCs/>
+                <w:position w:val="-12"/>
+                <w:sz w:val="28"/>
+                <w:szCs w:val="28"/>
+                <w:cs/>
+                <w:lang w:bidi="ta-IN"/>
+              </w:rPr>
+              <w:t>4</w:t>
+            </w:r>
+            <w:r>
+              <w:rPr>
+                <w:rFonts w:ascii="Latha" w:hAnsi="Latha" w:cs="Latha"/>
+                <w:sz w:val="28"/>
+                <w:szCs w:val="28"/>
+                <w:cs/>
+                <w:lang w:bidi="ta-IN"/>
+              </w:rPr>
+              <w:t>வ</w:t>
+            </w:r>
+            <w:r>
+              <w:rPr>
+                <w:rFonts w:ascii="BRH Tamil Tab Extra" w:hAnsi="BRH Tamil Tab Extra" w:cs="Latha"/>
+                <w:b/>
+                <w:sz w:val="36"/>
+                <w:szCs w:val="28"/>
+                <w:lang w:bidi="ta-IN"/>
+              </w:rPr>
+              <w:t>†</w:t>
+            </w:r>
+            <w:r>
+              <w:rPr>
+                <w:rFonts w:ascii="Latha" w:hAnsi="Latha" w:cs="Latha"/>
+                <w:sz w:val="28"/>
+                <w:szCs w:val="28"/>
+                <w:cs/>
+                <w:lang w:bidi="ta-IN"/>
+              </w:rPr>
+              <w:t xml:space="preserve">தி </w:t>
+            </w:r>
+          </w:p>
+        </w:tc>
+      </w:tr>
+      <w:tr>
+        <w:trPr>
+          <w:trHeight w:val="680"/>
+        </w:trPr>
+        <w:tc>
+          <w:tcPr>
+            <w:tcW w:w="3877" w:type="dxa"/>
+          </w:tcPr>
+          <w:p>
+            <w:pPr>
+              <w:widowControl w:val="0"/>
+              <w:autoSpaceDE w:val="0"/>
+              <w:autoSpaceDN w:val="0"/>
+              <w:adjustRightInd w:val="0"/>
+              <w:spacing w:before="0" w:line="240" w:lineRule="auto"/>
+              <w:rPr>
+                <w:rFonts w:cs="Arial"/>
+                <w:b/>
+                <w:sz w:val="28"/>
+                <w:szCs w:val="28"/>
+              </w:rPr>
+            </w:pPr>
+            <w:r>
+              <w:rPr>
+                <w:rFonts w:cs="Arial"/>
+                <w:b/>
+                <w:sz w:val="28"/>
+                <w:szCs w:val="28"/>
+              </w:rPr>
+              <w:t>TS 2.3.5.1.</w:t>
+            </w:r>
+            <w:r>
+              <w:rPr>
+                <w:rFonts w:cs="Arial"/>
+                <w:b/>
+                <w:sz w:val="28"/>
+                <w:szCs w:val="28"/>
+              </w:rPr>
+              <w:t xml:space="preserve"> </w:t>
+            </w:r>
+            <w:r>
+              <w:rPr>
+                <w:rFonts w:cs="Arial"/>
+                <w:b/>
+                <w:sz w:val="28"/>
+                <w:szCs w:val="28"/>
+              </w:rPr>
+              <w:t>- Kramam</w:t>
+            </w:r>
+          </w:p>
+          <w:p>
+            <w:pPr>
+              <w:widowControl w:val="0"/>
+              <w:autoSpaceDE w:val="0"/>
+              <w:autoSpaceDN w:val="0"/>
+              <w:adjustRightInd w:val="0"/>
+              <w:spacing w:before="0" w:line="240" w:lineRule="auto"/>
+              <w:rPr>
+                <w:rFonts w:cs="Arial"/>
+                <w:b/>
+                <w:sz w:val="28"/>
+                <w:szCs w:val="28"/>
+              </w:rPr>
+            </w:pPr>
+            <w:r>
+              <w:rPr>
+                <w:rFonts w:cs="Arial"/>
+                <w:b/>
+                <w:sz w:val="28"/>
+                <w:szCs w:val="28"/>
+              </w:rPr>
+              <w:t xml:space="preserve">Krama </w:t>
+            </w:r>
+            <w:r>
+              <w:rPr>
+                <w:rFonts w:cs="Arial"/>
+                <w:b/>
+                <w:sz w:val="28"/>
+                <w:szCs w:val="28"/>
+              </w:rPr>
+              <w:t>Vaakyam</w:t>
+            </w:r>
+            <w:r>
+              <w:rPr>
+                <w:rFonts w:cs="Arial"/>
+                <w:b/>
+                <w:sz w:val="28"/>
+                <w:szCs w:val="28"/>
+              </w:rPr>
+              <w:t xml:space="preserve"> No. </w:t>
+            </w:r>
+            <w:r>
+              <w:rPr>
+                <w:rFonts w:cs="Arial"/>
+                <w:b/>
+                <w:sz w:val="28"/>
+                <w:szCs w:val="28"/>
+              </w:rPr>
+              <w:t>- 13</w:t>
+            </w:r>
+            <w:r>
+              <w:rPr>
+                <w:rFonts w:cs="Arial"/>
+                <w:b/>
+                <w:sz w:val="28"/>
+                <w:szCs w:val="28"/>
+              </w:rPr>
+              <w:br/>
+              <w:t xml:space="preserve">Panchaati </w:t>
+            </w:r>
+            <w:r>
+              <w:rPr>
+                <w:rFonts w:cs="Arial"/>
+                <w:b/>
+                <w:sz w:val="28"/>
+                <w:szCs w:val="28"/>
+              </w:rPr>
+              <w:t>No. - 24</w:t>
+            </w:r>
+          </w:p>
+        </w:tc>
+        <w:tc>
+          <w:tcPr>
+            <w:tcW w:w="4738" w:type="dxa"/>
+          </w:tcPr>
+          <w:p>
+            <w:pPr>
+              <w:spacing w:before="0" w:line="240" w:lineRule="auto"/>
+              <w:rPr>
+                <w:rFonts w:ascii="Latha" w:hAnsi="Latha" w:cs="Latha"/>
+                <w:sz w:val="28"/>
+                <w:szCs w:val="28"/>
+                <w:cs/>
+                <w:lang w:val="en-IN" w:bidi="ta-IN"/>
+              </w:rPr>
+            </w:pPr>
+            <w:proofErr w:type="spellStart"/>
+            <w:r>
+              <w:rPr>
+                <w:rFonts w:ascii="BRH Devanagari Extra" w:hAnsi="BRH Devanagari Extra" w:cs="BRH Devanagari Extra"/>
+                <w:color w:val="EE0000"/>
+                <w:sz w:val="40"/>
+                <w:szCs w:val="40"/>
+                <w:highlight w:val="yellow"/>
+              </w:rPr>
+              <w:t>F</w:t>
+            </w:r>
+            <w:r>
+              <w:rPr>
+                <w:rFonts w:ascii="BRH Devanagari Extra" w:hAnsi="BRH Devanagari Extra" w:cs="BRH Devanagari Extra"/>
+                <w:color w:val="000000"/>
+                <w:sz w:val="40"/>
+                <w:szCs w:val="40"/>
+              </w:rPr>
+              <w:t>mÉæÿiÉç</w:t>
+            </w:r>
+            <w:proofErr w:type="spellEnd"/>
+            <w:r>
+              <w:rPr>
+                <w:rFonts w:ascii="BRH Devanagari Extra" w:hAnsi="BRH Devanagari Extra" w:cs="BRH Devanagari Extra"/>
+                <w:color w:val="000000"/>
+                <w:sz w:val="40"/>
+                <w:szCs w:val="40"/>
+              </w:rPr>
+              <w:t xml:space="preserve"> | Lå</w:t>
+            </w:r>
+            <w:r>
+              <w:rPr>
+                <w:rFonts w:ascii="BRH Malayalam Extra" w:hAnsi="BRH Malayalam Extra" w:cs="BRH Devanagari Extra"/>
+                <w:b/>
+                <w:color w:val="000000"/>
+                <w:sz w:val="32"/>
+                <w:szCs w:val="40"/>
+              </w:rPr>
+              <w:t>–</w:t>
+            </w:r>
+            <w:r>
+              <w:rPr>
+                <w:rFonts w:ascii="BRH Devanagari Extra" w:hAnsi="BRH Devanagari Extra" w:cs="BRH Devanagari Extra"/>
+                <w:color w:val="000000"/>
+                <w:sz w:val="40"/>
+                <w:szCs w:val="40"/>
+              </w:rPr>
+              <w:t xml:space="preserve">iÉç </w:t>
+            </w:r>
+            <w:proofErr w:type="spellStart"/>
+            <w:r>
+              <w:rPr>
+                <w:rFonts w:ascii="BRH Devanagari Extra" w:hAnsi="BRH Devanagari Extra" w:cs="BRH Devanagari Extra"/>
+                <w:color w:val="000000"/>
+                <w:sz w:val="40"/>
+                <w:szCs w:val="40"/>
+              </w:rPr>
+              <w:t>iÉÉÈ</w:t>
+            </w:r>
+            <w:proofErr w:type="spellEnd"/>
+            <w:r>
+              <w:rPr>
+                <w:rFonts w:ascii="BRH Devanagari Extra" w:hAnsi="BRH Devanagari Extra" w:cs="BRH Devanagari Extra"/>
+                <w:color w:val="000000"/>
+                <w:sz w:val="40"/>
+                <w:szCs w:val="40"/>
+              </w:rPr>
+              <w:t xml:space="preserve"> |</w:t>
+            </w:r>
+          </w:p>
+        </w:tc>
+        <w:tc>
+          <w:tcPr>
+            <w:tcW w:w="5220" w:type="dxa"/>
+          </w:tcPr>
+          <w:p>
+            <w:pPr>
+              <w:spacing w:before="0" w:line="240" w:lineRule="auto"/>
+              <w:rPr>
+                <w:rFonts w:ascii="Latha" w:hAnsi="Latha" w:cs="Latha"/>
+                <w:sz w:val="28"/>
+                <w:szCs w:val="28"/>
+                <w:cs/>
+                <w:lang w:bidi="ta-IN"/>
+              </w:rPr>
+            </w:pPr>
+            <w:r>
+              <w:rPr>
+                <w:rFonts w:ascii="Latha" w:hAnsi="Latha" w:cs="Latha" w:hint="cs"/>
+                <w:sz w:val="28"/>
+                <w:szCs w:val="28"/>
+                <w:highlight w:val="green"/>
+                <w:cs/>
+                <w:lang w:bidi="ta-IN"/>
+              </w:rPr>
+              <w:t>உ</w:t>
+            </w:r>
+            <w:r>
+              <w:rPr>
+                <w:rFonts w:ascii="Latha" w:hAnsi="Latha" w:cs="Latha"/>
+                <w:sz w:val="28"/>
+                <w:szCs w:val="28"/>
+                <w:highlight w:val="green"/>
+                <w:cs/>
+                <w:lang w:bidi="ta-IN"/>
+              </w:rPr>
+              <w:t>பை</w:t>
+            </w:r>
+            <w:r>
+              <w:rPr>
+                <w:rFonts w:ascii="BRH Tamil Tab Extra" w:hAnsi="BRH Tamil Tab Extra" w:cs="Latha"/>
+                <w:b/>
+                <w:sz w:val="36"/>
+                <w:szCs w:val="28"/>
+                <w:highlight w:val="green"/>
+                <w:lang w:bidi="ta-IN"/>
+              </w:rPr>
+              <w:t>‡</w:t>
+            </w:r>
+            <w:r>
+              <w:rPr>
+                <w:rFonts w:ascii="Latha" w:hAnsi="Latha" w:cs="Latha"/>
+                <w:sz w:val="28"/>
+                <w:szCs w:val="28"/>
+                <w:cs/>
+                <w:lang w:bidi="ta-IN"/>
+              </w:rPr>
+              <w:t>த்</w:t>
+            </w:r>
+            <w:r>
+              <w:rPr>
+                <w:rFonts w:ascii="Latha" w:hAnsi="Latha" w:cs="Latha"/>
+                <w:sz w:val="28"/>
+                <w:szCs w:val="28"/>
+                <w:cs/>
+                <w:lang w:bidi="ta-IN"/>
+              </w:rPr>
+              <w:t xml:space="preserve"> </w:t>
+            </w:r>
+            <w:r>
+              <w:rPr>
+                <w:rFonts w:ascii="Latha" w:hAnsi="Latha" w:cs="Latha"/>
+                <w:sz w:val="28"/>
+                <w:szCs w:val="28"/>
+                <w:lang w:bidi="ta-IN"/>
+              </w:rPr>
+              <w:t xml:space="preserve">| </w:t>
+            </w:r>
+            <w:r>
+              <w:rPr>
+                <w:rFonts w:ascii="Latha" w:hAnsi="Latha" w:cs="Latha"/>
+                <w:sz w:val="28"/>
+                <w:szCs w:val="28"/>
+                <w:cs/>
+                <w:lang w:bidi="ta-IN"/>
+              </w:rPr>
+              <w:t>ஐ</w:t>
+            </w:r>
+            <w:r>
+              <w:rPr>
+                <w:rFonts w:ascii="BRH Tamil Tab Extra" w:hAnsi="BRH Tamil Tab Extra" w:cs="Latha"/>
+                <w:b/>
+                <w:sz w:val="32"/>
+                <w:szCs w:val="28"/>
+                <w:lang w:bidi="ta-IN"/>
+              </w:rPr>
+              <w:t>…</w:t>
+            </w:r>
+            <w:r>
+              <w:rPr>
+                <w:rFonts w:ascii="Latha" w:hAnsi="Latha" w:cs="Latha"/>
+                <w:sz w:val="28"/>
+                <w:szCs w:val="28"/>
+                <w:cs/>
+                <w:lang w:bidi="ta-IN"/>
+              </w:rPr>
+              <w:t>த் தா</w:t>
+            </w:r>
+            <w:r>
+              <w:rPr>
+                <w:rFonts w:ascii="Latha" w:hAnsi="Latha" w:cs="Latha"/>
+                <w:b/>
+                <w:bCs/>
+                <w:sz w:val="32"/>
+                <w:szCs w:val="32"/>
+                <w:cs/>
+                <w:lang w:bidi="ta-IN"/>
+              </w:rPr>
+              <w:t>:</w:t>
+            </w:r>
+            <w:r>
+              <w:rPr>
+                <w:rFonts w:ascii="Latha" w:hAnsi="Latha" w:cs="Latha"/>
+                <w:sz w:val="28"/>
+                <w:szCs w:val="28"/>
+                <w:cs/>
+                <w:lang w:bidi="ta-IN"/>
+              </w:rPr>
+              <w:t xml:space="preserve"> </w:t>
+            </w:r>
+            <w:r>
+              <w:rPr>
+                <w:rFonts w:ascii="Latha" w:hAnsi="Latha" w:cs="Latha"/>
+                <w:sz w:val="28"/>
+                <w:szCs w:val="28"/>
+                <w:lang w:bidi="ta-IN"/>
+              </w:rPr>
+              <w:t>|</w:t>
+            </w:r>
+          </w:p>
+        </w:tc>
+      </w:tr>
+      <w:tr>
+        <w:trPr>
+          <w:trHeight w:val="680"/>
+        </w:trPr>
+        <w:tc>
+          <w:tcPr>
+            <w:tcW w:w="3877" w:type="dxa"/>
+          </w:tcPr>
+          <w:p>
+            <w:pPr>
+              <w:widowControl w:val="0"/>
+              <w:autoSpaceDE w:val="0"/>
+              <w:autoSpaceDN w:val="0"/>
+              <w:adjustRightInd w:val="0"/>
+              <w:spacing w:before="0" w:line="240" w:lineRule="auto"/>
+              <w:rPr>
+                <w:rFonts w:cs="Arial"/>
+                <w:b/>
+                <w:sz w:val="28"/>
+                <w:szCs w:val="28"/>
+              </w:rPr>
+            </w:pPr>
+            <w:r>
+              <w:rPr>
+                <w:rFonts w:cs="Arial"/>
+                <w:b/>
+                <w:sz w:val="28"/>
+                <w:szCs w:val="28"/>
+              </w:rPr>
+              <w:t>TS 2.3.14.6.</w:t>
+            </w:r>
+            <w:r>
+              <w:rPr>
+                <w:rFonts w:cs="Arial"/>
+                <w:b/>
+                <w:sz w:val="28"/>
+                <w:szCs w:val="28"/>
+              </w:rPr>
+              <w:t xml:space="preserve"> </w:t>
+            </w:r>
+            <w:r>
+              <w:rPr>
+                <w:rFonts w:cs="Arial"/>
+                <w:b/>
+                <w:sz w:val="28"/>
+                <w:szCs w:val="28"/>
+              </w:rPr>
+              <w:t>- Kramam</w:t>
+            </w:r>
+          </w:p>
+          <w:p>
+            <w:pPr>
+              <w:widowControl w:val="0"/>
+              <w:autoSpaceDE w:val="0"/>
+              <w:autoSpaceDN w:val="0"/>
+              <w:adjustRightInd w:val="0"/>
+              <w:spacing w:before="0" w:line="240" w:lineRule="auto"/>
+              <w:rPr>
+                <w:rFonts w:cs="Arial"/>
+                <w:b/>
+                <w:sz w:val="28"/>
+                <w:szCs w:val="28"/>
+              </w:rPr>
+            </w:pPr>
+            <w:r>
+              <w:rPr>
+                <w:rFonts w:cs="Arial"/>
+                <w:b/>
+                <w:sz w:val="28"/>
+                <w:szCs w:val="28"/>
+              </w:rPr>
+              <w:t xml:space="preserve">Krama </w:t>
+            </w:r>
+            <w:r>
+              <w:rPr>
+                <w:rFonts w:cs="Arial"/>
+                <w:b/>
+                <w:sz w:val="28"/>
+                <w:szCs w:val="28"/>
+              </w:rPr>
+              <w:t>Vaakyam</w:t>
+            </w:r>
+            <w:r>
+              <w:rPr>
+                <w:rFonts w:cs="Arial"/>
+                <w:b/>
+                <w:sz w:val="28"/>
+                <w:szCs w:val="28"/>
+              </w:rPr>
+              <w:t xml:space="preserve"> No. </w:t>
+            </w:r>
+            <w:r>
+              <w:rPr>
+                <w:rFonts w:cs="Arial"/>
+                <w:b/>
+                <w:sz w:val="28"/>
+                <w:szCs w:val="28"/>
+              </w:rPr>
+              <w:t>- 11</w:t>
+            </w:r>
+            <w:r>
+              <w:rPr>
+                <w:rFonts w:cs="Arial"/>
+                <w:b/>
+                <w:sz w:val="28"/>
+                <w:szCs w:val="28"/>
+              </w:rPr>
+              <w:br/>
+              <w:t xml:space="preserve">Panchaati </w:t>
+            </w:r>
+            <w:r>
+              <w:rPr>
+                <w:rFonts w:cs="Arial"/>
+                <w:b/>
+                <w:sz w:val="28"/>
+                <w:szCs w:val="28"/>
+              </w:rPr>
+              <w:t>No. - 56</w:t>
+            </w:r>
+          </w:p>
+        </w:tc>
+        <w:tc>
+          <w:tcPr>
+            <w:tcW w:w="4738" w:type="dxa"/>
+          </w:tcPr>
+          <w:p>
+            <w:pPr>
+              <w:spacing w:before="0" w:line="240" w:lineRule="auto"/>
+              <w:rPr>
+                <w:rFonts w:ascii="Latha" w:hAnsi="Latha" w:cs="Latha"/>
+                <w:sz w:val="28"/>
+                <w:szCs w:val="28"/>
+                <w:cs/>
+                <w:lang w:bidi="ta-IN"/>
+              </w:rPr>
+            </w:pPr>
+            <w:r>
+              <w:rPr>
+                <w:rFonts w:ascii="BRH Devanagari Extra" w:hAnsi="BRH Devanagari Extra" w:cs="BRH Devanagari Extra"/>
+                <w:color w:val="EE0000"/>
+                <w:sz w:val="40"/>
+                <w:szCs w:val="40"/>
+                <w:highlight w:val="yellow"/>
+              </w:rPr>
+              <w:t>oÉ¼</w:t>
+            </w:r>
+            <w:r>
+              <w:rPr>
+                <w:rFonts w:ascii="BRH Malayalam Extra" w:hAnsi="BRH Malayalam Extra" w:cs="BRH Devanagari Extra"/>
+                <w:b/>
+                <w:color w:val="000000"/>
+                <w:sz w:val="32"/>
+                <w:szCs w:val="40"/>
+              </w:rPr>
+              <w:t>–</w:t>
+            </w:r>
+            <w:r>
+              <w:rPr>
+                <w:rFonts w:ascii="BRH Devanagari Extra" w:hAnsi="BRH Devanagari Extra" w:cs="BRH Devanagari Extra"/>
+                <w:color w:val="000000"/>
+                <w:sz w:val="40"/>
+                <w:szCs w:val="40"/>
+              </w:rPr>
+              <w:t xml:space="preserve"> oÉë¼þhÉÈ | oÉë¼þhÉ</w:t>
+            </w:r>
+            <w:r>
+              <w:rPr>
+                <w:rFonts w:ascii="BRH Malayalam Extra" w:hAnsi="BRH Malayalam Extra" w:cs="BRH Devanagari Extra"/>
+                <w:b/>
+                <w:color w:val="000000"/>
+                <w:sz w:val="32"/>
+                <w:szCs w:val="40"/>
+              </w:rPr>
+              <w:t>–</w:t>
+            </w:r>
+            <w:r>
+              <w:rPr>
+                <w:rFonts w:ascii="BRH Devanagari Extra" w:hAnsi="BRH Devanagari Extra" w:cs="BRH Devanagari Extra"/>
+                <w:color w:val="000000"/>
+                <w:sz w:val="40"/>
+                <w:szCs w:val="40"/>
+              </w:rPr>
+              <w:t xml:space="preserve"> </w:t>
+            </w:r>
+            <w:proofErr w:type="spellStart"/>
+            <w:r>
+              <w:rPr>
+                <w:rFonts w:ascii="BRH Devanagari Extra" w:hAnsi="BRH Devanagari Extra" w:cs="BRH Devanagari Extra"/>
+                <w:color w:val="000000"/>
+                <w:sz w:val="40"/>
+                <w:szCs w:val="40"/>
+              </w:rPr>
+              <w:t>EiÉç</w:t>
+            </w:r>
+            <w:proofErr w:type="spellEnd"/>
+            <w:r>
+              <w:rPr>
+                <w:rFonts w:ascii="BRH Devanagari Extra" w:hAnsi="BRH Devanagari Extra" w:cs="BRH Devanagari Extra"/>
+                <w:color w:val="000000"/>
+                <w:sz w:val="40"/>
+                <w:szCs w:val="40"/>
+              </w:rPr>
+              <w:t xml:space="preserve"> |</w:t>
+            </w:r>
+          </w:p>
+        </w:tc>
+        <w:tc>
+          <w:tcPr>
+            <w:tcW w:w="5220" w:type="dxa"/>
+          </w:tcPr>
+          <w:p>
+            <w:pPr>
+              <w:spacing w:before="0" w:line="240" w:lineRule="auto"/>
+              <w:rPr>
+                <w:rFonts w:ascii="Latha" w:hAnsi="Latha" w:cs="Latha"/>
+                <w:sz w:val="28"/>
+                <w:szCs w:val="28"/>
+                <w:cs/>
+                <w:lang w:bidi="ta-IN"/>
+              </w:rPr>
+            </w:pPr>
+            <w:r>
+              <w:rPr>
+                <w:rFonts w:ascii="Latha" w:hAnsi="Latha" w:cs="Latha"/>
+                <w:sz w:val="28"/>
+                <w:szCs w:val="28"/>
+                <w:highlight w:val="green"/>
+                <w:cs/>
+                <w:lang w:bidi="ta-IN"/>
+              </w:rPr>
+              <w:t>ப்</w:t>
+            </w:r>
+            <w:r>
+              <w:rPr>
+                <w:rFonts w:ascii="Latha" w:hAnsi="Latha" w:cs="Latha"/>
+                <w:b/>
+                <w:bCs/>
+                <w:position w:val="-12"/>
+                <w:sz w:val="28"/>
+                <w:szCs w:val="28"/>
+                <w:highlight w:val="green"/>
+                <w:cs/>
+                <w:lang w:bidi="ta-IN"/>
+              </w:rPr>
+              <w:t>3</w:t>
+            </w:r>
+            <w:r>
+              <w:rPr>
+                <w:rFonts w:ascii="Latha" w:hAnsi="Latha" w:cs="Latha"/>
+                <w:sz w:val="28"/>
+                <w:szCs w:val="28"/>
+                <w:highlight w:val="green"/>
+                <w:cs/>
+                <w:lang w:bidi="ta-IN"/>
+              </w:rPr>
+              <w:t>ரஹ்</w:t>
+            </w:r>
+            <w:r>
+              <w:rPr>
+                <w:rFonts w:ascii="Latha" w:hAnsi="Latha" w:cs="Latha"/>
+                <w:sz w:val="28"/>
+                <w:szCs w:val="28"/>
+                <w:cs/>
+                <w:lang w:bidi="ta-IN"/>
+              </w:rPr>
+              <w:t>ம</w:t>
+            </w:r>
+            <w:r>
+              <w:rPr>
+                <w:rFonts w:ascii="BRH Tamil Tab Extra" w:hAnsi="BRH Tamil Tab Extra" w:cs="Latha"/>
+                <w:b/>
+                <w:sz w:val="32"/>
+                <w:szCs w:val="28"/>
+                <w:lang w:bidi="ta-IN"/>
+              </w:rPr>
+              <w:t>…</w:t>
+            </w:r>
+            <w:r>
+              <w:rPr>
+                <w:rFonts w:ascii="Latha" w:hAnsi="Latha" w:cs="Latha"/>
+                <w:sz w:val="28"/>
+                <w:szCs w:val="28"/>
+                <w:lang w:bidi="ta-IN"/>
+              </w:rPr>
+              <w:t xml:space="preserve"> </w:t>
+            </w:r>
+            <w:r>
+              <w:rPr>
+                <w:rFonts w:ascii="Latha" w:hAnsi="Latha" w:cs="Latha"/>
+                <w:sz w:val="28"/>
+                <w:szCs w:val="28"/>
+                <w:cs/>
+                <w:lang w:bidi="ta-IN"/>
+              </w:rPr>
+              <w:t>ப்</w:t>
+            </w:r>
+            <w:r>
+              <w:rPr>
+                <w:rFonts w:ascii="Latha" w:hAnsi="Latha" w:cs="Latha"/>
+                <w:b/>
+                <w:bCs/>
+                <w:position w:val="-12"/>
+                <w:sz w:val="28"/>
+                <w:szCs w:val="28"/>
+                <w:cs/>
+                <w:lang w:bidi="ta-IN"/>
+              </w:rPr>
+              <w:t>3</w:t>
+            </w:r>
+            <w:r>
+              <w:rPr>
+                <w:rFonts w:ascii="Latha" w:hAnsi="Latha" w:cs="Latha"/>
+                <w:sz w:val="28"/>
+                <w:szCs w:val="28"/>
+                <w:cs/>
+                <w:lang w:bidi="ta-IN"/>
+              </w:rPr>
+              <w:t>ரஹ்ம</w:t>
+            </w:r>
+            <w:r>
+              <w:rPr>
+                <w:rFonts w:ascii="BRH Tamil Tab Extra" w:hAnsi="BRH Tamil Tab Extra" w:cs="Latha"/>
+                <w:b/>
+                <w:sz w:val="36"/>
+                <w:szCs w:val="28"/>
+                <w:lang w:bidi="ta-IN"/>
+              </w:rPr>
+              <w:t>†</w:t>
+            </w:r>
+            <w:r>
+              <w:rPr>
+                <w:rFonts w:ascii="Latha" w:hAnsi="Latha" w:cs="Latha"/>
+                <w:sz w:val="28"/>
+                <w:szCs w:val="28"/>
+                <w:cs/>
+                <w:lang w:bidi="ta-IN"/>
+              </w:rPr>
+              <w:t>ண</w:t>
+            </w:r>
+            <w:r>
+              <w:rPr>
+                <w:rFonts w:ascii="Latha" w:hAnsi="Latha" w:cs="Latha"/>
+                <w:b/>
+                <w:bCs/>
+                <w:sz w:val="32"/>
+                <w:szCs w:val="32"/>
+                <w:cs/>
+                <w:lang w:bidi="ta-IN"/>
+              </w:rPr>
+              <w:t>:</w:t>
+            </w:r>
+            <w:r>
+              <w:rPr>
+                <w:rFonts w:ascii="Latha" w:hAnsi="Latha" w:cs="Latha"/>
+                <w:sz w:val="28"/>
+                <w:szCs w:val="28"/>
+                <w:cs/>
+                <w:lang w:bidi="ta-IN"/>
+              </w:rPr>
+              <w:t xml:space="preserve"> </w:t>
+            </w:r>
+            <w:r>
+              <w:rPr>
+                <w:rFonts w:ascii="Latha" w:hAnsi="Latha" w:cs="Latha"/>
+                <w:sz w:val="28"/>
+                <w:szCs w:val="28"/>
+                <w:lang w:bidi="ta-IN"/>
+              </w:rPr>
+              <w:t xml:space="preserve">| </w:t>
+            </w:r>
+            <w:r>
+              <w:rPr>
+                <w:rFonts w:ascii="Latha" w:hAnsi="Latha" w:cs="Latha"/>
+                <w:sz w:val="28"/>
+                <w:szCs w:val="28"/>
+                <w:cs/>
+                <w:lang w:bidi="ta-IN"/>
+              </w:rPr>
+              <w:t>ப்</w:t>
+            </w:r>
+            <w:r>
+              <w:rPr>
+                <w:rFonts w:ascii="Latha" w:hAnsi="Latha" w:cs="Latha"/>
+                <w:b/>
+                <w:bCs/>
+                <w:position w:val="-12"/>
+                <w:sz w:val="28"/>
+                <w:szCs w:val="28"/>
+                <w:cs/>
+                <w:lang w:bidi="ta-IN"/>
+              </w:rPr>
+              <w:t>3</w:t>
+            </w:r>
+            <w:r>
+              <w:rPr>
+                <w:rFonts w:ascii="Latha" w:hAnsi="Latha" w:cs="Latha"/>
+                <w:sz w:val="28"/>
+                <w:szCs w:val="28"/>
+                <w:cs/>
+                <w:lang w:bidi="ta-IN"/>
+              </w:rPr>
+              <w:t>ரஹ்ம</w:t>
+            </w:r>
+            <w:r>
+              <w:rPr>
+                <w:rFonts w:ascii="BRH Tamil Tab Extra" w:hAnsi="BRH Tamil Tab Extra" w:cs="Latha"/>
+                <w:b/>
+                <w:sz w:val="36"/>
+                <w:szCs w:val="28"/>
+                <w:lang w:bidi="ta-IN"/>
+              </w:rPr>
+              <w:t>†</w:t>
+            </w:r>
+            <w:r>
+              <w:rPr>
+                <w:rFonts w:ascii="Latha" w:hAnsi="Latha" w:cs="Latha"/>
+                <w:sz w:val="28"/>
+                <w:szCs w:val="28"/>
+                <w:cs/>
+                <w:lang w:bidi="ta-IN"/>
+              </w:rPr>
+              <w:t>ண</w:t>
+            </w:r>
+            <w:r>
+              <w:rPr>
+                <w:rFonts w:ascii="BRH Tamil Tab Extra" w:hAnsi="BRH Tamil Tab Extra" w:cs="Latha"/>
+                <w:b/>
+                <w:sz w:val="32"/>
+                <w:szCs w:val="28"/>
+                <w:lang w:bidi="ta-IN"/>
+              </w:rPr>
+              <w:t>…</w:t>
+            </w:r>
+            <w:r>
+              <w:rPr>
+                <w:rFonts w:ascii="Latha" w:hAnsi="Latha" w:cs="Latha"/>
+                <w:sz w:val="28"/>
+                <w:szCs w:val="28"/>
+                <w:lang w:bidi="ta-IN"/>
+              </w:rPr>
+              <w:t xml:space="preserve"> </w:t>
+            </w:r>
+            <w:r>
+              <w:rPr>
+                <w:rFonts w:ascii="Latha" w:hAnsi="Latha" w:cs="Latha"/>
+                <w:sz w:val="28"/>
+                <w:szCs w:val="28"/>
+                <w:cs/>
+                <w:lang w:bidi="ta-IN"/>
+              </w:rPr>
+              <w:t xml:space="preserve">உத் </w:t>
+            </w:r>
+            <w:r>
+              <w:rPr>
+                <w:rFonts w:ascii="Latha" w:hAnsi="Latha" w:cs="Latha"/>
+                <w:sz w:val="28"/>
+                <w:szCs w:val="28"/>
+                <w:lang w:bidi="ta-IN"/>
+              </w:rPr>
+              <w:t>|</w:t>
+            </w:r>
+          </w:p>
+        </w:tc>
+      </w:tr>
+    </w:tbl>
+    <w:p>
+      <w:pPr>
+        <w:jc w:val="center"/>
+        <w:rPr>
+          <w:b/>
+          <w:bCs/>
+          <w:sz w:val="32"/>
+          <w:szCs w:val="32"/>
+          <w:u w:val="single"/>
+        </w:rPr>
+      </w:pPr>
+    </w:p>
+    <w:p>
+      <w:pPr>
+        <w:spacing w:before="0" w:line="240" w:lineRule="auto"/>
+        <w:rPr>
+          <w:b/>
+          <w:bCs/>
+          <w:sz w:val="32"/>
+          <w:szCs w:val="32"/>
+          <w:u w:val="single"/>
+        </w:rPr>
+      </w:pPr>
+    </w:p>
     <w:p>
       <w:pPr>
         <w:jc w:val="center"/>
@@ -23,7 +2013,6 @@
         </w:rPr>
         <w:t xml:space="preserve">TS </w:t>
       </w:r>
-      <w:proofErr w:type="spellStart"/>
       <w:r>
         <w:rPr>
           <w:b/>
@@ -34,7 +2023,6 @@
         </w:rPr>
         <w:t>Krama</w:t>
       </w:r>
-      <w:proofErr w:type="spellEnd"/>
       <w:r>
         <w:rPr>
           <w:b/>
@@ -43,29 +2031,7 @@
           <w:szCs w:val="32"/>
           <w:u w:val="single"/>
         </w:rPr>
-        <w:t xml:space="preserve"> </w:t>
-      </w:r>
-      <w:proofErr w:type="spellStart"/>
-      <w:r>
-        <w:rPr>
-          <w:b/>
-          <w:bCs/>
-          <w:sz w:val="32"/>
-          <w:szCs w:val="32"/>
-          <w:u w:val="single"/>
-        </w:rPr>
-        <w:t>Paatam</w:t>
-      </w:r>
-      <w:proofErr w:type="spellEnd"/>
-      <w:r>
-        <w:rPr>
-          <w:b/>
-          <w:bCs/>
-          <w:sz w:val="32"/>
-          <w:szCs w:val="32"/>
-          <w:u w:val="single"/>
-        </w:rPr>
-        <w:t xml:space="preserve"> – TS </w:t>
+        <w:t xml:space="preserve"> Paatam – TS </w:t>
       </w:r>
       <w:r>
         <w:rPr>
@@ -276,6 +2242,7 @@
                 <w:sz w:val="28"/>
                 <w:szCs w:val="28"/>
               </w:rPr>
+              <w:lastRenderedPageBreak/>
               <w:t>TS 2.3.2.8</w:t>
             </w:r>
             <w:r>
@@ -294,19 +2261,8 @@
                 <w:sz w:val="28"/>
                 <w:szCs w:val="28"/>
               </w:rPr>
-              <w:t xml:space="preserve">- </w:t>
-            </w:r>
-            <w:proofErr w:type="spellStart"/>
-            <w:r>
-              <w:rPr>
-                <w:rFonts w:cs="Arial"/>
-                <w:b/>
-                <w:sz w:val="28"/>
-                <w:szCs w:val="28"/>
-              </w:rPr>
-              <w:t>Kramam</w:t>
-            </w:r>
-            <w:proofErr w:type="spellEnd"/>
+              <w:t>- Kramam</w:t>
+            </w:r>
           </w:p>
           <w:p>
             <w:pPr>
@@ -327,27 +2283,15 @@
                 <w:szCs w:val="32"/>
               </w:rPr>
             </w:pPr>
-            <w:proofErr w:type="spellStart"/>
-            <w:r>
-              <w:rPr>
-                <w:rFonts w:cs="Arial"/>
-                <w:b/>
-                <w:sz w:val="28"/>
-                <w:szCs w:val="28"/>
-              </w:rPr>
-              <w:t>Krama</w:t>
-            </w:r>
-            <w:proofErr w:type="spellEnd"/>
-            <w:r>
-              <w:rPr>
-                <w:rFonts w:cs="Arial"/>
-                <w:b/>
-                <w:sz w:val="28"/>
-                <w:szCs w:val="28"/>
-              </w:rPr>
-              <w:t xml:space="preserve"> </w:t>
-            </w:r>
-            <w:proofErr w:type="spellStart"/>
+            <w:r>
+              <w:rPr>
+                <w:rFonts w:cs="Arial"/>
+                <w:b/>
+                <w:sz w:val="28"/>
+                <w:szCs w:val="28"/>
+              </w:rPr>
+              <w:t xml:space="preserve">Krama </w:t>
+            </w:r>
             <w:r>
               <w:rPr>
                 <w:rFonts w:cs="Arial"/>
@@ -357,7 +2301,6 @@
               </w:rPr>
               <w:t>Vaakyam</w:t>
             </w:r>
-            <w:proofErr w:type="spellEnd"/>
             <w:r>
               <w:rPr>
                 <w:rFonts w:cs="Arial"/>
@@ -384,26 +2327,7 @@
                 <w:szCs w:val="28"/>
               </w:rPr>
               <w:br/>
-            </w:r>
-            <w:proofErr w:type="spellStart"/>
-            <w:r>
-              <w:rPr>
-                <w:rFonts w:cs="Arial"/>
-                <w:b/>
-                <w:sz w:val="28"/>
-                <w:szCs w:val="28"/>
-              </w:rPr>
-              <w:t>Panchaati</w:t>
-            </w:r>
-            <w:proofErr w:type="spellEnd"/>
-            <w:r>
-              <w:rPr>
-                <w:rFonts w:cs="Arial"/>
-                <w:b/>
-                <w:sz w:val="28"/>
-                <w:szCs w:val="28"/>
-              </w:rPr>
-              <w:t xml:space="preserve"> </w:t>
+              <w:t xml:space="preserve">Panchaati </w:t>
             </w:r>
             <w:r>
               <w:rPr>
@@ -430,25 +2354,14 @@
                 <w:szCs w:val="40"/>
               </w:rPr>
             </w:pPr>
-            <w:proofErr w:type="spellStart"/>
-            <w:r>
-              <w:rPr>
-                <w:rFonts w:ascii="BRH Devanagari Extra" w:hAnsi="BRH Devanagari Extra" w:cs="BRH Devanagari Extra"/>
-                <w:color w:val="000000"/>
-                <w:sz w:val="40"/>
-                <w:szCs w:val="40"/>
-              </w:rPr>
-              <w:t>bÉ</w:t>
-            </w:r>
-            <w:proofErr w:type="spellEnd"/>
-            <w:r>
-              <w:rPr>
-                <w:rFonts w:ascii="BRH Devanagari Extra" w:hAnsi="BRH Devanagari Extra" w:cs="BRH Devanagari Extra"/>
-                <w:color w:val="000000"/>
-                <w:sz w:val="40"/>
-                <w:szCs w:val="40"/>
-              </w:rPr>
-              <w:t>×</w:t>
+            <w:r>
+              <w:rPr>
+                <w:rFonts w:ascii="BRH Devanagari Extra" w:hAnsi="BRH Devanagari Extra" w:cs="BRH Devanagari Extra"/>
+                <w:color w:val="000000"/>
+                <w:sz w:val="40"/>
+                <w:szCs w:val="40"/>
+              </w:rPr>
+              <w:t>bÉ×</w:t>
             </w:r>
             <w:r>
               <w:rPr>
@@ -571,25 +2484,14 @@
                 <w:szCs w:val="40"/>
               </w:rPr>
             </w:pPr>
-            <w:proofErr w:type="spellStart"/>
-            <w:r>
-              <w:rPr>
-                <w:rFonts w:ascii="BRH Devanagari Extra" w:hAnsi="BRH Devanagari Extra" w:cs="BRH Devanagari Extra"/>
-                <w:color w:val="000000"/>
-                <w:sz w:val="40"/>
-                <w:szCs w:val="40"/>
-              </w:rPr>
-              <w:t>bÉ</w:t>
-            </w:r>
-            <w:proofErr w:type="spellEnd"/>
-            <w:r>
-              <w:rPr>
-                <w:rFonts w:ascii="BRH Devanagari Extra" w:hAnsi="BRH Devanagari Extra" w:cs="BRH Devanagari Extra"/>
-                <w:color w:val="000000"/>
-                <w:sz w:val="40"/>
-                <w:szCs w:val="40"/>
-              </w:rPr>
-              <w:t>×</w:t>
+            <w:r>
+              <w:rPr>
+                <w:rFonts w:ascii="BRH Devanagari Extra" w:hAnsi="BRH Devanagari Extra" w:cs="BRH Devanagari Extra"/>
+                <w:color w:val="000000"/>
+                <w:sz w:val="40"/>
+                <w:szCs w:val="40"/>
+              </w:rPr>
+              <w:t>bÉ×</w:t>
             </w:r>
             <w:r>
               <w:rPr>
@@ -748,19 +2650,8 @@
                 <w:sz w:val="28"/>
                 <w:szCs w:val="28"/>
               </w:rPr>
-              <w:t xml:space="preserve">- </w:t>
-            </w:r>
-            <w:proofErr w:type="spellStart"/>
-            <w:r>
-              <w:rPr>
-                <w:rFonts w:cs="Arial"/>
-                <w:b/>
-                <w:sz w:val="28"/>
-                <w:szCs w:val="28"/>
-              </w:rPr>
-              <w:t>Kramam</w:t>
-            </w:r>
-            <w:proofErr w:type="spellEnd"/>
+              <w:t>- Kramam</w:t>
+            </w:r>
           </w:p>
           <w:p>
             <w:pPr>
@@ -781,27 +2672,15 @@
                 <w:szCs w:val="32"/>
               </w:rPr>
             </w:pPr>
-            <w:proofErr w:type="spellStart"/>
-            <w:r>
-              <w:rPr>
-                <w:rFonts w:cs="Arial"/>
-                <w:b/>
-                <w:sz w:val="28"/>
-                <w:szCs w:val="28"/>
-              </w:rPr>
-              <w:t>Krama</w:t>
-            </w:r>
-            <w:proofErr w:type="spellEnd"/>
-            <w:r>
-              <w:rPr>
-                <w:rFonts w:cs="Arial"/>
-                <w:b/>
-                <w:sz w:val="28"/>
-                <w:szCs w:val="28"/>
-              </w:rPr>
-              <w:t xml:space="preserve"> </w:t>
-            </w:r>
-            <w:proofErr w:type="spellStart"/>
+            <w:r>
+              <w:rPr>
+                <w:rFonts w:cs="Arial"/>
+                <w:b/>
+                <w:sz w:val="28"/>
+                <w:szCs w:val="28"/>
+              </w:rPr>
+              <w:t xml:space="preserve">Krama </w:t>
+            </w:r>
             <w:r>
               <w:rPr>
                 <w:rFonts w:cs="Arial"/>
@@ -811,7 +2690,6 @@
               </w:rPr>
               <w:t>Vaakyam</w:t>
             </w:r>
-            <w:proofErr w:type="spellEnd"/>
             <w:r>
               <w:rPr>
                 <w:rFonts w:cs="Arial"/>
@@ -838,26 +2716,7 @@
                 <w:szCs w:val="28"/>
               </w:rPr>
               <w:br/>
-            </w:r>
-            <w:proofErr w:type="spellStart"/>
-            <w:r>
-              <w:rPr>
-                <w:rFonts w:cs="Arial"/>
-                <w:b/>
-                <w:sz w:val="28"/>
-                <w:szCs w:val="28"/>
-              </w:rPr>
-              <w:t>Panchaati</w:t>
-            </w:r>
-            <w:proofErr w:type="spellEnd"/>
-            <w:r>
-              <w:rPr>
-                <w:rFonts w:cs="Arial"/>
-                <w:b/>
-                <w:sz w:val="28"/>
-                <w:szCs w:val="28"/>
-              </w:rPr>
-              <w:t xml:space="preserve"> </w:t>
+              <w:t xml:space="preserve">Panchaati </w:t>
             </w:r>
             <w:r>
               <w:rPr>
@@ -1000,7 +2859,6 @@
               </w:rPr>
               <w:t>–</w:t>
             </w:r>
-            <w:proofErr w:type="spellStart"/>
             <w:r>
               <w:rPr>
                 <w:rFonts w:ascii="BRH Devanagari Extra" w:hAnsi="BRH Devanagari Extra" w:cs="BRH Devanagari Extra"/>
@@ -1010,36 +2868,24 @@
               </w:rPr>
               <w:t>xÉ</w:t>
             </w:r>
-            <w:proofErr w:type="spellEnd"/>
-            <w:r>
-              <w:rPr>
-                <w:rFonts w:ascii="BRH Malayalam Extra" w:hAnsi="BRH Malayalam Extra" w:cs="BRH Devanagari Extra"/>
-                <w:b/>
-                <w:color w:val="000000"/>
-                <w:sz w:val="32"/>
-                <w:szCs w:val="40"/>
-              </w:rPr>
-              <w:t>–</w:t>
-            </w:r>
-            <w:proofErr w:type="spellStart"/>
-            <w:r>
-              <w:rPr>
-                <w:rFonts w:ascii="BRH Devanagari Extra" w:hAnsi="BRH Devanagari Extra" w:cs="BRH Devanagari Extra"/>
-                <w:color w:val="000000"/>
-                <w:sz w:val="40"/>
-                <w:szCs w:val="40"/>
-              </w:rPr>
-              <w:t>lÉç</w:t>
-            </w:r>
-            <w:proofErr w:type="spellEnd"/>
-            <w:r>
-              <w:rPr>
-                <w:rFonts w:ascii="BRH Devanagari Extra" w:hAnsi="BRH Devanagari Extra" w:cs="BRH Devanagari Extra"/>
-                <w:color w:val="000000"/>
-                <w:sz w:val="40"/>
-                <w:szCs w:val="40"/>
-              </w:rPr>
-              <w:t xml:space="preserve"> </w:t>
+            <w:r>
+              <w:rPr>
+                <w:rFonts w:ascii="BRH Malayalam Extra" w:hAnsi="BRH Malayalam Extra" w:cs="BRH Devanagari Extra"/>
+                <w:b/>
+                <w:color w:val="000000"/>
+                <w:sz w:val="32"/>
+                <w:szCs w:val="40"/>
+              </w:rPr>
+              <w:t>–</w:t>
+            </w:r>
+            <w:r>
+              <w:rPr>
+                <w:rFonts w:ascii="BRH Devanagari Extra" w:hAnsi="BRH Devanagari Extra" w:cs="BRH Devanagari Extra"/>
+                <w:color w:val="000000"/>
+                <w:sz w:val="40"/>
+                <w:szCs w:val="40"/>
+              </w:rPr>
+              <w:t xml:space="preserve">lÉç </w:t>
             </w:r>
             <w:proofErr w:type="spellStart"/>
             <w:r>
@@ -1176,7 +3022,6 @@
               </w:rPr>
               <w:t>–</w:t>
             </w:r>
-            <w:proofErr w:type="spellStart"/>
             <w:r>
               <w:rPr>
                 <w:rFonts w:ascii="BRH Devanagari Extra" w:hAnsi="BRH Devanagari Extra" w:cs="BRH Devanagari Extra"/>
@@ -1186,36 +3031,24 @@
               </w:rPr>
               <w:t>xÉ</w:t>
             </w:r>
-            <w:proofErr w:type="spellEnd"/>
-            <w:r>
-              <w:rPr>
-                <w:rFonts w:ascii="BRH Malayalam Extra" w:hAnsi="BRH Malayalam Extra" w:cs="BRH Devanagari Extra"/>
-                <w:b/>
-                <w:color w:val="000000"/>
-                <w:sz w:val="32"/>
-                <w:szCs w:val="40"/>
-              </w:rPr>
-              <w:t>–</w:t>
-            </w:r>
-            <w:proofErr w:type="spellStart"/>
-            <w:r>
-              <w:rPr>
-                <w:rFonts w:ascii="BRH Devanagari Extra" w:hAnsi="BRH Devanagari Extra" w:cs="BRH Devanagari Extra"/>
-                <w:color w:val="000000"/>
-                <w:sz w:val="40"/>
-                <w:szCs w:val="40"/>
-              </w:rPr>
-              <w:t>lÉç</w:t>
-            </w:r>
-            <w:proofErr w:type="spellEnd"/>
-            <w:r>
-              <w:rPr>
-                <w:rFonts w:ascii="BRH Devanagari Extra" w:hAnsi="BRH Devanagari Extra" w:cs="BRH Devanagari Extra"/>
-                <w:color w:val="000000"/>
-                <w:sz w:val="40"/>
-                <w:szCs w:val="40"/>
-              </w:rPr>
-              <w:t xml:space="preserve"> </w:t>
+            <w:r>
+              <w:rPr>
+                <w:rFonts w:ascii="BRH Malayalam Extra" w:hAnsi="BRH Malayalam Extra" w:cs="BRH Devanagari Extra"/>
+                <w:b/>
+                <w:color w:val="000000"/>
+                <w:sz w:val="32"/>
+                <w:szCs w:val="40"/>
+              </w:rPr>
+              <w:t>–</w:t>
+            </w:r>
+            <w:r>
+              <w:rPr>
+                <w:rFonts w:ascii="BRH Devanagari Extra" w:hAnsi="BRH Devanagari Extra" w:cs="BRH Devanagari Extra"/>
+                <w:color w:val="000000"/>
+                <w:sz w:val="40"/>
+                <w:szCs w:val="40"/>
+              </w:rPr>
+              <w:t xml:space="preserve">lÉç </w:t>
             </w:r>
             <w:proofErr w:type="spellStart"/>
             <w:r>
@@ -1293,19 +3126,8 @@
                 <w:sz w:val="28"/>
                 <w:szCs w:val="28"/>
               </w:rPr>
-              <w:t xml:space="preserve">- </w:t>
-            </w:r>
-            <w:proofErr w:type="spellStart"/>
-            <w:r>
-              <w:rPr>
-                <w:rFonts w:cs="Arial"/>
-                <w:b/>
-                <w:sz w:val="28"/>
-                <w:szCs w:val="28"/>
-              </w:rPr>
-              <w:t>Kramam</w:t>
-            </w:r>
-            <w:proofErr w:type="spellEnd"/>
+              <w:t>- Kramam</w:t>
+            </w:r>
           </w:p>
           <w:p>
             <w:pPr>
@@ -1326,27 +3148,15 @@
                 <w:szCs w:val="32"/>
               </w:rPr>
             </w:pPr>
-            <w:proofErr w:type="spellStart"/>
-            <w:r>
-              <w:rPr>
-                <w:rFonts w:cs="Arial"/>
-                <w:b/>
-                <w:sz w:val="28"/>
-                <w:szCs w:val="28"/>
-              </w:rPr>
-              <w:t>Krama</w:t>
-            </w:r>
-            <w:proofErr w:type="spellEnd"/>
-            <w:r>
-              <w:rPr>
-                <w:rFonts w:cs="Arial"/>
-                <w:b/>
-                <w:sz w:val="28"/>
-                <w:szCs w:val="28"/>
-              </w:rPr>
-              <w:t xml:space="preserve"> </w:t>
-            </w:r>
-            <w:proofErr w:type="spellStart"/>
+            <w:r>
+              <w:rPr>
+                <w:rFonts w:cs="Arial"/>
+                <w:b/>
+                <w:sz w:val="28"/>
+                <w:szCs w:val="28"/>
+              </w:rPr>
+              <w:t xml:space="preserve">Krama </w:t>
+            </w:r>
             <w:r>
               <w:rPr>
                 <w:rFonts w:cs="Arial"/>
@@ -1356,7 +3166,6 @@
               </w:rPr>
               <w:t>Vaakyam</w:t>
             </w:r>
-            <w:proofErr w:type="spellEnd"/>
             <w:r>
               <w:rPr>
                 <w:rFonts w:cs="Arial"/>
@@ -1383,26 +3192,7 @@
                 <w:szCs w:val="28"/>
               </w:rPr>
               <w:br/>
-            </w:r>
-            <w:proofErr w:type="spellStart"/>
-            <w:r>
-              <w:rPr>
-                <w:rFonts w:cs="Arial"/>
-                <w:b/>
-                <w:sz w:val="28"/>
-                <w:szCs w:val="28"/>
-              </w:rPr>
-              <w:t>Panchaati</w:t>
-            </w:r>
-            <w:proofErr w:type="spellEnd"/>
-            <w:r>
-              <w:rPr>
-                <w:rFonts w:cs="Arial"/>
-                <w:b/>
-                <w:sz w:val="28"/>
-                <w:szCs w:val="28"/>
-              </w:rPr>
-              <w:t xml:space="preserve"> </w:t>
+              <w:t xml:space="preserve">Panchaati </w:t>
             </w:r>
             <w:r>
               <w:rPr>
@@ -1535,30 +3325,18 @@
                 <w:sz w:val="40"/>
                 <w:szCs w:val="40"/>
               </w:rPr>
-              <w:t xml:space="preserve"> - </w:t>
-            </w:r>
-            <w:proofErr w:type="spellStart"/>
-            <w:r>
-              <w:rPr>
-                <w:rFonts w:ascii="BRH Devanagari Extra" w:hAnsi="BRH Devanagari Extra" w:cs="BRH Devanagari Extra"/>
-                <w:color w:val="000000"/>
-                <w:sz w:val="40"/>
-                <w:szCs w:val="40"/>
-              </w:rPr>
-              <w:t>qÉ</w:t>
-            </w:r>
-            <w:proofErr w:type="spellEnd"/>
-            <w:r>
-              <w:rPr>
-                <w:rFonts w:ascii="BRH Malayalam Extra" w:hAnsi="BRH Malayalam Extra" w:cs="BRH Devanagari Extra"/>
-                <w:b/>
-                <w:color w:val="000000"/>
-                <w:sz w:val="32"/>
-                <w:szCs w:val="40"/>
-              </w:rPr>
-              <w:t>–</w:t>
-            </w:r>
-            <w:proofErr w:type="spellStart"/>
+              <w:t xml:space="preserve"> - qÉ</w:t>
+            </w:r>
+            <w:r>
+              <w:rPr>
+                <w:rFonts w:ascii="BRH Malayalam Extra" w:hAnsi="BRH Malayalam Extra" w:cs="BRH Devanagari Extra"/>
+                <w:b/>
+                <w:color w:val="000000"/>
+                <w:sz w:val="32"/>
+                <w:szCs w:val="40"/>
+              </w:rPr>
+              <w:t>–</w:t>
+            </w:r>
             <w:r>
               <w:rPr>
                 <w:rFonts w:ascii="BRH Devanagari Extra" w:hAnsi="BRH Devanagari Extra" w:cs="BRH Devanagari Extra"/>
@@ -1568,7 +3346,6 @@
               </w:rPr>
               <w:t>lÉ</w:t>
             </w:r>
-            <w:proofErr w:type="spellEnd"/>
             <w:r>
               <w:rPr>
                 <w:rFonts w:ascii="BRH Malayalam Extra" w:hAnsi="BRH Malayalam Extra" w:cs="BRH Devanagari Extra"/>
@@ -1735,30 +3512,18 @@
                 <w:sz w:val="40"/>
                 <w:szCs w:val="40"/>
               </w:rPr>
-              <w:t xml:space="preserve"> - </w:t>
-            </w:r>
-            <w:proofErr w:type="spellStart"/>
-            <w:r>
-              <w:rPr>
-                <w:rFonts w:ascii="BRH Devanagari Extra" w:hAnsi="BRH Devanagari Extra" w:cs="BRH Devanagari Extra"/>
-                <w:color w:val="000000"/>
-                <w:sz w:val="40"/>
-                <w:szCs w:val="40"/>
-              </w:rPr>
-              <w:t>qÉ</w:t>
-            </w:r>
-            <w:proofErr w:type="spellEnd"/>
-            <w:r>
-              <w:rPr>
-                <w:rFonts w:ascii="BRH Malayalam Extra" w:hAnsi="BRH Malayalam Extra" w:cs="BRH Devanagari Extra"/>
-                <w:b/>
-                <w:color w:val="000000"/>
-                <w:sz w:val="32"/>
-                <w:szCs w:val="40"/>
-              </w:rPr>
-              <w:t>–</w:t>
-            </w:r>
-            <w:proofErr w:type="spellStart"/>
+              <w:t xml:space="preserve"> - qÉ</w:t>
+            </w:r>
+            <w:r>
+              <w:rPr>
+                <w:rFonts w:ascii="BRH Malayalam Extra" w:hAnsi="BRH Malayalam Extra" w:cs="BRH Devanagari Extra"/>
+                <w:b/>
+                <w:color w:val="000000"/>
+                <w:sz w:val="32"/>
+                <w:szCs w:val="40"/>
+              </w:rPr>
+              <w:t>–</w:t>
+            </w:r>
             <w:r>
               <w:rPr>
                 <w:rFonts w:ascii="BRH Devanagari Extra" w:hAnsi="BRH Devanagari Extra" w:cs="BRH Devanagari Extra"/>
@@ -1768,7 +3533,6 @@
               </w:rPr>
               <w:t>lÉ</w:t>
             </w:r>
-            <w:proofErr w:type="spellEnd"/>
             <w:r>
               <w:rPr>
                 <w:rFonts w:ascii="BRH Malayalam Extra" w:hAnsi="BRH Malayalam Extra" w:cs="BRH Devanagari Extra"/>
@@ -1883,19 +3647,8 @@
                 <w:sz w:val="28"/>
                 <w:szCs w:val="28"/>
               </w:rPr>
-              <w:t xml:space="preserve">- </w:t>
-            </w:r>
-            <w:proofErr w:type="spellStart"/>
-            <w:r>
-              <w:rPr>
-                <w:rFonts w:cs="Arial"/>
-                <w:b/>
-                <w:sz w:val="28"/>
-                <w:szCs w:val="28"/>
-              </w:rPr>
-              <w:t>Kramam</w:t>
-            </w:r>
-            <w:proofErr w:type="spellEnd"/>
+              <w:t>- Kramam</w:t>
+            </w:r>
           </w:p>
           <w:p>
             <w:pPr>
@@ -1916,27 +3669,15 @@
                 <w:szCs w:val="32"/>
               </w:rPr>
             </w:pPr>
-            <w:proofErr w:type="spellStart"/>
-            <w:r>
-              <w:rPr>
-                <w:rFonts w:cs="Arial"/>
-                <w:b/>
-                <w:sz w:val="28"/>
-                <w:szCs w:val="28"/>
-              </w:rPr>
-              <w:t>Krama</w:t>
-            </w:r>
-            <w:proofErr w:type="spellEnd"/>
-            <w:r>
-              <w:rPr>
-                <w:rFonts w:cs="Arial"/>
-                <w:b/>
-                <w:sz w:val="28"/>
-                <w:szCs w:val="28"/>
-              </w:rPr>
-              <w:t xml:space="preserve"> </w:t>
-            </w:r>
-            <w:proofErr w:type="spellStart"/>
+            <w:r>
+              <w:rPr>
+                <w:rFonts w:cs="Arial"/>
+                <w:b/>
+                <w:sz w:val="28"/>
+                <w:szCs w:val="28"/>
+              </w:rPr>
+              <w:t xml:space="preserve">Krama </w:t>
+            </w:r>
             <w:r>
               <w:rPr>
                 <w:rFonts w:cs="Arial"/>
@@ -1946,7 +3687,6 @@
               </w:rPr>
               <w:t>Vaakyam</w:t>
             </w:r>
-            <w:proofErr w:type="spellEnd"/>
             <w:r>
               <w:rPr>
                 <w:rFonts w:cs="Arial"/>
@@ -1982,26 +3722,7 @@
                 <w:szCs w:val="28"/>
               </w:rPr>
               <w:br/>
-            </w:r>
-            <w:proofErr w:type="spellStart"/>
-            <w:r>
-              <w:rPr>
-                <w:rFonts w:cs="Arial"/>
-                <w:b/>
-                <w:sz w:val="28"/>
-                <w:szCs w:val="28"/>
-              </w:rPr>
-              <w:t>Panchaati</w:t>
-            </w:r>
-            <w:proofErr w:type="spellEnd"/>
-            <w:r>
-              <w:rPr>
-                <w:rFonts w:cs="Arial"/>
-                <w:b/>
-                <w:sz w:val="28"/>
-                <w:szCs w:val="28"/>
-              </w:rPr>
-              <w:t xml:space="preserve"> </w:t>
+              <w:t xml:space="preserve">Panchaati </w:t>
             </w:r>
             <w:r>
               <w:rPr>
@@ -2293,19 +4014,8 @@
                 <w:sz w:val="28"/>
                 <w:szCs w:val="28"/>
               </w:rPr>
-              <w:t xml:space="preserve">- </w:t>
-            </w:r>
-            <w:proofErr w:type="spellStart"/>
-            <w:r>
-              <w:rPr>
-                <w:rFonts w:cs="Arial"/>
-                <w:b/>
-                <w:sz w:val="28"/>
-                <w:szCs w:val="28"/>
-              </w:rPr>
-              <w:t>Kramam</w:t>
-            </w:r>
-            <w:proofErr w:type="spellEnd"/>
+              <w:t>- Kramam</w:t>
+            </w:r>
           </w:p>
           <w:p>
             <w:pPr>
@@ -2326,27 +4036,15 @@
                 <w:szCs w:val="32"/>
               </w:rPr>
             </w:pPr>
-            <w:proofErr w:type="spellStart"/>
-            <w:r>
-              <w:rPr>
-                <w:rFonts w:cs="Arial"/>
-                <w:b/>
-                <w:sz w:val="28"/>
-                <w:szCs w:val="28"/>
-              </w:rPr>
-              <w:t>Krama</w:t>
-            </w:r>
-            <w:proofErr w:type="spellEnd"/>
-            <w:r>
-              <w:rPr>
-                <w:rFonts w:cs="Arial"/>
-                <w:b/>
-                <w:sz w:val="28"/>
-                <w:szCs w:val="28"/>
-              </w:rPr>
-              <w:t xml:space="preserve"> </w:t>
-            </w:r>
-            <w:proofErr w:type="spellStart"/>
+            <w:r>
+              <w:rPr>
+                <w:rFonts w:cs="Arial"/>
+                <w:b/>
+                <w:sz w:val="28"/>
+                <w:szCs w:val="28"/>
+              </w:rPr>
+              <w:t xml:space="preserve">Krama </w:t>
+            </w:r>
             <w:r>
               <w:rPr>
                 <w:rFonts w:cs="Arial"/>
@@ -2356,7 +4054,6 @@
               </w:rPr>
               <w:t>Vaakyam</w:t>
             </w:r>
-            <w:proofErr w:type="spellEnd"/>
             <w:r>
               <w:rPr>
                 <w:rFonts w:cs="Arial"/>
@@ -2383,26 +4080,7 @@
                 <w:szCs w:val="28"/>
               </w:rPr>
               <w:br/>
-            </w:r>
-            <w:proofErr w:type="spellStart"/>
-            <w:r>
-              <w:rPr>
-                <w:rFonts w:cs="Arial"/>
-                <w:b/>
-                <w:sz w:val="28"/>
-                <w:szCs w:val="28"/>
-              </w:rPr>
-              <w:t>Panchaati</w:t>
-            </w:r>
-            <w:proofErr w:type="spellEnd"/>
-            <w:r>
-              <w:rPr>
-                <w:rFonts w:cs="Arial"/>
-                <w:b/>
-                <w:sz w:val="28"/>
-                <w:szCs w:val="28"/>
-              </w:rPr>
-              <w:t xml:space="preserve"> </w:t>
+              <w:t xml:space="preserve">Panchaati </w:t>
             </w:r>
             <w:r>
               <w:rPr>
@@ -2475,7 +4153,6 @@
               </w:rPr>
               <w:t>–</w:t>
             </w:r>
-            <w:proofErr w:type="spellStart"/>
             <w:r>
               <w:rPr>
                 <w:rFonts w:ascii="BRH Devanagari Extra" w:hAnsi="BRH Devanagari Extra" w:cs="BRH Devanagari Extra"/>
@@ -2485,7 +4162,6 @@
               </w:rPr>
               <w:t>uÉ</w:t>
             </w:r>
-            <w:proofErr w:type="spellEnd"/>
             <w:r>
               <w:rPr>
                 <w:rFonts w:ascii="BRH Malayalam Extra" w:hAnsi="BRH Malayalam Extra" w:cs="BRH Devanagari Extra"/>
@@ -2552,19 +4228,8 @@
                 <w:sz w:val="40"/>
                 <w:szCs w:val="40"/>
               </w:rPr>
-              <w:t xml:space="preserve"> - </w:t>
-            </w:r>
-            <w:proofErr w:type="spellStart"/>
-            <w:r>
-              <w:rPr>
-                <w:rFonts w:ascii="BRH Devanagari Extra" w:hAnsi="BRH Devanagari Extra" w:cs="BRH Devanagari Extra"/>
-                <w:color w:val="000000"/>
-                <w:sz w:val="40"/>
-                <w:szCs w:val="40"/>
-              </w:rPr>
-              <w:t>uÉ</w:t>
-            </w:r>
-            <w:proofErr w:type="spellEnd"/>
+              <w:t xml:space="preserve"> - uÉ</w:t>
+            </w:r>
             <w:r>
               <w:rPr>
                 <w:rFonts w:ascii="BRH Malayalam Extra" w:hAnsi="BRH Malayalam Extra" w:cs="BRH Devanagari Extra"/>
@@ -2690,7 +4355,6 @@
               </w:rPr>
               <w:t>–</w:t>
             </w:r>
-            <w:proofErr w:type="spellStart"/>
             <w:r>
               <w:rPr>
                 <w:rFonts w:ascii="BRH Devanagari Extra" w:hAnsi="BRH Devanagari Extra" w:cs="BRH Devanagari Extra"/>
@@ -2700,7 +4364,6 @@
               </w:rPr>
               <w:t>uÉ</w:t>
             </w:r>
-            <w:proofErr w:type="spellEnd"/>
             <w:r>
               <w:rPr>
                 <w:rFonts w:ascii="BRH Malayalam Extra" w:hAnsi="BRH Malayalam Extra" w:cs="BRH Devanagari Extra"/>
@@ -2767,19 +4430,8 @@
                 <w:sz w:val="40"/>
                 <w:szCs w:val="40"/>
               </w:rPr>
-              <w:t xml:space="preserve"> - </w:t>
-            </w:r>
-            <w:proofErr w:type="spellStart"/>
-            <w:r>
-              <w:rPr>
-                <w:rFonts w:ascii="BRH Devanagari Extra" w:hAnsi="BRH Devanagari Extra" w:cs="BRH Devanagari Extra"/>
-                <w:color w:val="000000"/>
-                <w:sz w:val="40"/>
-                <w:szCs w:val="40"/>
-              </w:rPr>
-              <w:t>uÉ</w:t>
-            </w:r>
-            <w:proofErr w:type="spellEnd"/>
+              <w:t xml:space="preserve"> - uÉ</w:t>
+            </w:r>
             <w:r>
               <w:rPr>
                 <w:rFonts w:ascii="BRH Malayalam Extra" w:hAnsi="BRH Malayalam Extra" w:cs="BRH Devanagari Extra"/>
@@ -2895,19 +4547,8 @@
                 <w:sz w:val="28"/>
                 <w:szCs w:val="28"/>
               </w:rPr>
-              <w:t xml:space="preserve">- </w:t>
-            </w:r>
-            <w:proofErr w:type="spellStart"/>
-            <w:r>
-              <w:rPr>
-                <w:rFonts w:cs="Arial"/>
-                <w:b/>
-                <w:sz w:val="28"/>
-                <w:szCs w:val="28"/>
-              </w:rPr>
-              <w:t>Kramam</w:t>
-            </w:r>
-            <w:proofErr w:type="spellEnd"/>
+              <w:t>- Kramam</w:t>
+            </w:r>
           </w:p>
           <w:p>
             <w:pPr>
@@ -2928,27 +4569,15 @@
                 <w:szCs w:val="32"/>
               </w:rPr>
             </w:pPr>
-            <w:proofErr w:type="spellStart"/>
-            <w:r>
-              <w:rPr>
-                <w:rFonts w:cs="Arial"/>
-                <w:b/>
-                <w:sz w:val="28"/>
-                <w:szCs w:val="28"/>
-              </w:rPr>
-              <w:t>Krama</w:t>
-            </w:r>
-            <w:proofErr w:type="spellEnd"/>
-            <w:r>
-              <w:rPr>
-                <w:rFonts w:cs="Arial"/>
-                <w:b/>
-                <w:sz w:val="28"/>
-                <w:szCs w:val="28"/>
-              </w:rPr>
-              <w:t xml:space="preserve"> </w:t>
-            </w:r>
-            <w:proofErr w:type="spellStart"/>
+            <w:r>
+              <w:rPr>
+                <w:rFonts w:cs="Arial"/>
+                <w:b/>
+                <w:sz w:val="28"/>
+                <w:szCs w:val="28"/>
+              </w:rPr>
+              <w:t xml:space="preserve">Krama </w:t>
+            </w:r>
             <w:r>
               <w:rPr>
                 <w:rFonts w:cs="Arial"/>
@@ -2958,7 +4587,6 @@
               </w:rPr>
               <w:t>Vaakyam</w:t>
             </w:r>
-            <w:proofErr w:type="spellEnd"/>
             <w:r>
               <w:rPr>
                 <w:rFonts w:cs="Arial"/>
@@ -2985,26 +4613,7 @@
                 <w:szCs w:val="28"/>
               </w:rPr>
               <w:br/>
-            </w:r>
-            <w:proofErr w:type="spellStart"/>
-            <w:r>
-              <w:rPr>
-                <w:rFonts w:cs="Arial"/>
-                <w:b/>
-                <w:sz w:val="28"/>
-                <w:szCs w:val="28"/>
-              </w:rPr>
-              <w:t>Panchaati</w:t>
-            </w:r>
-            <w:proofErr w:type="spellEnd"/>
-            <w:r>
-              <w:rPr>
-                <w:rFonts w:cs="Arial"/>
-                <w:b/>
-                <w:sz w:val="28"/>
-                <w:szCs w:val="28"/>
-              </w:rPr>
-              <w:t xml:space="preserve"> </w:t>
+              <w:t xml:space="preserve">Panchaati </w:t>
             </w:r>
             <w:r>
               <w:rPr>
@@ -3056,25 +4665,14 @@
               </w:rPr>
               <w:t>–</w:t>
             </w:r>
-            <w:proofErr w:type="spellStart"/>
-            <w:r>
-              <w:rPr>
-                <w:rFonts w:ascii="BRH Devanagari Extra" w:hAnsi="BRH Devanagari Extra" w:cs="BRH Devanagari Extra"/>
-                <w:color w:val="000000"/>
-                <w:sz w:val="40"/>
-                <w:szCs w:val="40"/>
-              </w:rPr>
-              <w:t>uÉ</w:t>
-            </w:r>
-            <w:proofErr w:type="spellEnd"/>
-            <w:r>
-              <w:rPr>
-                <w:rFonts w:ascii="BRH Devanagari Extra" w:hAnsi="BRH Devanagari Extra" w:cs="BRH Devanagari Extra"/>
-                <w:color w:val="000000"/>
-                <w:sz w:val="40"/>
-                <w:szCs w:val="40"/>
-              </w:rPr>
-              <w:t xml:space="preserve"> AÉ</w:t>
+            <w:r>
+              <w:rPr>
+                <w:rFonts w:ascii="BRH Devanagari Extra" w:hAnsi="BRH Devanagari Extra" w:cs="BRH Devanagari Extra"/>
+                <w:color w:val="000000"/>
+                <w:sz w:val="40"/>
+                <w:szCs w:val="40"/>
+              </w:rPr>
+              <w:t>uÉ AÉ</w:t>
             </w:r>
             <w:r>
               <w:rPr>
@@ -3219,25 +4817,14 @@
               </w:rPr>
               <w:t>–</w:t>
             </w:r>
-            <w:proofErr w:type="spellStart"/>
-            <w:r>
-              <w:rPr>
-                <w:rFonts w:ascii="BRH Devanagari Extra" w:hAnsi="BRH Devanagari Extra" w:cs="BRH Devanagari Extra"/>
-                <w:color w:val="000000"/>
-                <w:sz w:val="40"/>
-                <w:szCs w:val="40"/>
-              </w:rPr>
-              <w:t>uÉ</w:t>
-            </w:r>
-            <w:proofErr w:type="spellEnd"/>
-            <w:r>
-              <w:rPr>
-                <w:rFonts w:ascii="BRH Devanagari Extra" w:hAnsi="BRH Devanagari Extra" w:cs="BRH Devanagari Extra"/>
-                <w:color w:val="000000"/>
-                <w:sz w:val="40"/>
-                <w:szCs w:val="40"/>
-              </w:rPr>
-              <w:t xml:space="preserve"> AÉ</w:t>
+            <w:r>
+              <w:rPr>
+                <w:rFonts w:ascii="BRH Devanagari Extra" w:hAnsi="BRH Devanagari Extra" w:cs="BRH Devanagari Extra"/>
+                <w:color w:val="000000"/>
+                <w:sz w:val="40"/>
+                <w:szCs w:val="40"/>
+              </w:rPr>
+              <w:t>uÉ AÉ</w:t>
             </w:r>
             <w:r>
               <w:rPr>
@@ -3368,10 +4955,8 @@
           <w:szCs w:val="32"/>
           <w:u w:val="single"/>
         </w:rPr>
-        <w:lastRenderedPageBreak/>
         <w:t xml:space="preserve">TS </w:t>
       </w:r>
-      <w:proofErr w:type="spellStart"/>
       <w:r>
         <w:rPr>
           <w:b/>
@@ -3382,7 +4967,6 @@
         </w:rPr>
         <w:t>Krama</w:t>
       </w:r>
-      <w:proofErr w:type="spellEnd"/>
       <w:r>
         <w:rPr>
           <w:b/>
@@ -3391,29 +4975,7 @@
           <w:szCs w:val="32"/>
           <w:u w:val="single"/>
         </w:rPr>
-        <w:t xml:space="preserve"> </w:t>
-      </w:r>
-      <w:proofErr w:type="spellStart"/>
-      <w:r>
-        <w:rPr>
-          <w:b/>
-          <w:bCs/>
-          <w:sz w:val="32"/>
-          <w:szCs w:val="32"/>
-          <w:u w:val="single"/>
-        </w:rPr>
-        <w:t>Paatam</w:t>
-      </w:r>
-      <w:proofErr w:type="spellEnd"/>
-      <w:r>
-        <w:rPr>
-          <w:b/>
-          <w:bCs/>
-          <w:sz w:val="32"/>
-          <w:szCs w:val="32"/>
-          <w:u w:val="single"/>
-        </w:rPr>
-        <w:t xml:space="preserve"> – TS </w:t>
+        <w:t xml:space="preserve"> Paatam – TS </w:t>
       </w:r>
       <w:r>
         <w:rPr>
@@ -3623,6 +5185,7 @@
                 <w:sz w:val="28"/>
                 <w:szCs w:val="32"/>
               </w:rPr>
+              <w:lastRenderedPageBreak/>
               <w:t>None</w:t>
             </w:r>
           </w:p>
@@ -3730,7 +5293,6 @@
         </w:rPr>
         <w:t xml:space="preserve">TS </w:t>
       </w:r>
-      <w:proofErr w:type="spellStart"/>
       <w:r>
         <w:rPr>
           <w:b/>
@@ -3741,7 +5303,6 @@
         </w:rPr>
         <w:t>Krama</w:t>
       </w:r>
-      <w:proofErr w:type="spellEnd"/>
       <w:r>
         <w:rPr>
           <w:b/>
@@ -3750,29 +5311,7 @@
           <w:szCs w:val="32"/>
           <w:u w:val="single"/>
         </w:rPr>
-        <w:t xml:space="preserve"> </w:t>
-      </w:r>
-      <w:proofErr w:type="spellStart"/>
-      <w:r>
-        <w:rPr>
-          <w:b/>
-          <w:bCs/>
-          <w:sz w:val="32"/>
-          <w:szCs w:val="32"/>
-          <w:u w:val="single"/>
-        </w:rPr>
-        <w:t>Paatam</w:t>
-      </w:r>
-      <w:proofErr w:type="spellEnd"/>
-      <w:r>
-        <w:rPr>
-          <w:b/>
-          <w:bCs/>
-          <w:sz w:val="32"/>
-          <w:szCs w:val="32"/>
-          <w:u w:val="single"/>
-        </w:rPr>
-        <w:t xml:space="preserve"> – TS </w:t>
+        <w:t xml:space="preserve"> Paatam – TS </w:t>
       </w:r>
       <w:r>
         <w:rPr>
@@ -4161,19 +5700,8 @@
                 <w:sz w:val="40"/>
                 <w:szCs w:val="40"/>
               </w:rPr>
-              <w:t xml:space="preserve"> - </w:t>
-            </w:r>
-            <w:proofErr w:type="spellStart"/>
-            <w:r>
-              <w:rPr>
-                <w:rFonts w:ascii="BRH Devanagari Extra" w:hAnsi="BRH Devanagari Extra" w:cs="BRH Devanagari Extra"/>
-                <w:color w:val="000000"/>
-                <w:sz w:val="40"/>
-                <w:szCs w:val="40"/>
-              </w:rPr>
-              <w:t>uÉ</w:t>
-            </w:r>
-            <w:proofErr w:type="spellEnd"/>
+              <w:t xml:space="preserve"> - uÉ</w:t>
+            </w:r>
             <w:r>
               <w:rPr>
                 <w:rFonts w:ascii="BRH Malayalam Extra" w:hAnsi="BRH Malayalam Extra" w:cs="BRH Devanagari Extra"/>
@@ -4402,19 +5930,8 @@
                 <w:sz w:val="40"/>
                 <w:szCs w:val="40"/>
               </w:rPr>
-              <w:t xml:space="preserve"> - </w:t>
-            </w:r>
-            <w:proofErr w:type="spellStart"/>
-            <w:r>
-              <w:rPr>
-                <w:rFonts w:ascii="BRH Devanagari Extra" w:hAnsi="BRH Devanagari Extra" w:cs="BRH Devanagari Extra"/>
-                <w:color w:val="000000"/>
-                <w:sz w:val="40"/>
-                <w:szCs w:val="40"/>
-              </w:rPr>
-              <w:t>uÉ</w:t>
-            </w:r>
-            <w:proofErr w:type="spellEnd"/>
+              <w:t xml:space="preserve"> - uÉ</w:t>
+            </w:r>
             <w:r>
               <w:rPr>
                 <w:rFonts w:ascii="BRH Malayalam Extra" w:hAnsi="BRH Malayalam Extra" w:cs="BRH Devanagari Extra"/>
@@ -4785,25 +6302,14 @@
               </w:rPr>
               <w:t>–</w:t>
             </w:r>
-            <w:proofErr w:type="spellStart"/>
-            <w:r>
-              <w:rPr>
-                <w:rFonts w:ascii="BRH Devanagari Extra" w:hAnsi="BRH Devanagari Extra" w:cs="BRH Devanagari Extra"/>
-                <w:color w:val="000000"/>
-                <w:sz w:val="40"/>
-                <w:szCs w:val="40"/>
-              </w:rPr>
-              <w:t>uÉ</w:t>
-            </w:r>
-            <w:proofErr w:type="spellEnd"/>
-            <w:r>
-              <w:rPr>
-                <w:rFonts w:ascii="BRH Devanagari Extra" w:hAnsi="BRH Devanagari Extra" w:cs="BRH Devanagari Extra"/>
-                <w:color w:val="000000"/>
-                <w:sz w:val="40"/>
-                <w:szCs w:val="40"/>
-              </w:rPr>
-              <w:t xml:space="preserve"> </w:t>
+            <w:r>
+              <w:rPr>
+                <w:rFonts w:ascii="BRH Devanagari Extra" w:hAnsi="BRH Devanagari Extra" w:cs="BRH Devanagari Extra"/>
+                <w:color w:val="000000"/>
+                <w:sz w:val="40"/>
+                <w:szCs w:val="40"/>
+              </w:rPr>
+              <w:t xml:space="preserve">uÉ </w:t>
             </w:r>
             <w:proofErr w:type="spellStart"/>
             <w:r>
@@ -4846,7 +6352,6 @@
               </w:rPr>
               <w:t xml:space="preserve"> | </w:t>
             </w:r>
-            <w:proofErr w:type="spellStart"/>
             <w:r>
               <w:rPr>
                 <w:rFonts w:ascii="BRH Devanagari Extra" w:hAnsi="BRH Devanagari Extra" w:cs="BRH Devanagari Extra"/>
@@ -4857,7 +6362,6 @@
               </w:rPr>
               <w:t>oÉ</w:t>
             </w:r>
-            <w:proofErr w:type="spellEnd"/>
             <w:r>
               <w:rPr>
                 <w:rFonts w:ascii="BRH Devanagari Extra" w:hAnsi="BRH Devanagari Extra" w:cs="BRH Devanagari Extra"/>
@@ -4877,7 +6381,6 @@
               </w:rPr>
               <w:t>–</w:t>
             </w:r>
-            <w:proofErr w:type="spellStart"/>
             <w:r>
               <w:rPr>
                 <w:rFonts w:ascii="BRH Devanagari Extra" w:hAnsi="BRH Devanagari Extra" w:cs="BRH Devanagari Extra"/>
@@ -4887,7 +6390,6 @@
               </w:rPr>
               <w:t>Wû</w:t>
             </w:r>
-            <w:proofErr w:type="spellEnd"/>
             <w:r>
               <w:rPr>
                 <w:rFonts w:ascii="BRH Malayalam Extra" w:hAnsi="BRH Malayalam Extra" w:cs="BRH Devanagari Extra"/>
@@ -4978,25 +6480,14 @@
               </w:rPr>
               <w:t>–</w:t>
             </w:r>
-            <w:proofErr w:type="spellStart"/>
-            <w:r>
-              <w:rPr>
-                <w:rFonts w:ascii="BRH Devanagari Extra" w:hAnsi="BRH Devanagari Extra" w:cs="BRH Devanagari Extra"/>
-                <w:color w:val="000000"/>
-                <w:sz w:val="40"/>
-                <w:szCs w:val="40"/>
-              </w:rPr>
-              <w:t>uÉ</w:t>
-            </w:r>
-            <w:proofErr w:type="spellEnd"/>
-            <w:r>
-              <w:rPr>
-                <w:rFonts w:ascii="BRH Devanagari Extra" w:hAnsi="BRH Devanagari Extra" w:cs="BRH Devanagari Extra"/>
-                <w:color w:val="000000"/>
-                <w:sz w:val="40"/>
-                <w:szCs w:val="40"/>
-              </w:rPr>
-              <w:t xml:space="preserve"> </w:t>
+            <w:r>
+              <w:rPr>
+                <w:rFonts w:ascii="BRH Devanagari Extra" w:hAnsi="BRH Devanagari Extra" w:cs="BRH Devanagari Extra"/>
+                <w:color w:val="000000"/>
+                <w:sz w:val="40"/>
+                <w:szCs w:val="40"/>
+              </w:rPr>
+              <w:t xml:space="preserve">uÉ </w:t>
             </w:r>
             <w:proofErr w:type="spellStart"/>
             <w:r>
@@ -5553,7 +7044,6 @@
                 <w:sz w:val="28"/>
                 <w:szCs w:val="32"/>
               </w:rPr>
-              <w:lastRenderedPageBreak/>
               <w:t>T.S.2.3.9.1 – Kramam</w:t>
             </w:r>
           </w:p>
@@ -5957,6 +7447,7 @@
                 <w:sz w:val="28"/>
                 <w:szCs w:val="32"/>
               </w:rPr>
+              <w:lastRenderedPageBreak/>
               <w:t>Panchaati No</w:t>
             </w:r>
             <w:r>
@@ -6027,6 +7518,7 @@
                 <w:sz w:val="40"/>
                 <w:szCs w:val="40"/>
               </w:rPr>
+              <w:lastRenderedPageBreak/>
               <w:t>lÉuÉ</w:t>
             </w:r>
             <w:proofErr w:type="spellEnd"/>
@@ -6163,19 +7655,8 @@
                 <w:sz w:val="40"/>
                 <w:szCs w:val="40"/>
               </w:rPr>
-              <w:t xml:space="preserve"> | </w:t>
-            </w:r>
-            <w:proofErr w:type="spellStart"/>
-            <w:r>
-              <w:rPr>
-                <w:rFonts w:ascii="BRH Devanagari Extra" w:hAnsi="BRH Devanagari Extra" w:cs="BRH Devanagari Extra"/>
-                <w:color w:val="000000"/>
-                <w:sz w:val="40"/>
-                <w:szCs w:val="40"/>
-              </w:rPr>
-              <w:t>Lå</w:t>
-            </w:r>
-            <w:proofErr w:type="spellEnd"/>
+              <w:t xml:space="preserve"> | Lå</w:t>
+            </w:r>
             <w:r>
               <w:rPr>
                 <w:rFonts w:ascii="BRH Devanagari" w:hAnsi="BRH Devanagari" w:cs="BRH Devanagari"/>
@@ -6187,25 +7668,14 @@
               </w:rPr>
               <w:t>¨É</w:t>
             </w:r>
-            <w:proofErr w:type="spellStart"/>
-            <w:r>
-              <w:rPr>
-                <w:rFonts w:ascii="BRH Devanagari Extra" w:hAnsi="BRH Devanagari Extra" w:cs="BRH Devanagari Extra"/>
-                <w:color w:val="000000"/>
-                <w:sz w:val="40"/>
-                <w:szCs w:val="40"/>
-              </w:rPr>
-              <w:t>iÉç</w:t>
-            </w:r>
-            <w:proofErr w:type="spellEnd"/>
-            <w:r>
-              <w:rPr>
-                <w:rFonts w:ascii="BRH Devanagari Extra" w:hAnsi="BRH Devanagari Extra" w:cs="BRH Devanagari Extra"/>
-                <w:color w:val="000000"/>
-                <w:sz w:val="40"/>
-                <w:szCs w:val="40"/>
-              </w:rPr>
-              <w:t xml:space="preserve"> |</w:t>
+            <w:r>
+              <w:rPr>
+                <w:rFonts w:ascii="BRH Devanagari Extra" w:hAnsi="BRH Devanagari Extra" w:cs="BRH Devanagari Extra"/>
+                <w:color w:val="000000"/>
+                <w:sz w:val="40"/>
+                <w:szCs w:val="40"/>
+              </w:rPr>
+              <w:t>iÉç |</w:t>
             </w:r>
           </w:p>
         </w:tc>
@@ -6896,7 +8366,6 @@
                 <w:szCs w:val="40"/>
               </w:rPr>
             </w:pPr>
-            <w:proofErr w:type="spellStart"/>
             <w:r>
               <w:rPr>
                 <w:rFonts w:ascii="BRH Devanagari Extra" w:hAnsi="BRH Devanagari Extra" w:cs="BRH Devanagari Extra"/>
@@ -6906,7 +8375,6 @@
               </w:rPr>
               <w:t>uÉ</w:t>
             </w:r>
-            <w:proofErr w:type="spellEnd"/>
             <w:r>
               <w:rPr>
                 <w:rFonts w:ascii="BRH Malayalam Extra" w:hAnsi="BRH Malayalam Extra" w:cs="BRH Devanagari Extra"/>
@@ -6969,7 +8437,6 @@
               </w:rPr>
               <w:t>–</w:t>
             </w:r>
-            <w:proofErr w:type="spellStart"/>
             <w:r>
               <w:rPr>
                 <w:rFonts w:ascii="BRH Devanagari Extra" w:hAnsi="BRH Devanagari Extra" w:cs="BRH Devanagari Extra"/>
@@ -6979,7 +8446,6 @@
               </w:rPr>
               <w:t>óè</w:t>
             </w:r>
-            <w:proofErr w:type="spellEnd"/>
             <w:r>
               <w:rPr>
                 <w:rFonts w:ascii="BRH Malayalam Extra" w:hAnsi="BRH Malayalam Extra" w:cs="BRH Devanagari Extra"/>
@@ -7061,7 +8527,6 @@
               </w:rPr>
               <w:t>–</w:t>
             </w:r>
-            <w:proofErr w:type="spellStart"/>
             <w:r>
               <w:rPr>
                 <w:rFonts w:ascii="BRH Devanagari Extra" w:hAnsi="BRH Devanagari Extra" w:cs="BRH Devanagari Extra"/>
@@ -7071,7 +8536,6 @@
               </w:rPr>
               <w:t>óè</w:t>
             </w:r>
-            <w:proofErr w:type="spellEnd"/>
             <w:r>
               <w:rPr>
                 <w:rFonts w:ascii="BRH Malayalam Extra" w:hAnsi="BRH Malayalam Extra" w:cs="BRH Devanagari Extra"/>
@@ -7169,7 +8633,6 @@
                 <w:szCs w:val="40"/>
               </w:rPr>
             </w:pPr>
-            <w:proofErr w:type="spellStart"/>
             <w:r>
               <w:rPr>
                 <w:rFonts w:ascii="BRH Devanagari Extra" w:hAnsi="BRH Devanagari Extra" w:cs="BRH Devanagari Extra"/>
@@ -7179,7 +8642,6 @@
               </w:rPr>
               <w:t>uÉ</w:t>
             </w:r>
-            <w:proofErr w:type="spellEnd"/>
             <w:r>
               <w:rPr>
                 <w:rFonts w:ascii="BRH Malayalam Extra" w:hAnsi="BRH Malayalam Extra" w:cs="BRH Devanagari Extra"/>
@@ -7263,7 +8725,6 @@
               </w:rPr>
               <w:t>–</w:t>
             </w:r>
-            <w:proofErr w:type="spellStart"/>
             <w:r>
               <w:rPr>
                 <w:rFonts w:ascii="BRH Devanagari Extra" w:hAnsi="BRH Devanagari Extra" w:cs="BRH Devanagari Extra"/>
@@ -7273,7 +8734,6 @@
               </w:rPr>
               <w:t>óè</w:t>
             </w:r>
-            <w:proofErr w:type="spellEnd"/>
             <w:r>
               <w:rPr>
                 <w:rFonts w:ascii="BRH Malayalam Extra" w:hAnsi="BRH Malayalam Extra" w:cs="BRH Devanagari Extra"/>
@@ -7359,7 +8819,6 @@
               </w:rPr>
               <w:t>–</w:t>
             </w:r>
-            <w:proofErr w:type="spellStart"/>
             <w:r>
               <w:rPr>
                 <w:rFonts w:ascii="BRH Devanagari Extra" w:hAnsi="BRH Devanagari Extra" w:cs="BRH Devanagari Extra"/>
@@ -7369,7 +8828,6 @@
               </w:rPr>
               <w:t>óè</w:t>
             </w:r>
-            <w:proofErr w:type="spellEnd"/>
             <w:r>
               <w:rPr>
                 <w:rFonts w:ascii="BRH Malayalam Extra" w:hAnsi="BRH Malayalam Extra" w:cs="BRH Devanagari Extra"/>
@@ -8076,7 +9534,6 @@
               </w:rPr>
               <w:t>–</w:t>
             </w:r>
-            <w:proofErr w:type="spellStart"/>
             <w:r>
               <w:rPr>
                 <w:rFonts w:ascii="BRH Devanagari Extra" w:hAnsi="BRH Devanagari Extra" w:cs="BRH Devanagari Extra"/>
@@ -8086,7 +9543,6 @@
               </w:rPr>
               <w:t>WûÉ</w:t>
             </w:r>
-            <w:proofErr w:type="spellEnd"/>
             <w:r>
               <w:rPr>
                 <w:rFonts w:ascii="BRH Malayalam Extra" w:hAnsi="BRH Malayalam Extra" w:cs="BRH Devanagari Extra"/>
@@ -8232,7 +9688,6 @@
               </w:rPr>
               <w:t>–</w:t>
             </w:r>
-            <w:proofErr w:type="spellStart"/>
             <w:r>
               <w:rPr>
                 <w:rFonts w:ascii="BRH Devanagari Extra" w:hAnsi="BRH Devanagari Extra" w:cs="BRH Devanagari Extra"/>
@@ -8242,7 +9697,6 @@
               </w:rPr>
               <w:t>WûÉ</w:t>
             </w:r>
-            <w:proofErr w:type="spellEnd"/>
             <w:r>
               <w:rPr>
                 <w:rFonts w:ascii="BRH Malayalam Extra" w:hAnsi="BRH Malayalam Extra" w:cs="BRH Devanagari Extra"/>
@@ -8563,7 +10017,6 @@
               </w:rPr>
               <w:t>–</w:t>
             </w:r>
-            <w:proofErr w:type="spellStart"/>
             <w:r>
               <w:rPr>
                 <w:rFonts w:ascii="BRH Devanagari Extra" w:hAnsi="BRH Devanagari Extra" w:cs="BRH Devanagari Extra"/>
@@ -8573,7 +10026,6 @@
               </w:rPr>
               <w:t>Wû</w:t>
             </w:r>
-            <w:proofErr w:type="spellEnd"/>
             <w:r>
               <w:rPr>
                 <w:rFonts w:ascii="BRH Malayalam Extra" w:hAnsi="BRH Malayalam Extra" w:cs="BRH Devanagari Extra"/>
@@ -8676,25 +10128,14 @@
               </w:rPr>
               <w:t>–</w:t>
             </w:r>
-            <w:proofErr w:type="spellStart"/>
-            <w:r>
-              <w:rPr>
-                <w:rFonts w:ascii="BRH Devanagari Extra" w:hAnsi="BRH Devanagari Extra" w:cs="BRH Devanagari Extra"/>
-                <w:color w:val="000000"/>
-                <w:sz w:val="40"/>
-                <w:szCs w:val="40"/>
-              </w:rPr>
-              <w:t>uÉ</w:t>
-            </w:r>
-            <w:proofErr w:type="spellEnd"/>
-            <w:r>
-              <w:rPr>
-                <w:rFonts w:ascii="BRH Devanagari Extra" w:hAnsi="BRH Devanagari Extra" w:cs="BRH Devanagari Extra"/>
-                <w:color w:val="000000"/>
-                <w:sz w:val="40"/>
-                <w:szCs w:val="40"/>
-              </w:rPr>
-              <w:t xml:space="preserve"> |</w:t>
+            <w:r>
+              <w:rPr>
+                <w:rFonts w:ascii="BRH Devanagari Extra" w:hAnsi="BRH Devanagari Extra" w:cs="BRH Devanagari Extra"/>
+                <w:color w:val="000000"/>
+                <w:sz w:val="40"/>
+                <w:szCs w:val="40"/>
+              </w:rPr>
+              <w:t>uÉ |</w:t>
             </w:r>
           </w:p>
         </w:tc>
@@ -8742,7 +10183,6 @@
               </w:rPr>
               <w:t>–</w:t>
             </w:r>
-            <w:proofErr w:type="spellStart"/>
             <w:r>
               <w:rPr>
                 <w:rFonts w:ascii="BRH Devanagari Extra" w:hAnsi="BRH Devanagari Extra" w:cs="BRH Devanagari Extra"/>
@@ -8752,7 +10192,6 @@
               </w:rPr>
               <w:t>Wû</w:t>
             </w:r>
-            <w:proofErr w:type="spellEnd"/>
             <w:r>
               <w:rPr>
                 <w:rFonts w:ascii="BRH Malayalam Extra" w:hAnsi="BRH Malayalam Extra" w:cs="BRH Devanagari Extra"/>
@@ -8855,25 +10294,14 @@
               </w:rPr>
               <w:t>–</w:t>
             </w:r>
-            <w:proofErr w:type="spellStart"/>
-            <w:r>
-              <w:rPr>
-                <w:rFonts w:ascii="BRH Devanagari Extra" w:hAnsi="BRH Devanagari Extra" w:cs="BRH Devanagari Extra"/>
-                <w:color w:val="000000"/>
-                <w:sz w:val="40"/>
-                <w:szCs w:val="40"/>
-              </w:rPr>
-              <w:t>uÉ</w:t>
-            </w:r>
-            <w:proofErr w:type="spellEnd"/>
-            <w:r>
-              <w:rPr>
-                <w:rFonts w:ascii="BRH Devanagari Extra" w:hAnsi="BRH Devanagari Extra" w:cs="BRH Devanagari Extra"/>
-                <w:color w:val="000000"/>
-                <w:sz w:val="40"/>
-                <w:szCs w:val="40"/>
-              </w:rPr>
-              <w:t xml:space="preserve"> |</w:t>
+            <w:r>
+              <w:rPr>
+                <w:rFonts w:ascii="BRH Devanagari Extra" w:hAnsi="BRH Devanagari Extra" w:cs="BRH Devanagari Extra"/>
+                <w:color w:val="000000"/>
+                <w:sz w:val="40"/>
+                <w:szCs w:val="40"/>
+              </w:rPr>
+              <w:t>uÉ |</w:t>
             </w:r>
           </w:p>
         </w:tc>
@@ -8919,7 +10347,6 @@
                 <w:sz w:val="28"/>
                 <w:szCs w:val="32"/>
               </w:rPr>
-              <w:lastRenderedPageBreak/>
               <w:t>T.S.2.3.</w:t>
             </w:r>
             <w:r>
@@ -9062,7 +10489,6 @@
                 <w:szCs w:val="40"/>
               </w:rPr>
             </w:pPr>
-            <w:proofErr w:type="spellStart"/>
             <w:r>
               <w:rPr>
                 <w:rFonts w:ascii="BRH Devanagari Extra" w:hAnsi="BRH Devanagari Extra" w:cs="BRH Devanagari Extra"/>
@@ -9072,18 +10498,16 @@
               </w:rPr>
               <w:t>xÉ</w:t>
             </w:r>
-            <w:proofErr w:type="spellEnd"/>
-            <w:r>
-              <w:rPr>
-                <w:rFonts w:ascii="BRH Malayalam Extra" w:hAnsi="BRH Malayalam Extra" w:cs="BRH Devanagari Extra"/>
-                <w:b/>
-                <w:color w:val="000000"/>
-                <w:sz w:val="32"/>
-                <w:szCs w:val="40"/>
-              </w:rPr>
-              <w:t>–</w:t>
-            </w:r>
-            <w:proofErr w:type="spellStart"/>
+            <w:r>
+              <w:rPr>
+                <w:rFonts w:ascii="BRH Malayalam Extra" w:hAnsi="BRH Malayalam Extra" w:cs="BRH Devanagari Extra"/>
+                <w:b/>
+                <w:color w:val="000000"/>
+                <w:sz w:val="32"/>
+                <w:szCs w:val="40"/>
+              </w:rPr>
+              <w:t>–</w:t>
+            </w:r>
             <w:r>
               <w:rPr>
                 <w:rFonts w:ascii="BRH Devanagari Extra" w:hAnsi="BRH Devanagari Extra" w:cs="BRH Devanagari Extra"/>
@@ -9093,7 +10517,6 @@
               </w:rPr>
               <w:t>Wû</w:t>
             </w:r>
-            <w:proofErr w:type="spellEnd"/>
             <w:r>
               <w:rPr>
                 <w:rFonts w:ascii="BRH Malayalam Extra" w:hAnsi="BRH Malayalam Extra" w:cs="BRH Devanagari Extra"/>
@@ -9296,7 +10719,6 @@
                 <w:szCs w:val="40"/>
               </w:rPr>
             </w:pPr>
-            <w:proofErr w:type="spellStart"/>
             <w:r>
               <w:rPr>
                 <w:rFonts w:ascii="BRH Devanagari Extra" w:hAnsi="BRH Devanagari Extra" w:cs="BRH Devanagari Extra"/>
@@ -9306,18 +10728,16 @@
               </w:rPr>
               <w:t>xÉ</w:t>
             </w:r>
-            <w:proofErr w:type="spellEnd"/>
-            <w:r>
-              <w:rPr>
-                <w:rFonts w:ascii="BRH Malayalam Extra" w:hAnsi="BRH Malayalam Extra" w:cs="BRH Devanagari Extra"/>
-                <w:b/>
-                <w:color w:val="000000"/>
-                <w:sz w:val="32"/>
-                <w:szCs w:val="40"/>
-              </w:rPr>
-              <w:t>–</w:t>
-            </w:r>
-            <w:proofErr w:type="spellStart"/>
+            <w:r>
+              <w:rPr>
+                <w:rFonts w:ascii="BRH Malayalam Extra" w:hAnsi="BRH Malayalam Extra" w:cs="BRH Devanagari Extra"/>
+                <w:b/>
+                <w:color w:val="000000"/>
+                <w:sz w:val="32"/>
+                <w:szCs w:val="40"/>
+              </w:rPr>
+              <w:t>–</w:t>
+            </w:r>
             <w:r>
               <w:rPr>
                 <w:rFonts w:ascii="BRH Devanagari Extra" w:hAnsi="BRH Devanagari Extra" w:cs="BRH Devanagari Extra"/>
@@ -9327,7 +10747,6 @@
               </w:rPr>
               <w:t>Wû</w:t>
             </w:r>
-            <w:proofErr w:type="spellEnd"/>
             <w:r>
               <w:rPr>
                 <w:rFonts w:ascii="BRH Malayalam Extra" w:hAnsi="BRH Malayalam Extra" w:cs="BRH Devanagari Extra"/>
@@ -9735,7 +11154,6 @@
               </w:rPr>
               <w:t>–</w:t>
             </w:r>
-            <w:proofErr w:type="spellStart"/>
             <w:r>
               <w:rPr>
                 <w:rFonts w:ascii="BRH Devanagari Extra" w:hAnsi="BRH Devanagari Extra" w:cs="BRH Devanagari Extra"/>
@@ -9745,7 +11163,6 @@
               </w:rPr>
               <w:t>qÉ</w:t>
             </w:r>
-            <w:proofErr w:type="spellEnd"/>
             <w:r>
               <w:rPr>
                 <w:rFonts w:ascii="BRH Malayalam Extra" w:hAnsi="BRH Malayalam Extra" w:cs="BRH Devanagari Extra"/>
@@ -9813,19 +11230,8 @@
                 <w:sz w:val="40"/>
                 <w:szCs w:val="40"/>
               </w:rPr>
-              <w:t xml:space="preserve"> </w:t>
-            </w:r>
-            <w:proofErr w:type="spellStart"/>
-            <w:r>
-              <w:rPr>
-                <w:rFonts w:ascii="BRH Devanagari Extra" w:hAnsi="BRH Devanagari Extra" w:cs="BRH Devanagari Extra"/>
-                <w:color w:val="000000"/>
-                <w:sz w:val="40"/>
-                <w:szCs w:val="40"/>
-              </w:rPr>
-              <w:t>Wû</w:t>
-            </w:r>
-            <w:proofErr w:type="spellEnd"/>
+              <w:t xml:space="preserve"> Wû</w:t>
+            </w:r>
             <w:r>
               <w:rPr>
                 <w:rFonts w:ascii="BRH Malayalam Extra" w:hAnsi="BRH Malayalam Extra" w:cs="BRH Devanagari Extra"/>
@@ -9899,7 +11305,6 @@
               </w:rPr>
               <w:t>–</w:t>
             </w:r>
-            <w:proofErr w:type="spellStart"/>
             <w:r>
               <w:rPr>
                 <w:rFonts w:ascii="BRH Devanagari Extra" w:hAnsi="BRH Devanagari Extra" w:cs="BRH Devanagari Extra"/>
@@ -9909,7 +11314,6 @@
               </w:rPr>
               <w:t>qÉ</w:t>
             </w:r>
-            <w:proofErr w:type="spellEnd"/>
             <w:r>
               <w:rPr>
                 <w:rFonts w:ascii="BRH Malayalam Extra" w:hAnsi="BRH Malayalam Extra" w:cs="BRH Devanagari Extra"/>
@@ -9986,19 +11390,8 @@
                 <w:sz w:val="40"/>
                 <w:szCs w:val="40"/>
               </w:rPr>
-              <w:t xml:space="preserve"> </w:t>
-            </w:r>
-            <w:proofErr w:type="spellStart"/>
-            <w:r>
-              <w:rPr>
-                <w:rFonts w:ascii="BRH Devanagari Extra" w:hAnsi="BRH Devanagari Extra" w:cs="BRH Devanagari Extra"/>
-                <w:color w:val="000000"/>
-                <w:sz w:val="40"/>
-                <w:szCs w:val="40"/>
-              </w:rPr>
-              <w:t>Wû</w:t>
-            </w:r>
-            <w:proofErr w:type="spellEnd"/>
+              <w:t xml:space="preserve"> Wû</w:t>
+            </w:r>
             <w:r>
               <w:rPr>
                 <w:rFonts w:ascii="BRH Malayalam Extra" w:hAnsi="BRH Malayalam Extra" w:cs="BRH Devanagari Extra"/>
@@ -10070,6 +11463,7 @@
                 <w:sz w:val="28"/>
                 <w:szCs w:val="32"/>
               </w:rPr>
+              <w:lastRenderedPageBreak/>
               <w:t>T.S.2.3.</w:t>
             </w:r>
             <w:r>
@@ -10212,25 +11606,14 @@
                 <w:szCs w:val="40"/>
               </w:rPr>
             </w:pPr>
-            <w:proofErr w:type="spellStart"/>
-            <w:r>
-              <w:rPr>
-                <w:rFonts w:ascii="BRH Devanagari Extra" w:hAnsi="BRH Devanagari Extra" w:cs="BRH Devanagari Extra"/>
-                <w:color w:val="000000"/>
-                <w:sz w:val="40"/>
-                <w:szCs w:val="40"/>
-              </w:rPr>
-              <w:t>xÉ</w:t>
-            </w:r>
-            <w:proofErr w:type="spellEnd"/>
-            <w:r>
-              <w:rPr>
-                <w:rFonts w:ascii="BRH Devanagari Extra" w:hAnsi="BRH Devanagari Extra" w:cs="BRH Devanagari Extra"/>
-                <w:color w:val="000000"/>
-                <w:sz w:val="40"/>
-                <w:szCs w:val="40"/>
-              </w:rPr>
-              <w:t xml:space="preserve"> </w:t>
+            <w:r>
+              <w:rPr>
+                <w:rFonts w:ascii="BRH Devanagari Extra" w:hAnsi="BRH Devanagari Extra" w:cs="BRH Devanagari Extra"/>
+                <w:color w:val="000000"/>
+                <w:sz w:val="40"/>
+                <w:szCs w:val="40"/>
+              </w:rPr>
+              <w:t xml:space="preserve">xÉ </w:t>
             </w:r>
             <w:proofErr w:type="spellStart"/>
             <w:r>
@@ -10324,25 +11707,14 @@
                 <w:szCs w:val="40"/>
               </w:rPr>
             </w:pPr>
-            <w:proofErr w:type="spellStart"/>
-            <w:r>
-              <w:rPr>
-                <w:rFonts w:ascii="BRH Devanagari Extra" w:hAnsi="BRH Devanagari Extra" w:cs="BRH Devanagari Extra"/>
-                <w:color w:val="000000"/>
-                <w:sz w:val="40"/>
-                <w:szCs w:val="40"/>
-              </w:rPr>
-              <w:t>xÉ</w:t>
-            </w:r>
-            <w:proofErr w:type="spellEnd"/>
-            <w:r>
-              <w:rPr>
-                <w:rFonts w:ascii="BRH Devanagari Extra" w:hAnsi="BRH Devanagari Extra" w:cs="BRH Devanagari Extra"/>
-                <w:color w:val="000000"/>
-                <w:sz w:val="40"/>
-                <w:szCs w:val="40"/>
-              </w:rPr>
-              <w:t xml:space="preserve"> </w:t>
+            <w:r>
+              <w:rPr>
+                <w:rFonts w:ascii="BRH Devanagari Extra" w:hAnsi="BRH Devanagari Extra" w:cs="BRH Devanagari Extra"/>
+                <w:color w:val="000000"/>
+                <w:sz w:val="40"/>
+                <w:szCs w:val="40"/>
+              </w:rPr>
+              <w:t xml:space="preserve">xÉ </w:t>
             </w:r>
             <w:proofErr w:type="spellStart"/>
             <w:r>
@@ -10623,37 +11995,25 @@
               </w:rPr>
               <w:t>–</w:t>
             </w:r>
-            <w:proofErr w:type="spellStart"/>
-            <w:r>
-              <w:rPr>
-                <w:rFonts w:ascii="BRH Devanagari Extra" w:hAnsi="BRH Devanagari Extra" w:cs="BRH Devanagari Extra"/>
-                <w:color w:val="000000"/>
-                <w:sz w:val="40"/>
-                <w:szCs w:val="40"/>
-              </w:rPr>
-              <w:t>xÉ</w:t>
-            </w:r>
-            <w:proofErr w:type="spellEnd"/>
-            <w:r>
-              <w:rPr>
-                <w:rFonts w:ascii="BRH Devanagari Extra" w:hAnsi="BRH Devanagari Extra" w:cs="BRH Devanagari Extra"/>
-                <w:color w:val="000000"/>
-                <w:sz w:val="40"/>
-                <w:szCs w:val="40"/>
-              </w:rPr>
-              <w:t>×</w:t>
-            </w:r>
-            <w:r>
-              <w:rPr>
-                <w:rFonts w:ascii="BRH Malayalam Extra" w:hAnsi="BRH Malayalam Extra" w:cs="BRH Devanagari Extra"/>
-                <w:b/>
-                <w:color w:val="000000"/>
-                <w:sz w:val="32"/>
-                <w:szCs w:val="40"/>
-              </w:rPr>
-              <w:t>–</w:t>
-            </w:r>
-            <w:proofErr w:type="spellStart"/>
+            <w:r>
+              <w:rPr>
+                <w:rFonts w:ascii="BRH Devanagari Extra" w:hAnsi="BRH Devanagari Extra" w:cs="BRH Devanagari Extra"/>
+                <w:color w:val="000000"/>
+                <w:sz w:val="40"/>
+                <w:szCs w:val="40"/>
+              </w:rPr>
+              <w:t>xÉ×</w:t>
+            </w:r>
+            <w:r>
+              <w:rPr>
+                <w:rFonts w:ascii="BRH Malayalam Extra" w:hAnsi="BRH Malayalam Extra" w:cs="BRH Devanagari Extra"/>
+                <w:b/>
+                <w:color w:val="000000"/>
+                <w:sz w:val="32"/>
+                <w:szCs w:val="40"/>
+              </w:rPr>
+              <w:t>–</w:t>
+            </w:r>
             <w:r>
               <w:rPr>
                 <w:rFonts w:ascii="BRH Devanagari Extra" w:hAnsi="BRH Devanagari Extra" w:cs="BRH Devanagari Extra"/>
@@ -10663,38 +12023,85 @@
               </w:rPr>
               <w:t>eÉ</w:t>
             </w:r>
-            <w:proofErr w:type="spellEnd"/>
-            <w:r>
-              <w:rPr>
-                <w:rFonts w:ascii="BRH Malayalam Extra" w:hAnsi="BRH Malayalam Extra" w:cs="BRH Devanagari Extra"/>
-                <w:b/>
-                <w:color w:val="000000"/>
-                <w:sz w:val="32"/>
-                <w:szCs w:val="40"/>
-              </w:rPr>
-              <w:t>–</w:t>
-            </w:r>
-            <w:proofErr w:type="spellStart"/>
-            <w:r>
-              <w:rPr>
-                <w:rFonts w:ascii="BRH Devanagari Extra" w:hAnsi="BRH Devanagari Extra" w:cs="BRH Devanagari Extra"/>
-                <w:color w:val="000000"/>
-                <w:sz w:val="40"/>
-                <w:szCs w:val="40"/>
-              </w:rPr>
-              <w:t>iÉç</w:t>
-            </w:r>
-            <w:proofErr w:type="spellEnd"/>
-            <w:r>
-              <w:rPr>
-                <w:rFonts w:ascii="BRH Devanagari Extra" w:hAnsi="BRH Devanagari Extra" w:cs="BRH Devanagari Extra"/>
-                <w:color w:val="000000"/>
-                <w:sz w:val="40"/>
-                <w:szCs w:val="40"/>
-              </w:rPr>
-              <w:t xml:space="preserve"> </w:t>
-            </w:r>
-            <w:proofErr w:type="spellStart"/>
+            <w:r>
+              <w:rPr>
+                <w:rFonts w:ascii="BRH Malayalam Extra" w:hAnsi="BRH Malayalam Extra" w:cs="BRH Devanagari Extra"/>
+                <w:b/>
+                <w:color w:val="000000"/>
+                <w:sz w:val="32"/>
+                <w:szCs w:val="40"/>
+              </w:rPr>
+              <w:t>–</w:t>
+            </w:r>
+            <w:r>
+              <w:rPr>
+                <w:rFonts w:ascii="BRH Devanagari Extra" w:hAnsi="BRH Devanagari Extra" w:cs="BRH Devanagari Extra"/>
+                <w:color w:val="000000"/>
+                <w:sz w:val="40"/>
+                <w:szCs w:val="40"/>
+              </w:rPr>
+              <w:t>iÉç mÉ</w:t>
+            </w:r>
+            <w:r>
+              <w:rPr>
+                <w:rFonts w:ascii="BRH Malayalam Extra" w:hAnsi="BRH Malayalam Extra" w:cs="BRH Devanagari Extra"/>
+                <w:b/>
+                <w:color w:val="000000"/>
+                <w:sz w:val="32"/>
+                <w:szCs w:val="40"/>
+              </w:rPr>
+              <w:t>–</w:t>
+            </w:r>
+            <w:proofErr w:type="spellStart"/>
+            <w:r>
+              <w:rPr>
+                <w:rFonts w:ascii="BRH Devanagari Extra" w:hAnsi="BRH Devanagari Extra" w:cs="BRH Devanagari Extra"/>
+                <w:color w:val="000000"/>
+                <w:sz w:val="40"/>
+                <w:szCs w:val="40"/>
+              </w:rPr>
+              <w:t>ÍjÉ</w:t>
+            </w:r>
+            <w:r>
+              <w:rPr>
+                <w:rFonts w:ascii="BRH Devanagari Extra" w:hAnsi="BRH Devanagari Extra" w:cs="BRH Devanagari Extra"/>
+                <w:color w:val="000000"/>
+                <w:sz w:val="40"/>
+                <w:szCs w:val="40"/>
+                <w:highlight w:val="yellow"/>
+              </w:rPr>
+              <w:t>ÍpÉ</w:t>
+            </w:r>
+            <w:r>
+              <w:rPr>
+                <w:rFonts w:ascii="BRH Devanagari Extra" w:hAnsi="BRH Devanagari Extra" w:cs="BRH Devanagari Extra"/>
+                <w:color w:val="000000"/>
+                <w:sz w:val="40"/>
+                <w:szCs w:val="40"/>
+              </w:rPr>
+              <w:t>ÿÈ</w:t>
+            </w:r>
+            <w:proofErr w:type="spellEnd"/>
+            <w:r>
+              <w:rPr>
+                <w:rFonts w:ascii="BRH Devanagari Extra" w:hAnsi="BRH Devanagari Extra" w:cs="BRH Devanagari Extra"/>
+                <w:color w:val="000000"/>
+                <w:sz w:val="40"/>
+                <w:szCs w:val="40"/>
+              </w:rPr>
+              <w:t xml:space="preserve"> | </w:t>
+            </w:r>
+          </w:p>
+          <w:p>
+            <w:pPr>
+              <w:spacing w:before="0" w:line="240" w:lineRule="auto"/>
+              <w:rPr>
+                <w:rFonts w:ascii="BRH Devanagari Extra" w:hAnsi="BRH Devanagari Extra" w:cs="BRH Devanagari Extra"/>
+                <w:color w:val="000000"/>
+                <w:sz w:val="40"/>
+                <w:szCs w:val="40"/>
+              </w:rPr>
+            </w:pPr>
             <w:r>
               <w:rPr>
                 <w:rFonts w:ascii="BRH Devanagari Extra" w:hAnsi="BRH Devanagari Extra" w:cs="BRH Devanagari Extra"/>
@@ -10704,78 +12111,6 @@
               </w:rPr>
               <w:t>mÉ</w:t>
             </w:r>
-            <w:proofErr w:type="spellEnd"/>
-            <w:r>
-              <w:rPr>
-                <w:rFonts w:ascii="BRH Malayalam Extra" w:hAnsi="BRH Malayalam Extra" w:cs="BRH Devanagari Extra"/>
-                <w:b/>
-                <w:color w:val="000000"/>
-                <w:sz w:val="32"/>
-                <w:szCs w:val="40"/>
-              </w:rPr>
-              <w:t>–</w:t>
-            </w:r>
-            <w:proofErr w:type="spellStart"/>
-            <w:r>
-              <w:rPr>
-                <w:rFonts w:ascii="BRH Devanagari Extra" w:hAnsi="BRH Devanagari Extra" w:cs="BRH Devanagari Extra"/>
-                <w:color w:val="000000"/>
-                <w:sz w:val="40"/>
-                <w:szCs w:val="40"/>
-              </w:rPr>
-              <w:t>ÍjÉ</w:t>
-            </w:r>
-            <w:r>
-              <w:rPr>
-                <w:rFonts w:ascii="BRH Devanagari Extra" w:hAnsi="BRH Devanagari Extra" w:cs="BRH Devanagari Extra"/>
-                <w:color w:val="000000"/>
-                <w:sz w:val="40"/>
-                <w:szCs w:val="40"/>
-                <w:highlight w:val="yellow"/>
-              </w:rPr>
-              <w:t>ÍpÉ</w:t>
-            </w:r>
-            <w:r>
-              <w:rPr>
-                <w:rFonts w:ascii="BRH Devanagari Extra" w:hAnsi="BRH Devanagari Extra" w:cs="BRH Devanagari Extra"/>
-                <w:color w:val="000000"/>
-                <w:sz w:val="40"/>
-                <w:szCs w:val="40"/>
-              </w:rPr>
-              <w:t>ÿÈ</w:t>
-            </w:r>
-            <w:proofErr w:type="spellEnd"/>
-            <w:r>
-              <w:rPr>
-                <w:rFonts w:ascii="BRH Devanagari Extra" w:hAnsi="BRH Devanagari Extra" w:cs="BRH Devanagari Extra"/>
-                <w:color w:val="000000"/>
-                <w:sz w:val="40"/>
-                <w:szCs w:val="40"/>
-              </w:rPr>
-              <w:t xml:space="preserve"> | </w:t>
-            </w:r>
-          </w:p>
-          <w:p>
-            <w:pPr>
-              <w:spacing w:before="0" w:line="240" w:lineRule="auto"/>
-              <w:rPr>
-                <w:rFonts w:ascii="BRH Devanagari Extra" w:hAnsi="BRH Devanagari Extra" w:cs="BRH Devanagari Extra"/>
-                <w:color w:val="000000"/>
-                <w:sz w:val="40"/>
-                <w:szCs w:val="40"/>
-              </w:rPr>
-            </w:pPr>
-            <w:proofErr w:type="spellStart"/>
-            <w:r>
-              <w:rPr>
-                <w:rFonts w:ascii="BRH Devanagari Extra" w:hAnsi="BRH Devanagari Extra" w:cs="BRH Devanagari Extra"/>
-                <w:color w:val="000000"/>
-                <w:sz w:val="40"/>
-                <w:szCs w:val="40"/>
-              </w:rPr>
-              <w:t>mÉ</w:t>
-            </w:r>
-            <w:proofErr w:type="spellEnd"/>
             <w:r>
               <w:rPr>
                 <w:rFonts w:ascii="BRH Malayalam Extra" w:hAnsi="BRH Malayalam Extra" w:cs="BRH Devanagari Extra"/>
@@ -10804,19 +12139,8 @@
                 <w:sz w:val="40"/>
                 <w:szCs w:val="40"/>
               </w:rPr>
-              <w:t xml:space="preserve"> </w:t>
-            </w:r>
-            <w:proofErr w:type="spellStart"/>
-            <w:r>
-              <w:rPr>
-                <w:rFonts w:ascii="BRH Devanagari Extra" w:hAnsi="BRH Devanagari Extra" w:cs="BRH Devanagari Extra"/>
-                <w:color w:val="000000"/>
-                <w:sz w:val="40"/>
-                <w:szCs w:val="40"/>
-              </w:rPr>
-              <w:t>SÏbÉïrÉÉ</w:t>
-            </w:r>
-            <w:proofErr w:type="spellEnd"/>
+              <w:t xml:space="preserve"> SÏbÉïrÉÉ</w:t>
+            </w:r>
             <w:r>
               <w:rPr>
                 <w:rFonts w:ascii="BRH Malayalam Extra" w:hAnsi="BRH Malayalam Extra" w:cs="BRH Devanagari Extra"/>
@@ -10888,37 +12212,25 @@
               </w:rPr>
               <w:t>–</w:t>
             </w:r>
-            <w:proofErr w:type="spellStart"/>
-            <w:r>
-              <w:rPr>
-                <w:rFonts w:ascii="BRH Devanagari Extra" w:hAnsi="BRH Devanagari Extra" w:cs="BRH Devanagari Extra"/>
-                <w:color w:val="000000"/>
-                <w:sz w:val="40"/>
-                <w:szCs w:val="40"/>
-              </w:rPr>
-              <w:t>xÉ</w:t>
-            </w:r>
-            <w:proofErr w:type="spellEnd"/>
-            <w:r>
-              <w:rPr>
-                <w:rFonts w:ascii="BRH Devanagari Extra" w:hAnsi="BRH Devanagari Extra" w:cs="BRH Devanagari Extra"/>
-                <w:color w:val="000000"/>
-                <w:sz w:val="40"/>
-                <w:szCs w:val="40"/>
-              </w:rPr>
-              <w:t>×</w:t>
-            </w:r>
-            <w:r>
-              <w:rPr>
-                <w:rFonts w:ascii="BRH Malayalam Extra" w:hAnsi="BRH Malayalam Extra" w:cs="BRH Devanagari Extra"/>
-                <w:b/>
-                <w:color w:val="000000"/>
-                <w:sz w:val="32"/>
-                <w:szCs w:val="40"/>
-              </w:rPr>
-              <w:t>–</w:t>
-            </w:r>
-            <w:proofErr w:type="spellStart"/>
+            <w:r>
+              <w:rPr>
+                <w:rFonts w:ascii="BRH Devanagari Extra" w:hAnsi="BRH Devanagari Extra" w:cs="BRH Devanagari Extra"/>
+                <w:color w:val="000000"/>
+                <w:sz w:val="40"/>
+                <w:szCs w:val="40"/>
+              </w:rPr>
+              <w:t>xÉ×</w:t>
+            </w:r>
+            <w:r>
+              <w:rPr>
+                <w:rFonts w:ascii="BRH Malayalam Extra" w:hAnsi="BRH Malayalam Extra" w:cs="BRH Devanagari Extra"/>
+                <w:b/>
+                <w:color w:val="000000"/>
+                <w:sz w:val="32"/>
+                <w:szCs w:val="40"/>
+              </w:rPr>
+              <w:t>–</w:t>
+            </w:r>
             <w:r>
               <w:rPr>
                 <w:rFonts w:ascii="BRH Devanagari Extra" w:hAnsi="BRH Devanagari Extra" w:cs="BRH Devanagari Extra"/>
@@ -10928,48 +12240,25 @@
               </w:rPr>
               <w:t>eÉ</w:t>
             </w:r>
-            <w:proofErr w:type="spellEnd"/>
-            <w:r>
-              <w:rPr>
-                <w:rFonts w:ascii="BRH Malayalam Extra" w:hAnsi="BRH Malayalam Extra" w:cs="BRH Devanagari Extra"/>
-                <w:b/>
-                <w:color w:val="000000"/>
-                <w:sz w:val="32"/>
-                <w:szCs w:val="40"/>
-              </w:rPr>
-              <w:t>–</w:t>
-            </w:r>
-            <w:proofErr w:type="spellStart"/>
-            <w:r>
-              <w:rPr>
-                <w:rFonts w:ascii="BRH Devanagari Extra" w:hAnsi="BRH Devanagari Extra" w:cs="BRH Devanagari Extra"/>
-                <w:color w:val="000000"/>
-                <w:sz w:val="40"/>
-                <w:szCs w:val="40"/>
-              </w:rPr>
-              <w:t>iÉç</w:t>
-            </w:r>
-            <w:proofErr w:type="spellEnd"/>
-            <w:r>
-              <w:rPr>
-                <w:rFonts w:ascii="BRH Devanagari Extra" w:hAnsi="BRH Devanagari Extra" w:cs="BRH Devanagari Extra"/>
-                <w:color w:val="000000"/>
-                <w:sz w:val="40"/>
-                <w:szCs w:val="40"/>
-              </w:rPr>
-              <w:t xml:space="preserve"> </w:t>
-            </w:r>
-            <w:proofErr w:type="spellStart"/>
-            <w:r>
-              <w:rPr>
-                <w:rFonts w:ascii="BRH Devanagari Extra" w:hAnsi="BRH Devanagari Extra" w:cs="BRH Devanagari Extra"/>
-                <w:color w:val="000000"/>
-                <w:sz w:val="40"/>
-                <w:szCs w:val="40"/>
-              </w:rPr>
-              <w:t>mÉ</w:t>
-            </w:r>
-            <w:proofErr w:type="spellEnd"/>
+            <w:r>
+              <w:rPr>
+                <w:rFonts w:ascii="BRH Malayalam Extra" w:hAnsi="BRH Malayalam Extra" w:cs="BRH Devanagari Extra"/>
+                <w:b/>
+                <w:color w:val="000000"/>
+                <w:sz w:val="32"/>
+                <w:szCs w:val="40"/>
+              </w:rPr>
+              <w:t>–</w:t>
+            </w:r>
+            <w:r>
+              <w:rPr>
+                <w:rFonts w:ascii="BRH Devanagari Extra" w:hAnsi="BRH Devanagari Extra" w:cs="BRH Devanagari Extra"/>
+                <w:color w:val="000000"/>
+                <w:sz w:val="40"/>
+                <w:szCs w:val="40"/>
+              </w:rPr>
+              <w:t>iÉç mÉ</w:t>
+            </w:r>
             <w:r>
               <w:rPr>
                 <w:rFonts w:ascii="BRH Malayalam Extra" w:hAnsi="BRH Malayalam Extra" w:cs="BRH Devanagari Extra"/>
@@ -11025,7 +12314,6 @@
                 <w:szCs w:val="40"/>
               </w:rPr>
             </w:pPr>
-            <w:proofErr w:type="spellStart"/>
             <w:r>
               <w:rPr>
                 <w:rFonts w:ascii="BRH Devanagari Extra" w:hAnsi="BRH Devanagari Extra" w:cs="BRH Devanagari Extra"/>
@@ -11035,7 +12323,6 @@
               </w:rPr>
               <w:t>mÉ</w:t>
             </w:r>
-            <w:proofErr w:type="spellEnd"/>
             <w:r>
               <w:rPr>
                 <w:rFonts w:ascii="BRH Malayalam Extra" w:hAnsi="BRH Malayalam Extra" w:cs="BRH Devanagari Extra"/>
@@ -11064,19 +12351,8 @@
                 <w:sz w:val="40"/>
                 <w:szCs w:val="40"/>
               </w:rPr>
-              <w:t xml:space="preserve"> </w:t>
-            </w:r>
-            <w:proofErr w:type="spellStart"/>
-            <w:r>
-              <w:rPr>
-                <w:rFonts w:ascii="BRH Devanagari Extra" w:hAnsi="BRH Devanagari Extra" w:cs="BRH Devanagari Extra"/>
-                <w:color w:val="000000"/>
-                <w:sz w:val="40"/>
-                <w:szCs w:val="40"/>
-              </w:rPr>
-              <w:t>SÏbÉïrÉÉ</w:t>
-            </w:r>
-            <w:proofErr w:type="spellEnd"/>
+              <w:t xml:space="preserve"> SÏbÉïrÉÉ</w:t>
+            </w:r>
             <w:r>
               <w:rPr>
                 <w:rFonts w:ascii="BRH Malayalam Extra" w:hAnsi="BRH Malayalam Extra" w:cs="BRH Devanagari Extra"/>
@@ -11290,7 +12566,6 @@
                 <w:szCs w:val="40"/>
               </w:rPr>
             </w:pPr>
-            <w:proofErr w:type="spellStart"/>
             <w:r>
               <w:rPr>
                 <w:rFonts w:ascii="BRH Devanagari Extra" w:hAnsi="BRH Devanagari Extra" w:cs="BRH Devanagari Extra"/>
@@ -11300,7 +12575,6 @@
               </w:rPr>
               <w:t>qÉ</w:t>
             </w:r>
-            <w:proofErr w:type="spellEnd"/>
             <w:r>
               <w:rPr>
                 <w:rFonts w:ascii="BRH Malayalam Extra" w:hAnsi="BRH Malayalam Extra" w:cs="BRH Devanagari Extra"/>
@@ -11385,7 +12659,6 @@
                 <w:szCs w:val="40"/>
               </w:rPr>
             </w:pPr>
-            <w:proofErr w:type="spellStart"/>
             <w:r>
               <w:rPr>
                 <w:rFonts w:ascii="BRH Devanagari Extra" w:hAnsi="BRH Devanagari Extra" w:cs="BRH Devanagari Extra"/>
@@ -11395,7 +12668,6 @@
               </w:rPr>
               <w:t>qÉ</w:t>
             </w:r>
-            <w:proofErr w:type="spellEnd"/>
             <w:r>
               <w:rPr>
                 <w:rFonts w:ascii="BRH Malayalam Extra" w:hAnsi="BRH Malayalam Extra" w:cs="BRH Devanagari Extra"/>
@@ -11444,19 +12716,8 @@
                 <w:sz w:val="40"/>
                 <w:szCs w:val="40"/>
               </w:rPr>
-              <w:t xml:space="preserve"> </w:t>
-            </w:r>
-            <w:proofErr w:type="spellStart"/>
-            <w:r>
-              <w:rPr>
-                <w:rFonts w:ascii="BRH Devanagari Extra" w:hAnsi="BRH Devanagari Extra" w:cs="BRH Devanagari Extra"/>
-                <w:color w:val="000000"/>
-                <w:sz w:val="40"/>
-                <w:szCs w:val="40"/>
-              </w:rPr>
-              <w:t>qÉ</w:t>
-            </w:r>
-            <w:proofErr w:type="spellEnd"/>
+              <w:t xml:space="preserve"> qÉ</w:t>
+            </w:r>
             <w:r>
               <w:rPr>
                 <w:rFonts w:ascii="BRH Malayalam Extra" w:hAnsi="BRH Malayalam Extra" w:cs="BRH Devanagari Extra"/>
@@ -11513,7 +12774,6 @@
                 <w:szCs w:val="40"/>
               </w:rPr>
             </w:pPr>
-            <w:proofErr w:type="spellStart"/>
             <w:r>
               <w:rPr>
                 <w:rFonts w:ascii="BRH Devanagari Extra" w:hAnsi="BRH Devanagari Extra" w:cs="BRH Devanagari Extra"/>
@@ -11523,7 +12783,6 @@
               </w:rPr>
               <w:t>qÉ</w:t>
             </w:r>
-            <w:proofErr w:type="spellEnd"/>
             <w:r>
               <w:rPr>
                 <w:rFonts w:ascii="BRH Malayalam Extra" w:hAnsi="BRH Malayalam Extra" w:cs="BRH Devanagari Extra"/>
@@ -11608,7 +12867,6 @@
                 <w:szCs w:val="40"/>
               </w:rPr>
             </w:pPr>
-            <w:proofErr w:type="spellStart"/>
             <w:r>
               <w:rPr>
                 <w:rFonts w:ascii="BRH Devanagari Extra" w:hAnsi="BRH Devanagari Extra" w:cs="BRH Devanagari Extra"/>
@@ -11618,7 +12876,6 @@
               </w:rPr>
               <w:t>qÉ</w:t>
             </w:r>
-            <w:proofErr w:type="spellEnd"/>
             <w:r>
               <w:rPr>
                 <w:rFonts w:ascii="BRH Malayalam Extra" w:hAnsi="BRH Malayalam Extra" w:cs="BRH Devanagari Extra"/>
@@ -11667,19 +12924,8 @@
                 <w:sz w:val="40"/>
                 <w:szCs w:val="40"/>
               </w:rPr>
-              <w:t xml:space="preserve"> </w:t>
-            </w:r>
-            <w:proofErr w:type="spellStart"/>
-            <w:r>
-              <w:rPr>
-                <w:rFonts w:ascii="BRH Devanagari Extra" w:hAnsi="BRH Devanagari Extra" w:cs="BRH Devanagari Extra"/>
-                <w:color w:val="000000"/>
-                <w:sz w:val="40"/>
-                <w:szCs w:val="40"/>
-              </w:rPr>
-              <w:t>qÉ</w:t>
-            </w:r>
-            <w:proofErr w:type="spellEnd"/>
+              <w:t xml:space="preserve"> qÉ</w:t>
+            </w:r>
             <w:r>
               <w:rPr>
                 <w:rFonts w:ascii="BRH Malayalam Extra" w:hAnsi="BRH Malayalam Extra" w:cs="BRH Devanagari Extra"/>
@@ -11890,7 +13136,6 @@
           <w:szCs w:val="32"/>
           <w:u w:val="single"/>
         </w:rPr>
-        <w:lastRenderedPageBreak/>
         <w:t xml:space="preserve">TS </w:t>
       </w:r>
       <w:r>
@@ -12217,6 +13462,7 @@
                 <w:sz w:val="40"/>
                 <w:szCs w:val="40"/>
               </w:rPr>
+              <w:lastRenderedPageBreak/>
               <w:t>A</w:t>
             </w:r>
             <w:r>
@@ -12312,6 +13558,7 @@
                 <w:sz w:val="40"/>
                 <w:szCs w:val="40"/>
               </w:rPr>
+              <w:lastRenderedPageBreak/>
               <w:t xml:space="preserve">AÉ </w:t>
             </w:r>
             <w:proofErr w:type="spellStart"/>
@@ -12383,27 +13630,7 @@
                 <w:sz w:val="40"/>
                 <w:szCs w:val="40"/>
               </w:rPr>
-              <w:t xml:space="preserve"> </w:t>
-            </w:r>
-            <w:proofErr w:type="spellStart"/>
-            <w:r>
-              <w:rPr>
-                <w:rFonts w:ascii="BRH Devanagari Extra" w:hAnsi="BRH Devanagari Extra" w:cs="BRH Devanagari Extra"/>
-                <w:color w:val="000000"/>
-                <w:sz w:val="40"/>
-                <w:szCs w:val="40"/>
-              </w:rPr>
-              <w:t>uÉ</w:t>
-            </w:r>
-            <w:proofErr w:type="spellEnd"/>
-            <w:r>
-              <w:rPr>
-                <w:rFonts w:ascii="BRH Devanagari Extra" w:hAnsi="BRH Devanagari Extra" w:cs="BRH Devanagari Extra"/>
-                <w:color w:val="000000"/>
-                <w:sz w:val="40"/>
-                <w:szCs w:val="40"/>
-              </w:rPr>
-              <w:t>×</w:t>
+              <w:t xml:space="preserve"> uÉ×</w:t>
             </w:r>
             <w:r>
               <w:rPr>
@@ -12415,7 +13642,6 @@
               </w:rPr>
               <w:t>–</w:t>
             </w:r>
-            <w:proofErr w:type="spellStart"/>
             <w:r>
               <w:rPr>
                 <w:rFonts w:ascii="BRH Devanagari Extra" w:hAnsi="BRH Devanagari Extra" w:cs="BRH Devanagari Extra"/>
@@ -12425,7 +13651,6 @@
               </w:rPr>
               <w:t>wÉ</w:t>
             </w:r>
-            <w:proofErr w:type="spellEnd"/>
             <w:r>
               <w:rPr>
                 <w:rFonts w:ascii="BRH Malayalam Extra" w:hAnsi="BRH Malayalam Extra" w:cs="BRH Devanagari Extra"/>
@@ -12483,6 +13708,7 @@
                 <w:sz w:val="40"/>
                 <w:szCs w:val="40"/>
               </w:rPr>
+              <w:lastRenderedPageBreak/>
               <w:t>A</w:t>
             </w:r>
             <w:r>
@@ -12589,6 +13815,7 @@
                 <w:sz w:val="40"/>
                 <w:szCs w:val="40"/>
               </w:rPr>
+              <w:lastRenderedPageBreak/>
               <w:t xml:space="preserve">AÉ </w:t>
             </w:r>
             <w:proofErr w:type="spellStart"/>
@@ -12660,27 +13887,7 @@
                 <w:sz w:val="40"/>
                 <w:szCs w:val="40"/>
               </w:rPr>
-              <w:t xml:space="preserve"> </w:t>
-            </w:r>
-            <w:proofErr w:type="spellStart"/>
-            <w:r>
-              <w:rPr>
-                <w:rFonts w:ascii="BRH Devanagari Extra" w:hAnsi="BRH Devanagari Extra" w:cs="BRH Devanagari Extra"/>
-                <w:color w:val="000000"/>
-                <w:sz w:val="40"/>
-                <w:szCs w:val="40"/>
-              </w:rPr>
-              <w:t>uÉ</w:t>
-            </w:r>
-            <w:proofErr w:type="spellEnd"/>
-            <w:r>
-              <w:rPr>
-                <w:rFonts w:ascii="BRH Devanagari Extra" w:hAnsi="BRH Devanagari Extra" w:cs="BRH Devanagari Extra"/>
-                <w:color w:val="000000"/>
-                <w:sz w:val="40"/>
-                <w:szCs w:val="40"/>
-              </w:rPr>
-              <w:t>×</w:t>
+              <w:t xml:space="preserve"> uÉ×</w:t>
             </w:r>
             <w:r>
               <w:rPr>
@@ -12692,7 +13899,6 @@
               </w:rPr>
               <w:t>–</w:t>
             </w:r>
-            <w:proofErr w:type="spellStart"/>
             <w:r>
               <w:rPr>
                 <w:rFonts w:ascii="BRH Devanagari Extra" w:hAnsi="BRH Devanagari Extra" w:cs="BRH Devanagari Extra"/>
@@ -12702,7 +13908,6 @@
               </w:rPr>
               <w:t>wÉ</w:t>
             </w:r>
-            <w:proofErr w:type="spellEnd"/>
             <w:r>
               <w:rPr>
                 <w:rFonts w:ascii="BRH Malayalam Extra" w:hAnsi="BRH Malayalam Extra" w:cs="BRH Devanagari Extra"/>
@@ -12795,25 +14000,14 @@
               </w:rPr>
               <w:t>(</w:t>
             </w:r>
-            <w:proofErr w:type="spellStart"/>
-            <w:r>
-              <w:rPr>
-                <w:rFonts w:cs="Arial"/>
-                <w:color w:val="000000"/>
-                <w:sz w:val="28"/>
-                <w:szCs w:val="28"/>
-              </w:rPr>
-              <w:t>avagraha</w:t>
-            </w:r>
-            <w:proofErr w:type="spellEnd"/>
-            <w:r>
-              <w:rPr>
-                <w:rFonts w:cs="Arial"/>
-                <w:color w:val="000000"/>
-                <w:sz w:val="28"/>
-                <w:szCs w:val="28"/>
-              </w:rPr>
-              <w:t xml:space="preserve"> to indicate</w:t>
+            <w:r>
+              <w:rPr>
+                <w:rFonts w:cs="Arial"/>
+                <w:color w:val="000000"/>
+                <w:sz w:val="28"/>
+                <w:szCs w:val="28"/>
+              </w:rPr>
+              <w:t>avagraha to indicate</w:t>
             </w:r>
             <w:r>
               <w:rPr>
@@ -12879,10 +14073,9 @@
           <w:b/>
           <w:sz w:val="36"/>
         </w:rPr>
+        <w:lastRenderedPageBreak/>
         <w:t>=======================</w:t>
       </w:r>
-      <w:bookmarkStart w:id="0" w:name="_GoBack"/>
-      <w:bookmarkEnd w:id="0"/>
     </w:p>
     <w:sectPr>
       <w:headerReference w:type="even" r:id="rId7"/>
@@ -12899,7 +14092,7 @@
 </file>
 
 <file path=word/endnotes.xml><?xml version="1.0" encoding="utf-8"?>
-<w:endnotes xmlns:wpc="http://schemas.microsoft.com/office/word/2010/wordprocessingCanvas" xmlns:cx="http://schemas.microsoft.com/office/drawing/2014/chartex" xmlns:cx1="http://schemas.microsoft.com/office/drawing/2015/9/8/chartex" xmlns:mc="http://schemas.openxmlformats.org/markup-compatibility/2006" xmlns:o="urn:schemas-microsoft-com:office:office" xmlns:r="http://schemas.openxmlformats.org/officeDocument/2006/relationships" xmlns:m="http://schemas.openxmlformats.org/officeDocument/2006/math" xmlns:v="urn:schemas-microsoft-com:vml" xmlns:wp14="http://schemas.microsoft.com/office/word/2010/wordprocessingDrawing" xmlns:wp="http://schemas.openxmlformats.org/drawingml/2006/wordprocessingDrawing" xmlns:w10="urn:schemas-microsoft-com:office:word" xmlns:w="http://schemas.openxmlformats.org/wordprocessingml/2006/main" xmlns:w14="http://schemas.microsoft.com/office/word/2010/wordml" xmlns:w15="http://schemas.microsoft.com/office/word/2012/wordml" xmlns:w16se="http://schemas.microsoft.com/office/word/2015/wordml/symex" xmlns:wpg="http://schemas.microsoft.com/office/word/2010/wordprocessingGroup" xmlns:wpi="http://schemas.microsoft.com/office/word/2010/wordprocessingInk" xmlns:wne="http://schemas.microsoft.com/office/word/2006/wordml" xmlns:wps="http://schemas.microsoft.com/office/word/2010/wordprocessingShape" mc:Ignorable="w14 w15 w16se wp14">
+<w:endnotes xmlns:wpc="http://schemas.microsoft.com/office/word/2010/wordprocessingCanvas" xmlns:cx="http://schemas.microsoft.com/office/drawing/2014/chartex" xmlns:cx1="http://schemas.microsoft.com/office/drawing/2015/9/8/chartex" xmlns:cx2="http://schemas.microsoft.com/office/drawing/2015/10/21/chartex" xmlns:cx3="http://schemas.microsoft.com/office/drawing/2016/5/9/chartex" xmlns:cx4="http://schemas.microsoft.com/office/drawing/2016/5/10/chartex" xmlns:cx5="http://schemas.microsoft.com/office/drawing/2016/5/11/chartex" xmlns:cx6="http://schemas.microsoft.com/office/drawing/2016/5/12/chartex" xmlns:cx7="http://schemas.microsoft.com/office/drawing/2016/5/13/chartex" xmlns:cx8="http://schemas.microsoft.com/office/drawing/2016/5/14/chartex" xmlns:mc="http://schemas.openxmlformats.org/markup-compatibility/2006" xmlns:aink="http://schemas.microsoft.com/office/drawing/2016/ink" xmlns:am3d="http://schemas.microsoft.com/office/drawing/2017/model3d" xmlns:o="urn:schemas-microsoft-com:office:office" xmlns:oel="http://schemas.microsoft.com/office/2019/extlst" xmlns:r="http://schemas.openxmlformats.org/officeDocument/2006/relationships" xmlns:m="http://schemas.openxmlformats.org/officeDocument/2006/math" xmlns:v="urn:schemas-microsoft-com:vml" xmlns:wp14="http://schemas.microsoft.com/office/word/2010/wordprocessingDrawing" xmlns:wp="http://schemas.openxmlformats.org/drawingml/2006/wordprocessingDrawing" xmlns:w10="urn:schemas-microsoft-com:office:word" xmlns:w="http://schemas.openxmlformats.org/wordprocessingml/2006/main" xmlns:w14="http://schemas.microsoft.com/office/word/2010/wordml" xmlns:w15="http://schemas.microsoft.com/office/word/2012/wordml" xmlns:w16cex="http://schemas.microsoft.com/office/word/2018/wordml/cex" xmlns:w16cid="http://schemas.microsoft.com/office/word/2016/wordml/cid" xmlns:w16="http://schemas.microsoft.com/office/word/2018/wordml" xmlns:w16du="http://schemas.microsoft.com/office/word/2023/wordml/word16du" xmlns:w16sdtdh="http://schemas.microsoft.com/office/word/2020/wordml/sdtdatahash" xmlns:w16sdtfl="http://schemas.microsoft.com/office/word/2024/wordml/sdtformatlock" xmlns:w16se="http://schemas.microsoft.com/office/word/2015/wordml/symex" xmlns:wpg="http://schemas.microsoft.com/office/word/2010/wordprocessingGroup" xmlns:wpi="http://schemas.microsoft.com/office/word/2010/wordprocessingInk" xmlns:wne="http://schemas.microsoft.com/office/word/2006/wordml" xmlns:wps="http://schemas.microsoft.com/office/word/2010/wordprocessingShape" mc:Ignorable="w14 w15 w16se w16cid w16 w16cex w16sdtdh w16sdtfl w16du wp14">
   <w:endnote w:type="separator" w:id="-1">
     <w:p>
       <w:pPr>
@@ -12924,7 +14117,7 @@
 </file>
 
 <file path=word/footer1.xml><?xml version="1.0" encoding="utf-8"?>
-<w:ftr xmlns:wpc="http://schemas.microsoft.com/office/word/2010/wordprocessingCanvas" xmlns:cx="http://schemas.microsoft.com/office/drawing/2014/chartex" xmlns:cx1="http://schemas.microsoft.com/office/drawing/2015/9/8/chartex" xmlns:mc="http://schemas.openxmlformats.org/markup-compatibility/2006" xmlns:o="urn:schemas-microsoft-com:office:office" xmlns:r="http://schemas.openxmlformats.org/officeDocument/2006/relationships" xmlns:m="http://schemas.openxmlformats.org/officeDocument/2006/math" xmlns:v="urn:schemas-microsoft-com:vml" xmlns:wp14="http://schemas.microsoft.com/office/word/2010/wordprocessingDrawing" xmlns:wp="http://schemas.openxmlformats.org/drawingml/2006/wordprocessingDrawing" xmlns:w10="urn:schemas-microsoft-com:office:word" xmlns:w="http://schemas.openxmlformats.org/wordprocessingml/2006/main" xmlns:w14="http://schemas.microsoft.com/office/word/2010/wordml" xmlns:w15="http://schemas.microsoft.com/office/word/2012/wordml" xmlns:w16se="http://schemas.microsoft.com/office/word/2015/wordml/symex" xmlns:wpg="http://schemas.microsoft.com/office/word/2010/wordprocessingGroup" xmlns:wpi="http://schemas.microsoft.com/office/word/2010/wordprocessingInk" xmlns:wne="http://schemas.microsoft.com/office/word/2006/wordml" xmlns:wps="http://schemas.microsoft.com/office/word/2010/wordprocessingShape" mc:Ignorable="w14 w15 w16se wp14">
+<w:ftr xmlns:wpc="http://schemas.microsoft.com/office/word/2010/wordprocessingCanvas" xmlns:cx="http://schemas.microsoft.com/office/drawing/2014/chartex" xmlns:cx1="http://schemas.microsoft.com/office/drawing/2015/9/8/chartex" xmlns:cx2="http://schemas.microsoft.com/office/drawing/2015/10/21/chartex" xmlns:cx3="http://schemas.microsoft.com/office/drawing/2016/5/9/chartex" xmlns:cx4="http://schemas.microsoft.com/office/drawing/2016/5/10/chartex" xmlns:cx5="http://schemas.microsoft.com/office/drawing/2016/5/11/chartex" xmlns:cx6="http://schemas.microsoft.com/office/drawing/2016/5/12/chartex" xmlns:cx7="http://schemas.microsoft.com/office/drawing/2016/5/13/chartex" xmlns:cx8="http://schemas.microsoft.com/office/drawing/2016/5/14/chartex" xmlns:mc="http://schemas.openxmlformats.org/markup-compatibility/2006" xmlns:aink="http://schemas.microsoft.com/office/drawing/2016/ink" xmlns:am3d="http://schemas.microsoft.com/office/drawing/2017/model3d" xmlns:o="urn:schemas-microsoft-com:office:office" xmlns:oel="http://schemas.microsoft.com/office/2019/extlst" xmlns:r="http://schemas.openxmlformats.org/officeDocument/2006/relationships" xmlns:m="http://schemas.openxmlformats.org/officeDocument/2006/math" xmlns:v="urn:schemas-microsoft-com:vml" xmlns:wp14="http://schemas.microsoft.com/office/word/2010/wordprocessingDrawing" xmlns:wp="http://schemas.openxmlformats.org/drawingml/2006/wordprocessingDrawing" xmlns:w10="urn:schemas-microsoft-com:office:word" xmlns:w="http://schemas.openxmlformats.org/wordprocessingml/2006/main" xmlns:w14="http://schemas.microsoft.com/office/word/2010/wordml" xmlns:w15="http://schemas.microsoft.com/office/word/2012/wordml" xmlns:w16cex="http://schemas.microsoft.com/office/word/2018/wordml/cex" xmlns:w16cid="http://schemas.microsoft.com/office/word/2016/wordml/cid" xmlns:w16="http://schemas.microsoft.com/office/word/2018/wordml" xmlns:w16du="http://schemas.microsoft.com/office/word/2023/wordml/word16du" xmlns:w16sdtdh="http://schemas.microsoft.com/office/word/2020/wordml/sdtdatahash" xmlns:w16sdtfl="http://schemas.microsoft.com/office/word/2024/wordml/sdtformatlock" xmlns:w16se="http://schemas.microsoft.com/office/word/2015/wordml/symex" xmlns:wpg="http://schemas.microsoft.com/office/word/2010/wordprocessingGroup" xmlns:wpi="http://schemas.microsoft.com/office/word/2010/wordprocessingInk" xmlns:wne="http://schemas.microsoft.com/office/word/2006/wordml" xmlns:wps="http://schemas.microsoft.com/office/word/2010/wordprocessingShape" mc:Ignorable="w14 w15 w16se w16cid w16 w16cex w16sdtdh w16sdtfl w16du wp14">
   <w:p>
     <w:pPr>
       <w:pBdr>
@@ -13106,7 +14299,7 @@
 </file>
 
 <file path=word/footer2.xml><?xml version="1.0" encoding="utf-8"?>
-<w:ftr xmlns:wpc="http://schemas.microsoft.com/office/word/2010/wordprocessingCanvas" xmlns:cx="http://schemas.microsoft.com/office/drawing/2014/chartex" xmlns:cx1="http://schemas.microsoft.com/office/drawing/2015/9/8/chartex" xmlns:mc="http://schemas.openxmlformats.org/markup-compatibility/2006" xmlns:o="urn:schemas-microsoft-com:office:office" xmlns:r="http://schemas.openxmlformats.org/officeDocument/2006/relationships" xmlns:m="http://schemas.openxmlformats.org/officeDocument/2006/math" xmlns:v="urn:schemas-microsoft-com:vml" xmlns:wp14="http://schemas.microsoft.com/office/word/2010/wordprocessingDrawing" xmlns:wp="http://schemas.openxmlformats.org/drawingml/2006/wordprocessingDrawing" xmlns:w10="urn:schemas-microsoft-com:office:word" xmlns:w="http://schemas.openxmlformats.org/wordprocessingml/2006/main" xmlns:w14="http://schemas.microsoft.com/office/word/2010/wordml" xmlns:w15="http://schemas.microsoft.com/office/word/2012/wordml" xmlns:w16se="http://schemas.microsoft.com/office/word/2015/wordml/symex" xmlns:wpg="http://schemas.microsoft.com/office/word/2010/wordprocessingGroup" xmlns:wpi="http://schemas.microsoft.com/office/word/2010/wordprocessingInk" xmlns:wne="http://schemas.microsoft.com/office/word/2006/wordml" xmlns:wps="http://schemas.microsoft.com/office/word/2010/wordprocessingShape" mc:Ignorable="w14 w15 w16se wp14">
+<w:ftr xmlns:wpc="http://schemas.microsoft.com/office/word/2010/wordprocessingCanvas" xmlns:cx="http://schemas.microsoft.com/office/drawing/2014/chartex" xmlns:cx1="http://schemas.microsoft.com/office/drawing/2015/9/8/chartex" xmlns:cx2="http://schemas.microsoft.com/office/drawing/2015/10/21/chartex" xmlns:cx3="http://schemas.microsoft.com/office/drawing/2016/5/9/chartex" xmlns:cx4="http://schemas.microsoft.com/office/drawing/2016/5/10/chartex" xmlns:cx5="http://schemas.microsoft.com/office/drawing/2016/5/11/chartex" xmlns:cx6="http://schemas.microsoft.com/office/drawing/2016/5/12/chartex" xmlns:cx7="http://schemas.microsoft.com/office/drawing/2016/5/13/chartex" xmlns:cx8="http://schemas.microsoft.com/office/drawing/2016/5/14/chartex" xmlns:mc="http://schemas.openxmlformats.org/markup-compatibility/2006" xmlns:aink="http://schemas.microsoft.com/office/drawing/2016/ink" xmlns:am3d="http://schemas.microsoft.com/office/drawing/2017/model3d" xmlns:o="urn:schemas-microsoft-com:office:office" xmlns:oel="http://schemas.microsoft.com/office/2019/extlst" xmlns:r="http://schemas.openxmlformats.org/officeDocument/2006/relationships" xmlns:m="http://schemas.openxmlformats.org/officeDocument/2006/math" xmlns:v="urn:schemas-microsoft-com:vml" xmlns:wp14="http://schemas.microsoft.com/office/word/2010/wordprocessingDrawing" xmlns:wp="http://schemas.openxmlformats.org/drawingml/2006/wordprocessingDrawing" xmlns:w10="urn:schemas-microsoft-com:office:word" xmlns:w="http://schemas.openxmlformats.org/wordprocessingml/2006/main" xmlns:w14="http://schemas.microsoft.com/office/word/2010/wordml" xmlns:w15="http://schemas.microsoft.com/office/word/2012/wordml" xmlns:w16cex="http://schemas.microsoft.com/office/word/2018/wordml/cex" xmlns:w16cid="http://schemas.microsoft.com/office/word/2016/wordml/cid" xmlns:w16="http://schemas.microsoft.com/office/word/2018/wordml" xmlns:w16du="http://schemas.microsoft.com/office/word/2023/wordml/word16du" xmlns:w16sdtdh="http://schemas.microsoft.com/office/word/2020/wordml/sdtdatahash" xmlns:w16sdtfl="http://schemas.microsoft.com/office/word/2024/wordml/sdtformatlock" xmlns:w16se="http://schemas.microsoft.com/office/word/2015/wordml/symex" xmlns:wpg="http://schemas.microsoft.com/office/word/2010/wordprocessingGroup" xmlns:wpi="http://schemas.microsoft.com/office/word/2010/wordprocessingInk" xmlns:wne="http://schemas.microsoft.com/office/word/2006/wordml" xmlns:wps="http://schemas.microsoft.com/office/word/2010/wordprocessingShape" mc:Ignorable="w14 w15 w16se w16cid w16 w16cex w16sdtdh w16sdtfl w16du wp14">
   <w:p>
     <w:pPr>
       <w:pBdr>
@@ -13309,7 +14502,7 @@
 </file>
 
 <file path=word/footnotes.xml><?xml version="1.0" encoding="utf-8"?>
-<w:footnotes xmlns:wpc="http://schemas.microsoft.com/office/word/2010/wordprocessingCanvas" xmlns:cx="http://schemas.microsoft.com/office/drawing/2014/chartex" xmlns:cx1="http://schemas.microsoft.com/office/drawing/2015/9/8/chartex" xmlns:mc="http://schemas.openxmlformats.org/markup-compatibility/2006" xmlns:o="urn:schemas-microsoft-com:office:office" xmlns:r="http://schemas.openxmlformats.org/officeDocument/2006/relationships" xmlns:m="http://schemas.openxmlformats.org/officeDocument/2006/math" xmlns:v="urn:schemas-microsoft-com:vml" xmlns:wp14="http://schemas.microsoft.com/office/word/2010/wordprocessingDrawing" xmlns:wp="http://schemas.openxmlformats.org/drawingml/2006/wordprocessingDrawing" xmlns:w10="urn:schemas-microsoft-com:office:word" xmlns:w="http://schemas.openxmlformats.org/wordprocessingml/2006/main" xmlns:w14="http://schemas.microsoft.com/office/word/2010/wordml" xmlns:w15="http://schemas.microsoft.com/office/word/2012/wordml" xmlns:w16se="http://schemas.microsoft.com/office/word/2015/wordml/symex" xmlns:wpg="http://schemas.microsoft.com/office/word/2010/wordprocessingGroup" xmlns:wpi="http://schemas.microsoft.com/office/word/2010/wordprocessingInk" xmlns:wne="http://schemas.microsoft.com/office/word/2006/wordml" xmlns:wps="http://schemas.microsoft.com/office/word/2010/wordprocessingShape" mc:Ignorable="w14 w15 w16se wp14">
+<w:footnotes xmlns:wpc="http://schemas.microsoft.com/office/word/2010/wordprocessingCanvas" xmlns:cx="http://schemas.microsoft.com/office/drawing/2014/chartex" xmlns:cx1="http://schemas.microsoft.com/office/drawing/2015/9/8/chartex" xmlns:cx2="http://schemas.microsoft.com/office/drawing/2015/10/21/chartex" xmlns:cx3="http://schemas.microsoft.com/office/drawing/2016/5/9/chartex" xmlns:cx4="http://schemas.microsoft.com/office/drawing/2016/5/10/chartex" xmlns:cx5="http://schemas.microsoft.com/office/drawing/2016/5/11/chartex" xmlns:cx6="http://schemas.microsoft.com/office/drawing/2016/5/12/chartex" xmlns:cx7="http://schemas.microsoft.com/office/drawing/2016/5/13/chartex" xmlns:cx8="http://schemas.microsoft.com/office/drawing/2016/5/14/chartex" xmlns:mc="http://schemas.openxmlformats.org/markup-compatibility/2006" xmlns:aink="http://schemas.microsoft.com/office/drawing/2016/ink" xmlns:am3d="http://schemas.microsoft.com/office/drawing/2017/model3d" xmlns:o="urn:schemas-microsoft-com:office:office" xmlns:oel="http://schemas.microsoft.com/office/2019/extlst" xmlns:r="http://schemas.openxmlformats.org/officeDocument/2006/relationships" xmlns:m="http://schemas.openxmlformats.org/officeDocument/2006/math" xmlns:v="urn:schemas-microsoft-com:vml" xmlns:wp14="http://schemas.microsoft.com/office/word/2010/wordprocessingDrawing" xmlns:wp="http://schemas.openxmlformats.org/drawingml/2006/wordprocessingDrawing" xmlns:w10="urn:schemas-microsoft-com:office:word" xmlns:w="http://schemas.openxmlformats.org/wordprocessingml/2006/main" xmlns:w14="http://schemas.microsoft.com/office/word/2010/wordml" xmlns:w15="http://schemas.microsoft.com/office/word/2012/wordml" xmlns:w16cex="http://schemas.microsoft.com/office/word/2018/wordml/cex" xmlns:w16cid="http://schemas.microsoft.com/office/word/2016/wordml/cid" xmlns:w16="http://schemas.microsoft.com/office/word/2018/wordml" xmlns:w16du="http://schemas.microsoft.com/office/word/2023/wordml/word16du" xmlns:w16sdtdh="http://schemas.microsoft.com/office/word/2020/wordml/sdtdatahash" xmlns:w16sdtfl="http://schemas.microsoft.com/office/word/2024/wordml/sdtformatlock" xmlns:w16se="http://schemas.microsoft.com/office/word/2015/wordml/symex" xmlns:wpg="http://schemas.microsoft.com/office/word/2010/wordprocessingGroup" xmlns:wpi="http://schemas.microsoft.com/office/word/2010/wordprocessingInk" xmlns:wne="http://schemas.microsoft.com/office/word/2006/wordml" xmlns:wps="http://schemas.microsoft.com/office/word/2010/wordprocessingShape" mc:Ignorable="w14 w15 w16se w16cid w16 w16cex w16sdtdh w16sdtfl w16du wp14">
   <w:footnote w:type="separator" w:id="-1">
     <w:p>
       <w:pPr>
@@ -13334,7 +14527,7 @@
 </file>
 
 <file path=word/header1.xml><?xml version="1.0" encoding="utf-8"?>
-<w:hdr xmlns:wpc="http://schemas.microsoft.com/office/word/2010/wordprocessingCanvas" xmlns:cx="http://schemas.microsoft.com/office/drawing/2014/chartex" xmlns:cx1="http://schemas.microsoft.com/office/drawing/2015/9/8/chartex" xmlns:mc="http://schemas.openxmlformats.org/markup-compatibility/2006" xmlns:o="urn:schemas-microsoft-com:office:office" xmlns:r="http://schemas.openxmlformats.org/officeDocument/2006/relationships" xmlns:m="http://schemas.openxmlformats.org/officeDocument/2006/math" xmlns:v="urn:schemas-microsoft-com:vml" xmlns:wp14="http://schemas.microsoft.com/office/word/2010/wordprocessingDrawing" xmlns:wp="http://schemas.openxmlformats.org/drawingml/2006/wordprocessingDrawing" xmlns:w10="urn:schemas-microsoft-com:office:word" xmlns:w="http://schemas.openxmlformats.org/wordprocessingml/2006/main" xmlns:w14="http://schemas.microsoft.com/office/word/2010/wordml" xmlns:w15="http://schemas.microsoft.com/office/word/2012/wordml" xmlns:w16se="http://schemas.microsoft.com/office/word/2015/wordml/symex" xmlns:wpg="http://schemas.microsoft.com/office/word/2010/wordprocessingGroup" xmlns:wpi="http://schemas.microsoft.com/office/word/2010/wordprocessingInk" xmlns:wne="http://schemas.microsoft.com/office/word/2006/wordml" xmlns:wps="http://schemas.microsoft.com/office/word/2010/wordprocessingShape" mc:Ignorable="w14 w15 w16se wp14">
+<w:hdr xmlns:wpc="http://schemas.microsoft.com/office/word/2010/wordprocessingCanvas" xmlns:cx="http://schemas.microsoft.com/office/drawing/2014/chartex" xmlns:cx1="http://schemas.microsoft.com/office/drawing/2015/9/8/chartex" xmlns:cx2="http://schemas.microsoft.com/office/drawing/2015/10/21/chartex" xmlns:cx3="http://schemas.microsoft.com/office/drawing/2016/5/9/chartex" xmlns:cx4="http://schemas.microsoft.com/office/drawing/2016/5/10/chartex" xmlns:cx5="http://schemas.microsoft.com/office/drawing/2016/5/11/chartex" xmlns:cx6="http://schemas.microsoft.com/office/drawing/2016/5/12/chartex" xmlns:cx7="http://schemas.microsoft.com/office/drawing/2016/5/13/chartex" xmlns:cx8="http://schemas.microsoft.com/office/drawing/2016/5/14/chartex" xmlns:mc="http://schemas.openxmlformats.org/markup-compatibility/2006" xmlns:aink="http://schemas.microsoft.com/office/drawing/2016/ink" xmlns:am3d="http://schemas.microsoft.com/office/drawing/2017/model3d" xmlns:o="urn:schemas-microsoft-com:office:office" xmlns:oel="http://schemas.microsoft.com/office/2019/extlst" xmlns:r="http://schemas.openxmlformats.org/officeDocument/2006/relationships" xmlns:m="http://schemas.openxmlformats.org/officeDocument/2006/math" xmlns:v="urn:schemas-microsoft-com:vml" xmlns:wp14="http://schemas.microsoft.com/office/word/2010/wordprocessingDrawing" xmlns:wp="http://schemas.openxmlformats.org/drawingml/2006/wordprocessingDrawing" xmlns:w10="urn:schemas-microsoft-com:office:word" xmlns:w="http://schemas.openxmlformats.org/wordprocessingml/2006/main" xmlns:w14="http://schemas.microsoft.com/office/word/2010/wordml" xmlns:w15="http://schemas.microsoft.com/office/word/2012/wordml" xmlns:w16cex="http://schemas.microsoft.com/office/word/2018/wordml/cex" xmlns:w16cid="http://schemas.microsoft.com/office/word/2016/wordml/cid" xmlns:w16="http://schemas.microsoft.com/office/word/2018/wordml" xmlns:w16du="http://schemas.microsoft.com/office/word/2023/wordml/word16du" xmlns:w16sdtdh="http://schemas.microsoft.com/office/word/2020/wordml/sdtdatahash" xmlns:w16sdtfl="http://schemas.microsoft.com/office/word/2024/wordml/sdtformatlock" xmlns:w16se="http://schemas.microsoft.com/office/word/2015/wordml/symex" xmlns:wpg="http://schemas.microsoft.com/office/word/2010/wordprocessingGroup" xmlns:wpi="http://schemas.microsoft.com/office/word/2010/wordprocessingInk" xmlns:wne="http://schemas.microsoft.com/office/word/2006/wordml" xmlns:wps="http://schemas.microsoft.com/office/word/2010/wordprocessingShape" mc:Ignorable="w14 w15 w16se w16cid w16 w16cex w16sdtdh w16sdtfl w16du wp14">
   <w:p>
     <w:pPr>
       <w:pStyle w:val="Header"/>
@@ -13347,7 +14540,7 @@
 </file>
 
 <file path=word/header2.xml><?xml version="1.0" encoding="utf-8"?>
-<w:hdr xmlns:wpc="http://schemas.microsoft.com/office/word/2010/wordprocessingCanvas" xmlns:cx="http://schemas.microsoft.com/office/drawing/2014/chartex" xmlns:cx1="http://schemas.microsoft.com/office/drawing/2015/9/8/chartex" xmlns:mc="http://schemas.openxmlformats.org/markup-compatibility/2006" xmlns:o="urn:schemas-microsoft-com:office:office" xmlns:r="http://schemas.openxmlformats.org/officeDocument/2006/relationships" xmlns:m="http://schemas.openxmlformats.org/officeDocument/2006/math" xmlns:v="urn:schemas-microsoft-com:vml" xmlns:wp14="http://schemas.microsoft.com/office/word/2010/wordprocessingDrawing" xmlns:wp="http://schemas.openxmlformats.org/drawingml/2006/wordprocessingDrawing" xmlns:w10="urn:schemas-microsoft-com:office:word" xmlns:w="http://schemas.openxmlformats.org/wordprocessingml/2006/main" xmlns:w14="http://schemas.microsoft.com/office/word/2010/wordml" xmlns:w15="http://schemas.microsoft.com/office/word/2012/wordml" xmlns:w16se="http://schemas.microsoft.com/office/word/2015/wordml/symex" xmlns:wpg="http://schemas.microsoft.com/office/word/2010/wordprocessingGroup" xmlns:wpi="http://schemas.microsoft.com/office/word/2010/wordprocessingInk" xmlns:wne="http://schemas.microsoft.com/office/word/2006/wordml" xmlns:wps="http://schemas.microsoft.com/office/word/2010/wordprocessingShape" mc:Ignorable="w14 w15 w16se wp14">
+<w:hdr xmlns:wpc="http://schemas.microsoft.com/office/word/2010/wordprocessingCanvas" xmlns:cx="http://schemas.microsoft.com/office/drawing/2014/chartex" xmlns:cx1="http://schemas.microsoft.com/office/drawing/2015/9/8/chartex" xmlns:cx2="http://schemas.microsoft.com/office/drawing/2015/10/21/chartex" xmlns:cx3="http://schemas.microsoft.com/office/drawing/2016/5/9/chartex" xmlns:cx4="http://schemas.microsoft.com/office/drawing/2016/5/10/chartex" xmlns:cx5="http://schemas.microsoft.com/office/drawing/2016/5/11/chartex" xmlns:cx6="http://schemas.microsoft.com/office/drawing/2016/5/12/chartex" xmlns:cx7="http://schemas.microsoft.com/office/drawing/2016/5/13/chartex" xmlns:cx8="http://schemas.microsoft.com/office/drawing/2016/5/14/chartex" xmlns:mc="http://schemas.openxmlformats.org/markup-compatibility/2006" xmlns:aink="http://schemas.microsoft.com/office/drawing/2016/ink" xmlns:am3d="http://schemas.microsoft.com/office/drawing/2017/model3d" xmlns:o="urn:schemas-microsoft-com:office:office" xmlns:oel="http://schemas.microsoft.com/office/2019/extlst" xmlns:r="http://schemas.openxmlformats.org/officeDocument/2006/relationships" xmlns:m="http://schemas.openxmlformats.org/officeDocument/2006/math" xmlns:v="urn:schemas-microsoft-com:vml" xmlns:wp14="http://schemas.microsoft.com/office/word/2010/wordprocessingDrawing" xmlns:wp="http://schemas.openxmlformats.org/drawingml/2006/wordprocessingDrawing" xmlns:w10="urn:schemas-microsoft-com:office:word" xmlns:w="http://schemas.openxmlformats.org/wordprocessingml/2006/main" xmlns:w14="http://schemas.microsoft.com/office/word/2010/wordml" xmlns:w15="http://schemas.microsoft.com/office/word/2012/wordml" xmlns:w16cex="http://schemas.microsoft.com/office/word/2018/wordml/cex" xmlns:w16cid="http://schemas.microsoft.com/office/word/2016/wordml/cid" xmlns:w16="http://schemas.microsoft.com/office/word/2018/wordml" xmlns:w16du="http://schemas.microsoft.com/office/word/2023/wordml/word16du" xmlns:w16sdtdh="http://schemas.microsoft.com/office/word/2020/wordml/sdtdatahash" xmlns:w16sdtfl="http://schemas.microsoft.com/office/word/2024/wordml/sdtformatlock" xmlns:w16se="http://schemas.microsoft.com/office/word/2015/wordml/symex" xmlns:wpg="http://schemas.microsoft.com/office/word/2010/wordprocessingGroup" xmlns:wpi="http://schemas.microsoft.com/office/word/2010/wordprocessingInk" xmlns:wne="http://schemas.microsoft.com/office/word/2006/wordml" xmlns:wps="http://schemas.microsoft.com/office/word/2010/wordprocessingShape" mc:Ignorable="w14 w15 w16se w16cid w16 w16cex w16sdtdh w16sdtfl w16du wp14">
   <w:p>
     <w:pPr>
       <w:pStyle w:val="Header"/>
@@ -13360,7 +14553,7 @@
 </file>
 
 <file path=word/styles.xml><?xml version="1.0" encoding="utf-8"?>
-<w:styles xmlns:mc="http://schemas.openxmlformats.org/markup-compatibility/2006" xmlns:r="http://schemas.openxmlformats.org/officeDocument/2006/relationships" xmlns:w="http://schemas.openxmlformats.org/wordprocessingml/2006/main" xmlns:w14="http://schemas.microsoft.com/office/word/2010/wordml" xmlns:w15="http://schemas.microsoft.com/office/word/2012/wordml" xmlns:w16se="http://schemas.microsoft.com/office/word/2015/wordml/symex" mc:Ignorable="w14 w15 w16se">
+<w:styles xmlns:mc="http://schemas.openxmlformats.org/markup-compatibility/2006" xmlns:r="http://schemas.openxmlformats.org/officeDocument/2006/relationships" xmlns:w="http://schemas.openxmlformats.org/wordprocessingml/2006/main" xmlns:w14="http://schemas.microsoft.com/office/word/2010/wordml" xmlns:w15="http://schemas.microsoft.com/office/word/2012/wordml" xmlns:w16cex="http://schemas.microsoft.com/office/word/2018/wordml/cex" xmlns:w16cid="http://schemas.microsoft.com/office/word/2016/wordml/cid" xmlns:w16="http://schemas.microsoft.com/office/word/2018/wordml" xmlns:w16du="http://schemas.microsoft.com/office/word/2023/wordml/word16du" xmlns:w16sdtdh="http://schemas.microsoft.com/office/word/2020/wordml/sdtdatahash" xmlns:w16sdtfl="http://schemas.microsoft.com/office/word/2024/wordml/sdtformatlock" xmlns:w16se="http://schemas.microsoft.com/office/word/2015/wordml/symex" mc:Ignorable="w14 w15 w16se w16cid w16 w16cex w16sdtdh w16sdtfl w16du">
   <w:docDefaults>
     <w:rPrDefault>
       <w:rPr>
@@ -13370,7 +14563,7 @@
     </w:rPrDefault>
     <w:pPrDefault/>
   </w:docDefaults>
-  <w:latentStyles w:defLockedState="0" w:defUIPriority="99" w:defSemiHidden="0" w:defUnhideWhenUsed="0" w:defQFormat="0" w:count="371">
+  <w:latentStyles w:defLockedState="0" w:defUIPriority="99" w:defSemiHidden="0" w:defUnhideWhenUsed="0" w:defQFormat="0" w:count="376">
     <w:lsdException w:name="Normal" w:uiPriority="0" w:qFormat="1"/>
     <w:lsdException w:name="heading 1" w:uiPriority="9" w:qFormat="1"/>
     <w:lsdException w:name="heading 2" w:semiHidden="1" w:uiPriority="9" w:unhideWhenUsed="1" w:qFormat="1"/>
@@ -13742,6 +14935,11 @@
     <w:lsdException w:name="List Table 5 Dark Accent 6" w:uiPriority="50"/>
     <w:lsdException w:name="List Table 6 Colorful Accent 6" w:uiPriority="51"/>
     <w:lsdException w:name="List Table 7 Colorful Accent 6" w:uiPriority="52"/>
+    <w:lsdException w:name="Mention" w:semiHidden="1" w:unhideWhenUsed="1"/>
+    <w:lsdException w:name="Smart Hyperlink" w:semiHidden="1" w:unhideWhenUsed="1"/>
+    <w:lsdException w:name="Hashtag" w:semiHidden="1" w:unhideWhenUsed="1"/>
+    <w:lsdException w:name="Unresolved Mention" w:semiHidden="1" w:unhideWhenUsed="1"/>
+    <w:lsdException w:name="Smart Link" w:semiHidden="1" w:unhideWhenUsed="1"/>
   </w:latentStyles>
   <w:style w:type="paragraph" w:default="1" w:styleId="Normal">
     <w:name w:val="Normal"/>

</xml_diff>